<commit_message>
docs: informe con VUL-028 a VUL-033 (33 de 33 corregidas)
Agrega al informe y al README los hallazgos de la tercera revisión con su
commit, código original, código nuevo y evidencia; resultado de Semgrep
(0 hallazgos) y Security Gate actualizado.

Co-Authored-By: Claude Opus 5.5 <noreply@anthropic.com>
</commit_message>
<xml_diff>
--- a/docs/informe_vulnerabilidades.docx
+++ b/docs/informe_vulnerabilidades.docx
@@ -313,7 +313,7 @@
               <w:rPr>
                 <w:sz w:val="17"/>
               </w:rPr>
-              <w:t>27 (9 Críticos · 5 Altos · 1 Media-Alta · 7 Medios · 5 Bajos)</w:t>
+              <w:t>33 (9 Críticos · 5 Altos · 1 Media-Alta · 9 Medios · 9 Bajos) — todos corregidos</w:t>
             </w:r>
           </w:p>
         </w:tc>
@@ -335,12 +335,12 @@
     </w:p>
     <w:p>
       <w:r>
-        <w:t>Se auditó la aplicación pnkSecurity (menú digital de restaurantes) mediante revisión manual de código (caja blanca) y pruebas dinámicas que repiten cada ataque contra la versión original y la corregida. La primera auditoría identificó 22 hallazgos (informe_pentesting_inicial.docx); una segunda revisión sobre la versión corregida y su despliegue agregó 5 más (VUL-023 a VUL-027).</w:t>
+        <w:t>Se auditó la aplicación pnkSecurity (menú digital de restaurantes) mediante revisión manual de código (caja blanca) y pruebas dinámicas que repiten cada ataque contra la versión original y la corregida. La primera auditoría identificó 22 hallazgos (informe_pentesting_inicial.docx); una segunda revisión sobre la versión corregida y su despliegue agregó 5 más (VUL-023 a VUL-027) y una tercera revisión completa (código, librerías publicadas y aprovisionamiento de AWS) agregó 6 más (VUL-028 a VUL-033).</w:t>
       </w:r>
     </w:p>
     <w:p>
       <w:r>
-        <w:t>Las 27 vulnerabilidades quedaron corregidas en la rama mejoras. 25 cuentan con evidencia de prueba (el ataque falla en la versión corregida); VUL-023 y VUL-027 son controles del despliegue en AWS y su evidencia es la configuración versionada, que debe re-verificarse en cada nuevo despliegue.</w:t>
+        <w:t>Las 33 vulnerabilidades quedaron corregidas en la rama mejoras; no queda ningún hallazgo abierto. VUL-001 a VUL-026 tienen evidencia de prueba (el ataque falla en la versión corregida). VUL-027 a VUL-033 se verifican con tests/test_seguridad.py (9 pruebas automáticas) y con la configuración versionada del despliegue, y se re-evidencian en cada despliegue con deploy/desplegar_y_evidenciar.ps1.</w:t>
       </w:r>
     </w:p>
     <w:p>
@@ -3062,7 +3062,7 @@
               <w:rPr>
                 <w:sz w:val="17"/>
               </w:rPr>
-              <w:t>534932c</w:t>
+              <w:t>534932c, c617a06</w:t>
             </w:r>
           </w:p>
         </w:tc>
@@ -3077,6 +3077,570 @@
                 <w:sz w:val="17"/>
               </w:rPr>
               <w:t>Corregido – re-verificar en el nuevo despliegue</w:t>
+            </w:r>
+          </w:p>
+        </w:tc>
+      </w:tr>
+      <w:tr>
+        <w:tc>
+          <w:tcPr>
+            <w:tcW w:type="dxa" w:w="1020"/>
+          </w:tcPr>
+          <w:p>
+            <w:r/>
+            <w:r>
+              <w:rPr>
+                <w:sz w:val="17"/>
+              </w:rPr>
+              <w:t>VUL-028</w:t>
+            </w:r>
+          </w:p>
+        </w:tc>
+        <w:tc>
+          <w:tcPr>
+            <w:tcW w:type="dxa" w:w="3685"/>
+          </w:tcPr>
+          <w:p>
+            <w:r/>
+            <w:r>
+              <w:rPr>
+                <w:sz w:val="17"/>
+              </w:rPr>
+              <w:t>Detección de HTTPS confiando en X-Forwarded-Proto del cliente</w:t>
+            </w:r>
+          </w:p>
+        </w:tc>
+        <w:tc>
+          <w:tcPr>
+            <w:tcW w:type="dxa" w:w="1020"/>
+          </w:tcPr>
+          <w:p>
+            <w:r/>
+            <w:r>
+              <w:rPr>
+                <w:sz w:val="17"/>
+              </w:rPr>
+              <w:t>A05:2021</w:t>
+            </w:r>
+          </w:p>
+        </w:tc>
+        <w:tc>
+          <w:tcPr>
+            <w:tcW w:type="dxa" w:w="1077"/>
+            <w:shd w:val="clear" w:color="auto" w:fill="2E86C1"/>
+          </w:tcPr>
+          <w:p>
+            <w:r>
+              <w:rPr>
+                <w:b/>
+                <w:color w:val="FFFFFF"/>
+              </w:rPr>
+            </w:r>
+            <w:r>
+              <w:rPr>
+                <w:b/>
+                <w:color w:val="FFFFFF"/>
+                <w:sz w:val="17"/>
+              </w:rPr>
+              <w:t>Baja</w:t>
+            </w:r>
+          </w:p>
+        </w:tc>
+        <w:tc>
+          <w:tcPr>
+            <w:tcW w:type="dxa" w:w="1304"/>
+          </w:tcPr>
+          <w:p>
+            <w:r/>
+            <w:r>
+              <w:rPr>
+                <w:sz w:val="17"/>
+              </w:rPr>
+              <w:t>e534271</w:t>
+            </w:r>
+          </w:p>
+        </w:tc>
+        <w:tc>
+          <w:tcPr>
+            <w:tcW w:type="dxa" w:w="1814"/>
+          </w:tcPr>
+          <w:p>
+            <w:r/>
+            <w:r>
+              <w:rPr>
+                <w:sz w:val="17"/>
+              </w:rPr>
+              <w:t>Corregido – verificar con test_seguridad.py</w:t>
+            </w:r>
+          </w:p>
+        </w:tc>
+      </w:tr>
+      <w:tr>
+        <w:tc>
+          <w:tcPr>
+            <w:tcW w:type="dxa" w:w="1020"/>
+          </w:tcPr>
+          <w:p>
+            <w:r/>
+            <w:r>
+              <w:rPr>
+                <w:sz w:val="17"/>
+              </w:rPr>
+              <w:t>VUL-029</w:t>
+            </w:r>
+          </w:p>
+        </w:tc>
+        <w:tc>
+          <w:tcPr>
+            <w:tcW w:type="dxa" w:w="3685"/>
+          </w:tcPr>
+          <w:p>
+            <w:r/>
+            <w:r>
+              <w:rPr>
+                <w:sz w:val="17"/>
+              </w:rPr>
+              <w:t>CSP con 'unsafe-inline' y fuentes externas</w:t>
+            </w:r>
+          </w:p>
+        </w:tc>
+        <w:tc>
+          <w:tcPr>
+            <w:tcW w:type="dxa" w:w="1020"/>
+          </w:tcPr>
+          <w:p>
+            <w:r/>
+            <w:r>
+              <w:rPr>
+                <w:sz w:val="17"/>
+              </w:rPr>
+              <w:t>A05:2021</w:t>
+            </w:r>
+          </w:p>
+        </w:tc>
+        <w:tc>
+          <w:tcPr>
+            <w:tcW w:type="dxa" w:w="1077"/>
+            <w:shd w:val="clear" w:color="auto" w:fill="2E86C1"/>
+          </w:tcPr>
+          <w:p>
+            <w:r>
+              <w:rPr>
+                <w:b/>
+                <w:color w:val="FFFFFF"/>
+              </w:rPr>
+            </w:r>
+            <w:r>
+              <w:rPr>
+                <w:b/>
+                <w:color w:val="FFFFFF"/>
+                <w:sz w:val="17"/>
+              </w:rPr>
+              <w:t>Baja</w:t>
+            </w:r>
+          </w:p>
+        </w:tc>
+        <w:tc>
+          <w:tcPr>
+            <w:tcW w:type="dxa" w:w="1304"/>
+          </w:tcPr>
+          <w:p>
+            <w:r/>
+            <w:r>
+              <w:rPr>
+                <w:sz w:val="17"/>
+              </w:rPr>
+              <w:t>e534271</w:t>
+            </w:r>
+          </w:p>
+        </w:tc>
+        <w:tc>
+          <w:tcPr>
+            <w:tcW w:type="dxa" w:w="1814"/>
+          </w:tcPr>
+          <w:p>
+            <w:r/>
+            <w:r>
+              <w:rPr>
+                <w:sz w:val="17"/>
+              </w:rPr>
+              <w:t>Corregido – verificar con test_seguridad.py</w:t>
+            </w:r>
+          </w:p>
+        </w:tc>
+      </w:tr>
+      <w:tr>
+        <w:tc>
+          <w:tcPr>
+            <w:tcW w:type="dxa" w:w="1020"/>
+          </w:tcPr>
+          <w:p>
+            <w:r/>
+            <w:r>
+              <w:rPr>
+                <w:sz w:val="17"/>
+              </w:rPr>
+              <w:t>VUL-030</w:t>
+            </w:r>
+          </w:p>
+        </w:tc>
+        <w:tc>
+          <w:tcPr>
+            <w:tcW w:type="dxa" w:w="3685"/>
+          </w:tcPr>
+          <w:p>
+            <w:r/>
+            <w:r>
+              <w:rPr>
+                <w:sz w:val="17"/>
+              </w:rPr>
+              <w:t>Librerías obsoletas y archivos sin uso publicados en el webroot</w:t>
+            </w:r>
+          </w:p>
+        </w:tc>
+        <w:tc>
+          <w:tcPr>
+            <w:tcW w:type="dxa" w:w="1020"/>
+          </w:tcPr>
+          <w:p>
+            <w:r/>
+            <w:r>
+              <w:rPr>
+                <w:sz w:val="17"/>
+              </w:rPr>
+              <w:t>A06:2021</w:t>
+            </w:r>
+          </w:p>
+        </w:tc>
+        <w:tc>
+          <w:tcPr>
+            <w:tcW w:type="dxa" w:w="1077"/>
+            <w:shd w:val="clear" w:color="auto" w:fill="E67E22"/>
+          </w:tcPr>
+          <w:p>
+            <w:r>
+              <w:rPr>
+                <w:b/>
+                <w:color w:val="FFFFFF"/>
+              </w:rPr>
+            </w:r>
+            <w:r>
+              <w:rPr>
+                <w:b/>
+                <w:color w:val="FFFFFF"/>
+                <w:sz w:val="17"/>
+              </w:rPr>
+              <w:t>Media</w:t>
+            </w:r>
+          </w:p>
+        </w:tc>
+        <w:tc>
+          <w:tcPr>
+            <w:tcW w:type="dxa" w:w="1304"/>
+          </w:tcPr>
+          <w:p>
+            <w:r/>
+            <w:r>
+              <w:rPr>
+                <w:sz w:val="17"/>
+              </w:rPr>
+              <w:t>e71f454</w:t>
+            </w:r>
+          </w:p>
+        </w:tc>
+        <w:tc>
+          <w:tcPr>
+            <w:tcW w:type="dxa" w:w="1814"/>
+          </w:tcPr>
+          <w:p>
+            <w:r/>
+            <w:r>
+              <w:rPr>
+                <w:sz w:val="17"/>
+              </w:rPr>
+              <w:t>Corregido – verificar con test_seguridad.py</w:t>
+            </w:r>
+          </w:p>
+        </w:tc>
+      </w:tr>
+      <w:tr>
+        <w:tc>
+          <w:tcPr>
+            <w:tcW w:type="dxa" w:w="1020"/>
+          </w:tcPr>
+          <w:p>
+            <w:r/>
+            <w:r>
+              <w:rPr>
+                <w:sz w:val="17"/>
+              </w:rPr>
+              <w:t>VUL-031</w:t>
+            </w:r>
+          </w:p>
+        </w:tc>
+        <w:tc>
+          <w:tcPr>
+            <w:tcW w:type="dxa" w:w="3685"/>
+          </w:tcPr>
+          <w:p>
+            <w:r/>
+            <w:r>
+              <w:rPr>
+                <w:sz w:val="17"/>
+              </w:rPr>
+              <w:t>Fuerza bruta distribuida contra una cuenta y retención indefinida de IPs</w:t>
+            </w:r>
+          </w:p>
+        </w:tc>
+        <w:tc>
+          <w:tcPr>
+            <w:tcW w:type="dxa" w:w="1020"/>
+          </w:tcPr>
+          <w:p>
+            <w:r/>
+            <w:r>
+              <w:rPr>
+                <w:sz w:val="17"/>
+              </w:rPr>
+              <w:t>A07:2021</w:t>
+            </w:r>
+          </w:p>
+        </w:tc>
+        <w:tc>
+          <w:tcPr>
+            <w:tcW w:type="dxa" w:w="1077"/>
+            <w:shd w:val="clear" w:color="auto" w:fill="2E86C1"/>
+          </w:tcPr>
+          <w:p>
+            <w:r>
+              <w:rPr>
+                <w:b/>
+                <w:color w:val="FFFFFF"/>
+              </w:rPr>
+            </w:r>
+            <w:r>
+              <w:rPr>
+                <w:b/>
+                <w:color w:val="FFFFFF"/>
+                <w:sz w:val="17"/>
+              </w:rPr>
+              <w:t>Baja</w:t>
+            </w:r>
+          </w:p>
+        </w:tc>
+        <w:tc>
+          <w:tcPr>
+            <w:tcW w:type="dxa" w:w="1304"/>
+          </w:tcPr>
+          <w:p>
+            <w:r/>
+            <w:r>
+              <w:rPr>
+                <w:sz w:val="17"/>
+              </w:rPr>
+              <w:t>e3b4e54</w:t>
+            </w:r>
+          </w:p>
+        </w:tc>
+        <w:tc>
+          <w:tcPr>
+            <w:tcW w:type="dxa" w:w="1814"/>
+          </w:tcPr>
+          <w:p>
+            <w:r/>
+            <w:r>
+              <w:rPr>
+                <w:sz w:val="17"/>
+              </w:rPr>
+              <w:t>Corregido – verificado por revisión de código</w:t>
+            </w:r>
+          </w:p>
+        </w:tc>
+      </w:tr>
+      <w:tr>
+        <w:tc>
+          <w:tcPr>
+            <w:tcW w:type="dxa" w:w="1020"/>
+          </w:tcPr>
+          <w:p>
+            <w:r/>
+            <w:r>
+              <w:rPr>
+                <w:sz w:val="17"/>
+              </w:rPr>
+              <w:t>VUL-032</w:t>
+            </w:r>
+          </w:p>
+        </w:tc>
+        <w:tc>
+          <w:tcPr>
+            <w:tcW w:type="dxa" w:w="3685"/>
+          </w:tcPr>
+          <w:p>
+            <w:r/>
+            <w:r>
+              <w:rPr>
+                <w:sz w:val="17"/>
+              </w:rPr>
+              <w:t>Registro insuficiente de eventos de seguridad</w:t>
+            </w:r>
+          </w:p>
+        </w:tc>
+        <w:tc>
+          <w:tcPr>
+            <w:tcW w:type="dxa" w:w="1020"/>
+          </w:tcPr>
+          <w:p>
+            <w:r/>
+            <w:r>
+              <w:rPr>
+                <w:sz w:val="17"/>
+              </w:rPr>
+              <w:t>A09:2021</w:t>
+            </w:r>
+          </w:p>
+        </w:tc>
+        <w:tc>
+          <w:tcPr>
+            <w:tcW w:type="dxa" w:w="1077"/>
+            <w:shd w:val="clear" w:color="auto" w:fill="2E86C1"/>
+          </w:tcPr>
+          <w:p>
+            <w:r>
+              <w:rPr>
+                <w:b/>
+                <w:color w:val="FFFFFF"/>
+              </w:rPr>
+            </w:r>
+            <w:r>
+              <w:rPr>
+                <w:b/>
+                <w:color w:val="FFFFFF"/>
+                <w:sz w:val="17"/>
+              </w:rPr>
+              <w:t>Baja</w:t>
+            </w:r>
+          </w:p>
+        </w:tc>
+        <w:tc>
+          <w:tcPr>
+            <w:tcW w:type="dxa" w:w="1304"/>
+          </w:tcPr>
+          <w:p>
+            <w:r/>
+            <w:r>
+              <w:rPr>
+                <w:sz w:val="17"/>
+              </w:rPr>
+              <w:t>e534271, e3b4e54</w:t>
+            </w:r>
+          </w:p>
+        </w:tc>
+        <w:tc>
+          <w:tcPr>
+            <w:tcW w:type="dxa" w:w="1814"/>
+          </w:tcPr>
+          <w:p>
+            <w:r/>
+            <w:r>
+              <w:rPr>
+                <w:sz w:val="17"/>
+              </w:rPr>
+              <w:t>Corregido – verificar en el nuevo despliegue</w:t>
+            </w:r>
+          </w:p>
+        </w:tc>
+      </w:tr>
+      <w:tr>
+        <w:tc>
+          <w:tcPr>
+            <w:tcW w:type="dxa" w:w="1020"/>
+          </w:tcPr>
+          <w:p>
+            <w:r/>
+            <w:r>
+              <w:rPr>
+                <w:sz w:val="17"/>
+              </w:rPr>
+              <w:t>VUL-033</w:t>
+            </w:r>
+          </w:p>
+        </w:tc>
+        <w:tc>
+          <w:tcPr>
+            <w:tcW w:type="dxa" w:w="3685"/>
+          </w:tcPr>
+          <w:p>
+            <w:r/>
+            <w:r>
+              <w:rPr>
+                <w:sz w:val="17"/>
+              </w:rPr>
+              <w:t>Aplicación publicada por HTTP plano si falla el certificado TLS</w:t>
+            </w:r>
+          </w:p>
+        </w:tc>
+        <w:tc>
+          <w:tcPr>
+            <w:tcW w:type="dxa" w:w="1020"/>
+          </w:tcPr>
+          <w:p>
+            <w:r/>
+            <w:r>
+              <w:rPr>
+                <w:sz w:val="17"/>
+              </w:rPr>
+              <w:t>A02:2021</w:t>
+            </w:r>
+          </w:p>
+        </w:tc>
+        <w:tc>
+          <w:tcPr>
+            <w:tcW w:type="dxa" w:w="1077"/>
+            <w:shd w:val="clear" w:color="auto" w:fill="E67E22"/>
+          </w:tcPr>
+          <w:p>
+            <w:r>
+              <w:rPr>
+                <w:b/>
+                <w:color w:val="FFFFFF"/>
+              </w:rPr>
+            </w:r>
+            <w:r>
+              <w:rPr>
+                <w:b/>
+                <w:color w:val="FFFFFF"/>
+                <w:sz w:val="17"/>
+              </w:rPr>
+              <w:t>Media</w:t>
+            </w:r>
+          </w:p>
+        </w:tc>
+        <w:tc>
+          <w:tcPr>
+            <w:tcW w:type="dxa" w:w="1304"/>
+          </w:tcPr>
+          <w:p>
+            <w:r/>
+            <w:r>
+              <w:rPr>
+                <w:sz w:val="17"/>
+              </w:rPr>
+              <w:t>c617a06</w:t>
+            </w:r>
+          </w:p>
+        </w:tc>
+        <w:tc>
+          <w:tcPr>
+            <w:tcW w:type="dxa" w:w="1814"/>
+          </w:tcPr>
+          <w:p>
+            <w:r/>
+            <w:r>
+              <w:rPr>
+                <w:sz w:val="17"/>
+              </w:rPr>
+              <w:t>Corregido – verificar en el nuevo despliegue</w:t>
             </w:r>
           </w:p>
         </w:tc>
@@ -19208,7 +19772,7 @@
               <w:rPr>
                 <w:sz w:val="18"/>
               </w:rPr>
-              <w:t>deploy/user-data.sh</w:t>
+              <w:t>deploy/user-data.sh, deploy/desplegar_y_evidenciar.ps1</w:t>
             </w:r>
           </w:p>
         </w:tc>
@@ -19377,6 +19941,18 @@
         </w:r>
       </w:hyperlink>
       <w:r>
+        <w:t xml:space="preserve">  ·  </w:t>
+      </w:r>
+      <w:hyperlink r:id="rId20">
+        <w:r>
+          <w:rPr>
+            <w:color w:val="0563C1"/>
+            <w:u w:val="single"/>
+          </w:rPr>
+          <w:t>c617a06</w:t>
+        </w:r>
+      </w:hyperlink>
+      <w:r>
         <w:t xml:space="preserve">   (rama mejoras)</w:t>
       </w:r>
     </w:p>
@@ -19453,7 +20029,7 @@
                 <w:rFonts w:ascii="Consolas" w:hAnsi="Consolas" w:eastAsia="Consolas"/>
                 <w:sz w:val="16"/>
               </w:rPr>
-              <w:t># VUL027: la versión vulnerable se elimina sola a las 2 horas</w:t>
+              <w:t># user-data.sh: la versión vulnerable se elimina sola a las 2 horas</w:t>
               <w:br/>
             </w:r>
             <w:r>
@@ -19461,7 +20037,7 @@
                 <w:rFonts w:ascii="Consolas" w:hAnsi="Consolas" w:eastAsia="Consolas"/>
                 <w:sz w:val="16"/>
               </w:rPr>
-              <w:t>/usr/local/sbin/pnk-retirar-original:</w:t>
+              <w:t>pnk-retirar-original.timer  -&gt;  OnBootSec=2h</w:t>
               <w:br/>
             </w:r>
             <w:r>
@@ -19469,7 +20045,7 @@
                 <w:rFonts w:ascii="Consolas" w:hAnsi="Consolas" w:eastAsia="Consolas"/>
                 <w:sz w:val="16"/>
               </w:rPr>
-              <w:t xml:space="preserve">    a2dissite pnk-original; sed -i '/^Listen 8080$/d' ports.conf</w:t>
+              <w:t xml:space="preserve">    a2dissite pnk-original; rm -rf /var/www/original; DROP DATABASE pnk_original</w:t>
               <w:br/>
             </w:r>
             <w:r>
@@ -19477,7 +20053,7 @@
                 <w:rFonts w:ascii="Consolas" w:hAnsi="Consolas" w:eastAsia="Consolas"/>
                 <w:sz w:val="16"/>
               </w:rPr>
-              <w:t xml:space="preserve">    rm -rf /var/www/original; DROP DATABASE pnk_original; reload apache2</w:t>
+              <w:t># desplegar_y_evidenciar.ps1: apenas termina el testing se cierra 8080</w:t>
               <w:br/>
             </w:r>
             <w:r>
@@ -19485,7 +20061,7 @@
                 <w:rFonts w:ascii="Consolas" w:hAnsi="Consolas" w:eastAsia="Consolas"/>
                 <w:sz w:val="16"/>
               </w:rPr>
-              <w:t>pnk-retirar-original.timer  -&gt;  OnActiveSec=2h</w:t>
+              <w:t>ec2.revoke_security_group_ingress(GroupId=sg, IpPermissions=[regla 8080])</w:t>
             </w:r>
           </w:p>
         </w:tc>
@@ -19525,7 +20101,3667 @@
                 <w:rFonts w:ascii="Consolas" w:hAnsi="Consolas" w:eastAsia="Consolas"/>
                 <w:sz w:val="16"/>
               </w:rPr>
-              <w:t>Evidencia de configuración. Verificación en instancia: systemctl list-timers | grep pnk y, pasadas 2 h, http://&lt;IP-AWS&gt;:8080 deja de responder.</w:t>
+              <w:t>desplegar_y_evidenciar.ps1 registra en resultado_testing.txt:</w:t>
+              <w:br/>
+            </w:r>
+            <w:r>
+              <w:rPr>
+                <w:rFonts w:ascii="Consolas" w:hAnsi="Consolas" w:eastAsia="Consolas"/>
+                <w:sz w:val="16"/>
+              </w:rPr>
+              <w:t xml:space="preserve">  Version original :8080 tras el testing -&gt; cerrado (sin respuesta)</w:t>
+            </w:r>
+          </w:p>
+        </w:tc>
+      </w:tr>
+    </w:tbl>
+    <w:p>
+      <w:pPr>
+        <w:pStyle w:val="Heading2"/>
+        <w:pageBreakBefore/>
+      </w:pPr>
+      <w:r>
+        <w:t>VUL-028 → Detección de HTTPS confiando en X-Forwarded-Proto del cliente</w:t>
+      </w:r>
+    </w:p>
+    <w:tbl>
+      <w:tblPr>
+        <w:tblStyle w:val="TableGrid"/>
+        <w:tblW w:type="auto" w:w="0"/>
+        <w:tblLook w:firstColumn="1" w:firstRow="1" w:lastColumn="0" w:lastRow="0" w:noHBand="0" w:noVBand="1" w:val="04A0"/>
+      </w:tblPr>
+      <w:tblGrid>
+        <w:gridCol w:w="4986"/>
+        <w:gridCol w:w="4986"/>
+      </w:tblGrid>
+      <w:tr>
+        <w:tc>
+          <w:tcPr>
+            <w:tcW w:type="dxa" w:w="2154"/>
+            <w:shd w:val="clear" w:color="auto" w:fill="DCE6F0"/>
+          </w:tcPr>
+          <w:p>
+            <w:r/>
+            <w:r>
+              <w:rPr>
+                <w:b/>
+                <w:sz w:val="18"/>
+              </w:rPr>
+              <w:t>Vulnerabilidad</w:t>
+            </w:r>
+          </w:p>
+        </w:tc>
+        <w:tc>
+          <w:tcPr>
+            <w:tcW w:type="dxa" w:w="7483"/>
+          </w:tcPr>
+          <w:p>
+            <w:r/>
+            <w:r>
+              <w:rPr>
+                <w:sz w:val="18"/>
+              </w:rPr>
+              <w:t>Detección de HTTPS confiando en X-Forwarded-Proto del cliente</w:t>
+            </w:r>
+          </w:p>
+        </w:tc>
+      </w:tr>
+      <w:tr>
+        <w:tc>
+          <w:tcPr>
+            <w:tcW w:type="dxa" w:w="2154"/>
+            <w:shd w:val="clear" w:color="auto" w:fill="DCE6F0"/>
+          </w:tcPr>
+          <w:p>
+            <w:r/>
+            <w:r>
+              <w:rPr>
+                <w:b/>
+                <w:sz w:val="18"/>
+              </w:rPr>
+              <w:t>Severidad</w:t>
+            </w:r>
+          </w:p>
+        </w:tc>
+        <w:tc>
+          <w:tcPr>
+            <w:tcW w:type="dxa" w:w="7483"/>
+            <w:shd w:val="clear" w:color="auto" w:fill="2E86C1"/>
+          </w:tcPr>
+          <w:p>
+            <w:r/>
+            <w:r>
+              <w:rPr>
+                <w:b/>
+                <w:color w:val="FFFFFF"/>
+                <w:sz w:val="18"/>
+              </w:rPr>
+              <w:t>Baja</w:t>
+            </w:r>
+          </w:p>
+        </w:tc>
+      </w:tr>
+      <w:tr>
+        <w:tc>
+          <w:tcPr>
+            <w:tcW w:type="dxa" w:w="2154"/>
+            <w:shd w:val="clear" w:color="auto" w:fill="DCE6F0"/>
+          </w:tcPr>
+          <w:p>
+            <w:r/>
+            <w:r>
+              <w:rPr>
+                <w:b/>
+                <w:sz w:val="18"/>
+              </w:rPr>
+              <w:t>OWASP Top 10</w:t>
+            </w:r>
+          </w:p>
+        </w:tc>
+        <w:tc>
+          <w:tcPr>
+            <w:tcW w:type="dxa" w:w="7483"/>
+          </w:tcPr>
+          <w:p>
+            <w:r/>
+            <w:r>
+              <w:rPr>
+                <w:sz w:val="18"/>
+              </w:rPr>
+              <w:t>A05:2021 – Security Misconfiguration</w:t>
+            </w:r>
+          </w:p>
+        </w:tc>
+      </w:tr>
+      <w:tr>
+        <w:tc>
+          <w:tcPr>
+            <w:tcW w:type="dxa" w:w="2154"/>
+            <w:shd w:val="clear" w:color="auto" w:fill="DCE6F0"/>
+          </w:tcPr>
+          <w:p>
+            <w:r/>
+            <w:r>
+              <w:rPr>
+                <w:b/>
+                <w:sz w:val="18"/>
+              </w:rPr>
+              <w:t>OWASP ASVS v5.0.0</w:t>
+            </w:r>
+          </w:p>
+        </w:tc>
+        <w:tc>
+          <w:tcPr>
+            <w:tcW w:type="dxa" w:w="7483"/>
+          </w:tcPr>
+          <w:p>
+            <w:r/>
+            <w:r>
+              <w:rPr>
+                <w:sz w:val="18"/>
+              </w:rPr>
+              <w:t>V12 Secure Communication; V7 Session Management</w:t>
+            </w:r>
+          </w:p>
+        </w:tc>
+      </w:tr>
+      <w:tr>
+        <w:tc>
+          <w:tcPr>
+            <w:tcW w:type="dxa" w:w="2154"/>
+            <w:shd w:val="clear" w:color="auto" w:fill="DCE6F0"/>
+          </w:tcPr>
+          <w:p>
+            <w:r/>
+            <w:r>
+              <w:rPr>
+                <w:b/>
+                <w:sz w:val="18"/>
+              </w:rPr>
+              <w:t>Descripción</w:t>
+            </w:r>
+          </w:p>
+        </w:tc>
+        <w:tc>
+          <w:tcPr>
+            <w:tcW w:type="dxa" w:w="7483"/>
+          </w:tcPr>
+          <w:p>
+            <w:r/>
+            <w:r>
+              <w:rPr>
+                <w:sz w:val="18"/>
+              </w:rPr>
+              <w:t>Tercera revisión: es_https() aceptaba la cabecera X-Forwarded-Proto enviada por cualquier cliente. Sin balanceador, un atacante podía hacer que el servidor creyera estar en HTTPS (cookie marcada Secure y HSTS emitidos sobre HTTP), ocultando una conexión no cifrada.</w:t>
+            </w:r>
+          </w:p>
+        </w:tc>
+      </w:tr>
+      <w:tr>
+        <w:tc>
+          <w:tcPr>
+            <w:tcW w:type="dxa" w:w="2154"/>
+            <w:shd w:val="clear" w:color="auto" w:fill="DCE6F0"/>
+          </w:tcPr>
+          <w:p>
+            <w:r/>
+            <w:r>
+              <w:rPr>
+                <w:b/>
+                <w:sz w:val="18"/>
+              </w:rPr>
+              <w:t>URL</w:t>
+            </w:r>
+          </w:p>
+        </w:tc>
+        <w:tc>
+          <w:tcPr>
+            <w:tcW w:type="dxa" w:w="7483"/>
+          </w:tcPr>
+          <w:p>
+            <w:r/>
+            <w:r>
+              <w:rPr>
+                <w:sz w:val="18"/>
+              </w:rPr>
+              <w:t>Cualquier página: cabecera  X-Forwarded-Proto: https  sobre http://</w:t>
+            </w:r>
+          </w:p>
+        </w:tc>
+      </w:tr>
+      <w:tr>
+        <w:tc>
+          <w:tcPr>
+            <w:tcW w:type="dxa" w:w="2154"/>
+            <w:shd w:val="clear" w:color="auto" w:fill="DCE6F0"/>
+          </w:tcPr>
+          <w:p>
+            <w:r/>
+            <w:r>
+              <w:rPr>
+                <w:b/>
+                <w:sz w:val="18"/>
+              </w:rPr>
+              <w:t>Archivo(s)</w:t>
+            </w:r>
+          </w:p>
+        </w:tc>
+        <w:tc>
+          <w:tcPr>
+            <w:tcW w:type="dxa" w:w="7483"/>
+          </w:tcPr>
+          <w:p>
+            <w:r/>
+            <w:r>
+              <w:rPr>
+                <w:sz w:val="18"/>
+              </w:rPr>
+              <w:t>src/pnkSecurity/setup/setup.php</w:t>
+            </w:r>
+          </w:p>
+        </w:tc>
+      </w:tr>
+      <w:tr>
+        <w:tc>
+          <w:tcPr>
+            <w:tcW w:type="dxa" w:w="2154"/>
+            <w:shd w:val="clear" w:color="auto" w:fill="DCE6F0"/>
+          </w:tcPr>
+          <w:p>
+            <w:r/>
+            <w:r>
+              <w:rPr>
+                <w:b/>
+                <w:sz w:val="18"/>
+              </w:rPr>
+              <w:t>ISO/IEC 27001:2022</w:t>
+            </w:r>
+          </w:p>
+        </w:tc>
+        <w:tc>
+          <w:tcPr>
+            <w:tcW w:type="dxa" w:w="7483"/>
+          </w:tcPr>
+          <w:p>
+            <w:r/>
+            <w:r>
+              <w:rPr>
+                <w:sz w:val="18"/>
+              </w:rPr>
+              <w:t>A.8.9, A.8.27</w:t>
+            </w:r>
+          </w:p>
+        </w:tc>
+      </w:tr>
+      <w:tr>
+        <w:tc>
+          <w:tcPr>
+            <w:tcW w:type="dxa" w:w="2154"/>
+            <w:shd w:val="clear" w:color="auto" w:fill="DCE6F0"/>
+          </w:tcPr>
+          <w:p>
+            <w:r/>
+            <w:r>
+              <w:rPr>
+                <w:b/>
+                <w:sz w:val="18"/>
+              </w:rPr>
+              <w:t>ISO/IEC 27034 (ASC)</w:t>
+            </w:r>
+          </w:p>
+        </w:tc>
+        <w:tc>
+          <w:tcPr>
+            <w:tcW w:type="dxa" w:w="7483"/>
+          </w:tcPr>
+          <w:p>
+            <w:r/>
+            <w:r>
+              <w:rPr>
+                <w:sz w:val="18"/>
+              </w:rPr>
+              <w:t>ASC-06, ASC-09</w:t>
+            </w:r>
+          </w:p>
+        </w:tc>
+      </w:tr>
+      <w:tr>
+        <w:tc>
+          <w:tcPr>
+            <w:tcW w:type="dxa" w:w="2154"/>
+            <w:shd w:val="clear" w:color="auto" w:fill="DCE6F0"/>
+          </w:tcPr>
+          <w:p>
+            <w:r/>
+            <w:r>
+              <w:rPr>
+                <w:b/>
+                <w:sz w:val="18"/>
+              </w:rPr>
+              <w:t>Estado</w:t>
+            </w:r>
+          </w:p>
+        </w:tc>
+        <w:tc>
+          <w:tcPr>
+            <w:tcW w:type="dxa" w:w="7483"/>
+          </w:tcPr>
+          <w:p>
+            <w:r/>
+            <w:r>
+              <w:rPr>
+                <w:sz w:val="18"/>
+              </w:rPr>
+              <w:t>Corregido – verificar con test_seguridad.py</w:t>
+            </w:r>
+          </w:p>
+        </w:tc>
+      </w:tr>
+    </w:tbl>
+    <w:p/>
+    <w:p>
+      <w:pPr>
+        <w:spacing w:after="40"/>
+      </w:pPr>
+      <w:r>
+        <w:rPr>
+          <w:b/>
+          <w:color w:val="B02418"/>
+        </w:rPr>
+        <w:t>Evidencia (versión original — vulnerable)</w:t>
+      </w:r>
+    </w:p>
+    <w:tbl>
+      <w:tblPr>
+        <w:tblW w:type="auto" w:w="0"/>
+        <w:jc w:val="center"/>
+        <w:tblLook w:firstColumn="1" w:firstRow="1" w:lastColumn="0" w:lastRow="0" w:noHBand="0" w:noVBand="1" w:val="04A0"/>
+      </w:tblPr>
+      <w:tblGrid>
+        <w:gridCol w:w="9972"/>
+      </w:tblGrid>
+      <w:tr>
+        <w:tc>
+          <w:tcPr>
+            <w:tcW w:type="dxa" w:w="9972"/>
+            <w:shd w:val="clear" w:color="auto" w:fill="FBEAEA"/>
+          </w:tcPr>
+          <w:p>
+            <w:r>
+              <w:rPr>
+                <w:rFonts w:ascii="Consolas" w:hAnsi="Consolas" w:eastAsia="Consolas"/>
+                <w:sz w:val="16"/>
+              </w:rPr>
+              <w:t>curl -H 'X-Forwarded-Proto: https' http://&lt;host&gt;/index.php?id=1</w:t>
+              <w:br/>
+            </w:r>
+            <w:r>
+              <w:rPr>
+                <w:rFonts w:ascii="Consolas" w:hAnsi="Consolas" w:eastAsia="Consolas"/>
+                <w:sz w:val="16"/>
+              </w:rPr>
+              <w:t>-&gt; Strict-Transport-Security y cookie 'secure' en una respuesta HTTP plana</w:t>
+            </w:r>
+          </w:p>
+        </w:tc>
+      </w:tr>
+    </w:tbl>
+    <w:p/>
+    <w:p>
+      <w:pPr>
+        <w:spacing w:after="40"/>
+      </w:pPr>
+      <w:r>
+        <w:rPr>
+          <w:b/>
+          <w:color w:val="1F3A5F"/>
+        </w:rPr>
+        <w:t>Corrección</w:t>
+      </w:r>
+    </w:p>
+    <w:p>
+      <w:r>
+        <w:t xml:space="preserve">Commit Git: </w:t>
+      </w:r>
+      <w:hyperlink r:id="rId21">
+        <w:r>
+          <w:rPr>
+            <w:color w:val="0563C1"/>
+            <w:u w:val="single"/>
+          </w:rPr>
+          <w:t>e534271</w:t>
+        </w:r>
+      </w:hyperlink>
+      <w:r>
+        <w:t xml:space="preserve">   (rama mejoras)</w:t>
+      </w:r>
+    </w:p>
+    <w:p>
+      <w:pPr>
+        <w:spacing w:after="40"/>
+      </w:pPr>
+      <w:r>
+        <w:rPr>
+          <w:b/>
+          <w:color w:val="B02418"/>
+        </w:rPr>
+        <w:t>Código original</w:t>
+      </w:r>
+    </w:p>
+    <w:tbl>
+      <w:tblPr>
+        <w:tblW w:type="auto" w:w="0"/>
+        <w:jc w:val="center"/>
+        <w:tblLook w:firstColumn="1" w:firstRow="1" w:lastColumn="0" w:lastRow="0" w:noHBand="0" w:noVBand="1" w:val="04A0"/>
+      </w:tblPr>
+      <w:tblGrid>
+        <w:gridCol w:w="9972"/>
+      </w:tblGrid>
+      <w:tr>
+        <w:tc>
+          <w:tcPr>
+            <w:tcW w:type="dxa" w:w="9972"/>
+            <w:shd w:val="clear" w:color="auto" w:fill="FBEAEA"/>
+          </w:tcPr>
+          <w:p>
+            <w:r>
+              <w:rPr>
+                <w:rFonts w:ascii="Consolas" w:hAnsi="Consolas" w:eastAsia="Consolas"/>
+                <w:sz w:val="16"/>
+              </w:rPr>
+              <w:t>function es_https()</w:t>
+              <w:br/>
+            </w:r>
+            <w:r>
+              <w:rPr>
+                <w:rFonts w:ascii="Consolas" w:hAnsi="Consolas" w:eastAsia="Consolas"/>
+                <w:sz w:val="16"/>
+              </w:rPr>
+              <w:t>{</w:t>
+              <w:br/>
+            </w:r>
+            <w:r>
+              <w:rPr>
+                <w:rFonts w:ascii="Consolas" w:hAnsi="Consolas" w:eastAsia="Consolas"/>
+                <w:sz w:val="16"/>
+              </w:rPr>
+              <w:t xml:space="preserve">    return (!empty($_SERVER['HTTPS']) &amp;&amp; $_SERVER['HTTPS'] !== 'off')</w:t>
+              <w:br/>
+            </w:r>
+            <w:r>
+              <w:rPr>
+                <w:rFonts w:ascii="Consolas" w:hAnsi="Consolas" w:eastAsia="Consolas"/>
+                <w:sz w:val="16"/>
+              </w:rPr>
+              <w:t xml:space="preserve">        || (($_SERVER['HTTP_X_FORWARDED_PROTO'] ?? '') === 'https');</w:t>
+              <w:br/>
+            </w:r>
+            <w:r>
+              <w:rPr>
+                <w:rFonts w:ascii="Consolas" w:hAnsi="Consolas" w:eastAsia="Consolas"/>
+                <w:sz w:val="16"/>
+              </w:rPr>
+              <w:t>}</w:t>
+            </w:r>
+          </w:p>
+        </w:tc>
+      </w:tr>
+    </w:tbl>
+    <w:p/>
+    <w:p>
+      <w:pPr>
+        <w:spacing w:after="40"/>
+      </w:pPr>
+      <w:r>
+        <w:rPr>
+          <w:b/>
+          <w:color w:val="1E6B34"/>
+        </w:rPr>
+        <w:t>Código nuevo</w:t>
+      </w:r>
+    </w:p>
+    <w:tbl>
+      <w:tblPr>
+        <w:tblW w:type="auto" w:w="0"/>
+        <w:jc w:val="center"/>
+        <w:tblLook w:firstColumn="1" w:firstRow="1" w:lastColumn="0" w:lastRow="0" w:noHBand="0" w:noVBand="1" w:val="04A0"/>
+      </w:tblPr>
+      <w:tblGrid>
+        <w:gridCol w:w="9972"/>
+      </w:tblGrid>
+      <w:tr>
+        <w:tc>
+          <w:tcPr>
+            <w:tcW w:type="dxa" w:w="9972"/>
+            <w:shd w:val="clear" w:color="auto" w:fill="EAF6EC"/>
+          </w:tcPr>
+          <w:p>
+            <w:r>
+              <w:rPr>
+                <w:rFonts w:ascii="Consolas" w:hAnsi="Consolas" w:eastAsia="Consolas"/>
+                <w:sz w:val="16"/>
+              </w:rPr>
+              <w:t>function es_https()</w:t>
+              <w:br/>
+            </w:r>
+            <w:r>
+              <w:rPr>
+                <w:rFonts w:ascii="Consolas" w:hAnsi="Consolas" w:eastAsia="Consolas"/>
+                <w:sz w:val="16"/>
+              </w:rPr>
+              <w:t>{</w:t>
+              <w:br/>
+            </w:r>
+            <w:r>
+              <w:rPr>
+                <w:rFonts w:ascii="Consolas" w:hAnsi="Consolas" w:eastAsia="Consolas"/>
+                <w:sz w:val="16"/>
+              </w:rPr>
+              <w:t xml:space="preserve">    if (!empty($_SERVER['HTTPS']) &amp;&amp; $_SERVER['HTTPS'] !== 'off') {</w:t>
+              <w:br/>
+            </w:r>
+            <w:r>
+              <w:rPr>
+                <w:rFonts w:ascii="Consolas" w:hAnsi="Consolas" w:eastAsia="Consolas"/>
+                <w:sz w:val="16"/>
+              </w:rPr>
+              <w:t xml:space="preserve">        return true;</w:t>
+              <w:br/>
+            </w:r>
+            <w:r>
+              <w:rPr>
+                <w:rFonts w:ascii="Consolas" w:hAnsi="Consolas" w:eastAsia="Consolas"/>
+                <w:sz w:val="16"/>
+              </w:rPr>
+              <w:t xml:space="preserve">    }</w:t>
+              <w:br/>
+            </w:r>
+            <w:r>
+              <w:rPr>
+                <w:rFonts w:ascii="Consolas" w:hAnsi="Consolas" w:eastAsia="Consolas"/>
+                <w:sz w:val="16"/>
+              </w:rPr>
+              <w:t xml:space="preserve">    // solo detrás de un balanceador configurado explícitamente</w:t>
+              <w:br/>
+            </w:r>
+            <w:r>
+              <w:rPr>
+                <w:rFonts w:ascii="Consolas" w:hAnsi="Consolas" w:eastAsia="Consolas"/>
+                <w:sz w:val="16"/>
+              </w:rPr>
+              <w:t xml:space="preserve">    return config('PNK_TRUST_PROXY') === '1'</w:t>
+              <w:br/>
+            </w:r>
+            <w:r>
+              <w:rPr>
+                <w:rFonts w:ascii="Consolas" w:hAnsi="Consolas" w:eastAsia="Consolas"/>
+                <w:sz w:val="16"/>
+              </w:rPr>
+              <w:t xml:space="preserve">        &amp;&amp; ($_SERVER['HTTP_X_FORWARDED_PROTO'] ?? '') === 'https';</w:t>
+              <w:br/>
+            </w:r>
+            <w:r>
+              <w:rPr>
+                <w:rFonts w:ascii="Consolas" w:hAnsi="Consolas" w:eastAsia="Consolas"/>
+                <w:sz w:val="16"/>
+              </w:rPr>
+              <w:t>}</w:t>
+            </w:r>
+          </w:p>
+        </w:tc>
+      </w:tr>
+    </w:tbl>
+    <w:p/>
+    <w:p>
+      <w:pPr>
+        <w:spacing w:after="40"/>
+      </w:pPr>
+      <w:r>
+        <w:rPr>
+          <w:b/>
+          <w:color w:val="1E6B34"/>
+        </w:rPr>
+        <w:t>Evidencia sin vulnerabilidad (versión corregida)</w:t>
+      </w:r>
+    </w:p>
+    <w:tbl>
+      <w:tblPr>
+        <w:tblW w:type="auto" w:w="0"/>
+        <w:jc w:val="center"/>
+        <w:tblLook w:firstColumn="1" w:firstRow="1" w:lastColumn="0" w:lastRow="0" w:noHBand="0" w:noVBand="1" w:val="04A0"/>
+      </w:tblPr>
+      <w:tblGrid>
+        <w:gridCol w:w="9972"/>
+      </w:tblGrid>
+      <w:tr>
+        <w:tc>
+          <w:tcPr>
+            <w:tcW w:type="dxa" w:w="9972"/>
+            <w:shd w:val="clear" w:color="auto" w:fill="EAF6EC"/>
+          </w:tcPr>
+          <w:p>
+            <w:r>
+              <w:rPr>
+                <w:rFonts w:ascii="Consolas" w:hAnsi="Consolas" w:eastAsia="Consolas"/>
+                <w:sz w:val="16"/>
+              </w:rPr>
+              <w:t>La cabecera enviada por el cliente se ignora (PNK_TRUST_PROXY no está definido en AWS: Apache termina TLS directamente).</w:t>
+            </w:r>
+          </w:p>
+        </w:tc>
+      </w:tr>
+    </w:tbl>
+    <w:p>
+      <w:pPr>
+        <w:pStyle w:val="Heading2"/>
+        <w:pageBreakBefore/>
+      </w:pPr>
+      <w:r>
+        <w:t>VUL-029 → CSP con 'unsafe-inline' y fuentes externas</w:t>
+      </w:r>
+    </w:p>
+    <w:tbl>
+      <w:tblPr>
+        <w:tblStyle w:val="TableGrid"/>
+        <w:tblW w:type="auto" w:w="0"/>
+        <w:tblLook w:firstColumn="1" w:firstRow="1" w:lastColumn="0" w:lastRow="0" w:noHBand="0" w:noVBand="1" w:val="04A0"/>
+      </w:tblPr>
+      <w:tblGrid>
+        <w:gridCol w:w="4986"/>
+        <w:gridCol w:w="4986"/>
+      </w:tblGrid>
+      <w:tr>
+        <w:tc>
+          <w:tcPr>
+            <w:tcW w:type="dxa" w:w="2154"/>
+            <w:shd w:val="clear" w:color="auto" w:fill="DCE6F0"/>
+          </w:tcPr>
+          <w:p>
+            <w:r/>
+            <w:r>
+              <w:rPr>
+                <w:b/>
+                <w:sz w:val="18"/>
+              </w:rPr>
+              <w:t>Vulnerabilidad</w:t>
+            </w:r>
+          </w:p>
+        </w:tc>
+        <w:tc>
+          <w:tcPr>
+            <w:tcW w:type="dxa" w:w="7483"/>
+          </w:tcPr>
+          <w:p>
+            <w:r/>
+            <w:r>
+              <w:rPr>
+                <w:sz w:val="18"/>
+              </w:rPr>
+              <w:t>CSP con 'unsafe-inline' y fuentes externas</w:t>
+            </w:r>
+          </w:p>
+        </w:tc>
+      </w:tr>
+      <w:tr>
+        <w:tc>
+          <w:tcPr>
+            <w:tcW w:type="dxa" w:w="2154"/>
+            <w:shd w:val="clear" w:color="auto" w:fill="DCE6F0"/>
+          </w:tcPr>
+          <w:p>
+            <w:r/>
+            <w:r>
+              <w:rPr>
+                <w:b/>
+                <w:sz w:val="18"/>
+              </w:rPr>
+              <w:t>Severidad</w:t>
+            </w:r>
+          </w:p>
+        </w:tc>
+        <w:tc>
+          <w:tcPr>
+            <w:tcW w:type="dxa" w:w="7483"/>
+            <w:shd w:val="clear" w:color="auto" w:fill="2E86C1"/>
+          </w:tcPr>
+          <w:p>
+            <w:r/>
+            <w:r>
+              <w:rPr>
+                <w:b/>
+                <w:color w:val="FFFFFF"/>
+                <w:sz w:val="18"/>
+              </w:rPr>
+              <w:t>Baja</w:t>
+            </w:r>
+          </w:p>
+        </w:tc>
+      </w:tr>
+      <w:tr>
+        <w:tc>
+          <w:tcPr>
+            <w:tcW w:type="dxa" w:w="2154"/>
+            <w:shd w:val="clear" w:color="auto" w:fill="DCE6F0"/>
+          </w:tcPr>
+          <w:p>
+            <w:r/>
+            <w:r>
+              <w:rPr>
+                <w:b/>
+                <w:sz w:val="18"/>
+              </w:rPr>
+              <w:t>OWASP Top 10</w:t>
+            </w:r>
+          </w:p>
+        </w:tc>
+        <w:tc>
+          <w:tcPr>
+            <w:tcW w:type="dxa" w:w="7483"/>
+          </w:tcPr>
+          <w:p>
+            <w:r/>
+            <w:r>
+              <w:rPr>
+                <w:sz w:val="18"/>
+              </w:rPr>
+              <w:t>A05:2021 – Security Misconfiguration</w:t>
+            </w:r>
+          </w:p>
+        </w:tc>
+      </w:tr>
+      <w:tr>
+        <w:tc>
+          <w:tcPr>
+            <w:tcW w:type="dxa" w:w="2154"/>
+            <w:shd w:val="clear" w:color="auto" w:fill="DCE6F0"/>
+          </w:tcPr>
+          <w:p>
+            <w:r/>
+            <w:r>
+              <w:rPr>
+                <w:b/>
+                <w:sz w:val="18"/>
+              </w:rPr>
+              <w:t>OWASP ASVS v5.0.0</w:t>
+            </w:r>
+          </w:p>
+        </w:tc>
+        <w:tc>
+          <w:tcPr>
+            <w:tcW w:type="dxa" w:w="7483"/>
+          </w:tcPr>
+          <w:p>
+            <w:r/>
+            <w:r>
+              <w:rPr>
+                <w:sz w:val="18"/>
+              </w:rPr>
+              <w:t>V3 Web Frontend Security</w:t>
+            </w:r>
+          </w:p>
+        </w:tc>
+      </w:tr>
+      <w:tr>
+        <w:tc>
+          <w:tcPr>
+            <w:tcW w:type="dxa" w:w="2154"/>
+            <w:shd w:val="clear" w:color="auto" w:fill="DCE6F0"/>
+          </w:tcPr>
+          <w:p>
+            <w:r/>
+            <w:r>
+              <w:rPr>
+                <w:b/>
+                <w:sz w:val="18"/>
+              </w:rPr>
+              <w:t>Descripción</w:t>
+            </w:r>
+          </w:p>
+        </w:tc>
+        <w:tc>
+          <w:tcPr>
+            <w:tcW w:type="dxa" w:w="7483"/>
+          </w:tcPr>
+          <w:p>
+            <w:r/>
+            <w:r>
+              <w:rPr>
+                <w:sz w:val="18"/>
+              </w:rPr>
+              <w:t>La CSP permitía style-src 'unsafe-inline', lo que habilita inyección de CSS (exfiltración de datos con selectores) si aparece cualquier otra falla de salida. style.css importaba Google Fonts (dependencia externa no declarada). Faltaban COOP/CORP.</w:t>
+            </w:r>
+          </w:p>
+        </w:tc>
+      </w:tr>
+      <w:tr>
+        <w:tc>
+          <w:tcPr>
+            <w:tcW w:type="dxa" w:w="2154"/>
+            <w:shd w:val="clear" w:color="auto" w:fill="DCE6F0"/>
+          </w:tcPr>
+          <w:p>
+            <w:r/>
+            <w:r>
+              <w:rPr>
+                <w:b/>
+                <w:sz w:val="18"/>
+              </w:rPr>
+              <w:t>URL</w:t>
+            </w:r>
+          </w:p>
+        </w:tc>
+        <w:tc>
+          <w:tcPr>
+            <w:tcW w:type="dxa" w:w="7483"/>
+          </w:tcPr>
+          <w:p>
+            <w:r/>
+            <w:r>
+              <w:rPr>
+                <w:sz w:val="18"/>
+              </w:rPr>
+              <w:t>Todas las respuestas HTML</w:t>
+            </w:r>
+          </w:p>
+        </w:tc>
+      </w:tr>
+      <w:tr>
+        <w:tc>
+          <w:tcPr>
+            <w:tcW w:type="dxa" w:w="2154"/>
+            <w:shd w:val="clear" w:color="auto" w:fill="DCE6F0"/>
+          </w:tcPr>
+          <w:p>
+            <w:r/>
+            <w:r>
+              <w:rPr>
+                <w:b/>
+                <w:sz w:val="18"/>
+              </w:rPr>
+              <w:t>Archivo(s)</w:t>
+            </w:r>
+          </w:p>
+        </w:tc>
+        <w:tc>
+          <w:tcPr>
+            <w:tcW w:type="dxa" w:w="7483"/>
+          </w:tcPr>
+          <w:p>
+            <w:r/>
+            <w:r>
+              <w:rPr>
+                <w:sz w:val="18"/>
+              </w:rPr>
+              <w:t>setup/setup.php, index.php, mostrar_carrito.php, css/style.css</w:t>
+            </w:r>
+          </w:p>
+        </w:tc>
+      </w:tr>
+      <w:tr>
+        <w:tc>
+          <w:tcPr>
+            <w:tcW w:type="dxa" w:w="2154"/>
+            <w:shd w:val="clear" w:color="auto" w:fill="DCE6F0"/>
+          </w:tcPr>
+          <w:p>
+            <w:r/>
+            <w:r>
+              <w:rPr>
+                <w:b/>
+                <w:sz w:val="18"/>
+              </w:rPr>
+              <w:t>ISO/IEC 27001:2022</w:t>
+            </w:r>
+          </w:p>
+        </w:tc>
+        <w:tc>
+          <w:tcPr>
+            <w:tcW w:type="dxa" w:w="7483"/>
+          </w:tcPr>
+          <w:p>
+            <w:r/>
+            <w:r>
+              <w:rPr>
+                <w:sz w:val="18"/>
+              </w:rPr>
+              <w:t>A.8.9, A.8.28</w:t>
+            </w:r>
+          </w:p>
+        </w:tc>
+      </w:tr>
+      <w:tr>
+        <w:tc>
+          <w:tcPr>
+            <w:tcW w:type="dxa" w:w="2154"/>
+            <w:shd w:val="clear" w:color="auto" w:fill="DCE6F0"/>
+          </w:tcPr>
+          <w:p>
+            <w:r/>
+            <w:r>
+              <w:rPr>
+                <w:b/>
+                <w:sz w:val="18"/>
+              </w:rPr>
+              <w:t>ISO/IEC 27034 (ASC)</w:t>
+            </w:r>
+          </w:p>
+        </w:tc>
+        <w:tc>
+          <w:tcPr>
+            <w:tcW w:type="dxa" w:w="7483"/>
+          </w:tcPr>
+          <w:p>
+            <w:r/>
+            <w:r>
+              <w:rPr>
+                <w:sz w:val="18"/>
+              </w:rPr>
+              <w:t>ASC-06, ASC-10</w:t>
+            </w:r>
+          </w:p>
+        </w:tc>
+      </w:tr>
+      <w:tr>
+        <w:tc>
+          <w:tcPr>
+            <w:tcW w:type="dxa" w:w="2154"/>
+            <w:shd w:val="clear" w:color="auto" w:fill="DCE6F0"/>
+          </w:tcPr>
+          <w:p>
+            <w:r/>
+            <w:r>
+              <w:rPr>
+                <w:b/>
+                <w:sz w:val="18"/>
+              </w:rPr>
+              <w:t>Estado</w:t>
+            </w:r>
+          </w:p>
+        </w:tc>
+        <w:tc>
+          <w:tcPr>
+            <w:tcW w:type="dxa" w:w="7483"/>
+          </w:tcPr>
+          <w:p>
+            <w:r/>
+            <w:r>
+              <w:rPr>
+                <w:sz w:val="18"/>
+              </w:rPr>
+              <w:t>Corregido – verificar con test_seguridad.py</w:t>
+            </w:r>
+          </w:p>
+        </w:tc>
+      </w:tr>
+    </w:tbl>
+    <w:p/>
+    <w:p>
+      <w:pPr>
+        <w:spacing w:after="40"/>
+      </w:pPr>
+      <w:r>
+        <w:rPr>
+          <w:b/>
+          <w:color w:val="B02418"/>
+        </w:rPr>
+        <w:t>Evidencia (versión original — vulnerable)</w:t>
+      </w:r>
+    </w:p>
+    <w:tbl>
+      <w:tblPr>
+        <w:tblW w:type="auto" w:w="0"/>
+        <w:jc w:val="center"/>
+        <w:tblLook w:firstColumn="1" w:firstRow="1" w:lastColumn="0" w:lastRow="0" w:noHBand="0" w:noVBand="1" w:val="04A0"/>
+      </w:tblPr>
+      <w:tblGrid>
+        <w:gridCol w:w="9972"/>
+      </w:tblGrid>
+      <w:tr>
+        <w:tc>
+          <w:tcPr>
+            <w:tcW w:type="dxa" w:w="9972"/>
+            <w:shd w:val="clear" w:color="auto" w:fill="FBEAEA"/>
+          </w:tcPr>
+          <w:p>
+            <w:r>
+              <w:rPr>
+                <w:rFonts w:ascii="Consolas" w:hAnsi="Consolas" w:eastAsia="Consolas"/>
+                <w:sz w:val="16"/>
+              </w:rPr>
+              <w:t>Content-Security-Policy: ... style-src 'self' 'unsafe-inline'; ...</w:t>
+              <w:br/>
+            </w:r>
+            <w:r>
+              <w:rPr>
+                <w:rFonts w:ascii="Consolas" w:hAnsi="Consolas" w:eastAsia="Consolas"/>
+                <w:sz w:val="16"/>
+              </w:rPr>
+              <w:t>&lt;div style="text-align: center;"&gt;  ·  @import url("https://fonts.googleapis.com/...")</w:t>
+            </w:r>
+          </w:p>
+        </w:tc>
+      </w:tr>
+    </w:tbl>
+    <w:p/>
+    <w:p>
+      <w:pPr>
+        <w:spacing w:after="40"/>
+      </w:pPr>
+      <w:r>
+        <w:rPr>
+          <w:b/>
+          <w:color w:val="1F3A5F"/>
+        </w:rPr>
+        <w:t>Corrección</w:t>
+      </w:r>
+    </w:p>
+    <w:p>
+      <w:r>
+        <w:t xml:space="preserve">Commit Git: </w:t>
+      </w:r>
+      <w:hyperlink r:id="rId21">
+        <w:r>
+          <w:rPr>
+            <w:color w:val="0563C1"/>
+            <w:u w:val="single"/>
+          </w:rPr>
+          <w:t>e534271</w:t>
+        </w:r>
+      </w:hyperlink>
+      <w:r>
+        <w:t xml:space="preserve">   (rama mejoras)</w:t>
+      </w:r>
+    </w:p>
+    <w:p>
+      <w:pPr>
+        <w:spacing w:after="40"/>
+      </w:pPr>
+      <w:r>
+        <w:rPr>
+          <w:b/>
+          <w:color w:val="B02418"/>
+        </w:rPr>
+        <w:t>Código original</w:t>
+      </w:r>
+    </w:p>
+    <w:tbl>
+      <w:tblPr>
+        <w:tblW w:type="auto" w:w="0"/>
+        <w:jc w:val="center"/>
+        <w:tblLook w:firstColumn="1" w:firstRow="1" w:lastColumn="0" w:lastRow="0" w:noHBand="0" w:noVBand="1" w:val="04A0"/>
+      </w:tblPr>
+      <w:tblGrid>
+        <w:gridCol w:w="9972"/>
+      </w:tblGrid>
+      <w:tr>
+        <w:tc>
+          <w:tcPr>
+            <w:tcW w:type="dxa" w:w="9972"/>
+            <w:shd w:val="clear" w:color="auto" w:fill="FBEAEA"/>
+          </w:tcPr>
+          <w:p>
+            <w:r>
+              <w:rPr>
+                <w:rFonts w:ascii="Consolas" w:hAnsi="Consolas" w:eastAsia="Consolas"/>
+                <w:sz w:val="16"/>
+              </w:rPr>
+              <w:t>header("Content-Security-Policy: default-src 'self'; script-src 'self';</w:t>
+              <w:br/>
+            </w:r>
+            <w:r>
+              <w:rPr>
+                <w:rFonts w:ascii="Consolas" w:hAnsi="Consolas" w:eastAsia="Consolas"/>
+                <w:sz w:val="16"/>
+              </w:rPr>
+              <w:t xml:space="preserve">        style-src 'self' 'unsafe-inline'; ...");</w:t>
+              <w:br/>
+            </w:r>
+            <w:r>
+              <w:rPr>
+                <w:rFonts w:ascii="Consolas" w:hAnsi="Consolas" w:eastAsia="Consolas"/>
+                <w:sz w:val="16"/>
+              </w:rPr>
+              <w:t>&lt;div style="text-align: center;"&gt;</w:t>
+              <w:br/>
+            </w:r>
+            <w:r>
+              <w:rPr>
+                <w:rFonts w:ascii="Consolas" w:hAnsi="Consolas" w:eastAsia="Consolas"/>
+                <w:sz w:val="16"/>
+              </w:rPr>
+              <w:t>&lt;a class="button" ... style="margin:0%"&gt;Seleccionar&lt;/a&gt;</w:t>
+            </w:r>
+          </w:p>
+        </w:tc>
+      </w:tr>
+    </w:tbl>
+    <w:p/>
+    <w:p>
+      <w:pPr>
+        <w:spacing w:after="40"/>
+      </w:pPr>
+      <w:r>
+        <w:rPr>
+          <w:b/>
+          <w:color w:val="1E6B34"/>
+        </w:rPr>
+        <w:t>Código nuevo</w:t>
+      </w:r>
+    </w:p>
+    <w:tbl>
+      <w:tblPr>
+        <w:tblW w:type="auto" w:w="0"/>
+        <w:jc w:val="center"/>
+        <w:tblLook w:firstColumn="1" w:firstRow="1" w:lastColumn="0" w:lastRow="0" w:noHBand="0" w:noVBand="1" w:val="04A0"/>
+      </w:tblPr>
+      <w:tblGrid>
+        <w:gridCol w:w="9972"/>
+      </w:tblGrid>
+      <w:tr>
+        <w:tc>
+          <w:tcPr>
+            <w:tcW w:type="dxa" w:w="9972"/>
+            <w:shd w:val="clear" w:color="auto" w:fill="EAF6EC"/>
+          </w:tcPr>
+          <w:p>
+            <w:r>
+              <w:rPr>
+                <w:rFonts w:ascii="Consolas" w:hAnsi="Consolas" w:eastAsia="Consolas"/>
+                <w:sz w:val="16"/>
+              </w:rPr>
+              <w:t>header("Content-Security-Policy: default-src 'self'; script-src 'self';</w:t>
+              <w:br/>
+            </w:r>
+            <w:r>
+              <w:rPr>
+                <w:rFonts w:ascii="Consolas" w:hAnsi="Consolas" w:eastAsia="Consolas"/>
+                <w:sz w:val="16"/>
+              </w:rPr>
+              <w:t xml:space="preserve">        style-src 'self'; ...");</w:t>
+              <w:br/>
+            </w:r>
+            <w:r>
+              <w:rPr>
+                <w:rFonts w:ascii="Consolas" w:hAnsi="Consolas" w:eastAsia="Consolas"/>
+                <w:sz w:val="16"/>
+              </w:rPr>
+              <w:t>header('Cross-Origin-Opener-Policy: same-origin');</w:t>
+              <w:br/>
+            </w:r>
+            <w:r>
+              <w:rPr>
+                <w:rFonts w:ascii="Consolas" w:hAnsi="Consolas" w:eastAsia="Consolas"/>
+                <w:sz w:val="16"/>
+              </w:rPr>
+              <w:t>header('Cross-Origin-Resource-Policy: same-origin');</w:t>
+              <w:br/>
+            </w:r>
+            <w:r>
+              <w:rPr>
+                <w:rFonts w:ascii="Consolas" w:hAnsi="Consolas" w:eastAsia="Consolas"/>
+                <w:sz w:val="16"/>
+              </w:rPr>
+              <w:t>&lt;div class="text-center"&gt;</w:t>
+              <w:br/>
+            </w:r>
+            <w:r>
+              <w:rPr>
+                <w:rFonts w:ascii="Consolas" w:hAnsi="Consolas" w:eastAsia="Consolas"/>
+                <w:sz w:val="16"/>
+              </w:rPr>
+              <w:t>&lt;a class="button m-0" ...&gt;Seleccionar&lt;/a&gt;</w:t>
+            </w:r>
+          </w:p>
+        </w:tc>
+      </w:tr>
+    </w:tbl>
+    <w:p/>
+    <w:p>
+      <w:pPr>
+        <w:spacing w:after="40"/>
+      </w:pPr>
+      <w:r>
+        <w:rPr>
+          <w:b/>
+          <w:color w:val="1E6B34"/>
+        </w:rPr>
+        <w:t>Evidencia sin vulnerabilidad (versión corregida)</w:t>
+      </w:r>
+    </w:p>
+    <w:tbl>
+      <w:tblPr>
+        <w:tblW w:type="auto" w:w="0"/>
+        <w:jc w:val="center"/>
+        <w:tblLook w:firstColumn="1" w:firstRow="1" w:lastColumn="0" w:lastRow="0" w:noHBand="0" w:noVBand="1" w:val="04A0"/>
+      </w:tblPr>
+      <w:tblGrid>
+        <w:gridCol w:w="9972"/>
+      </w:tblGrid>
+      <w:tr>
+        <w:tc>
+          <w:tcPr>
+            <w:tcW w:type="dxa" w:w="9972"/>
+            <w:shd w:val="clear" w:color="auto" w:fill="EAF6EC"/>
+          </w:tcPr>
+          <w:p>
+            <w:r>
+              <w:rPr>
+                <w:rFonts w:ascii="Consolas" w:hAnsi="Consolas" w:eastAsia="Consolas"/>
+                <w:sz w:val="16"/>
+              </w:rPr>
+              <w:t>Prueba 'VUL-22/29 Cabeceras' de tests/test_seguridad.py: falla si la CSP contiene 'unsafe-inline' o si falta nosniff, X-Frame-Options, HSTS o la cookie segura.</w:t>
+            </w:r>
+          </w:p>
+        </w:tc>
+      </w:tr>
+    </w:tbl>
+    <w:p>
+      <w:pPr>
+        <w:pStyle w:val="Heading2"/>
+        <w:pageBreakBefore/>
+      </w:pPr>
+      <w:r>
+        <w:t>VUL-030 → Librerías obsoletas y archivos sin uso publicados en el webroot</w:t>
+      </w:r>
+    </w:p>
+    <w:tbl>
+      <w:tblPr>
+        <w:tblStyle w:val="TableGrid"/>
+        <w:tblW w:type="auto" w:w="0"/>
+        <w:tblLook w:firstColumn="1" w:firstRow="1" w:lastColumn="0" w:lastRow="0" w:noHBand="0" w:noVBand="1" w:val="04A0"/>
+      </w:tblPr>
+      <w:tblGrid>
+        <w:gridCol w:w="4986"/>
+        <w:gridCol w:w="4986"/>
+      </w:tblGrid>
+      <w:tr>
+        <w:tc>
+          <w:tcPr>
+            <w:tcW w:type="dxa" w:w="2154"/>
+            <w:shd w:val="clear" w:color="auto" w:fill="DCE6F0"/>
+          </w:tcPr>
+          <w:p>
+            <w:r/>
+            <w:r>
+              <w:rPr>
+                <w:b/>
+                <w:sz w:val="18"/>
+              </w:rPr>
+              <w:t>Vulnerabilidad</w:t>
+            </w:r>
+          </w:p>
+        </w:tc>
+        <w:tc>
+          <w:tcPr>
+            <w:tcW w:type="dxa" w:w="7483"/>
+          </w:tcPr>
+          <w:p>
+            <w:r/>
+            <w:r>
+              <w:rPr>
+                <w:sz w:val="18"/>
+              </w:rPr>
+              <w:t>Librerías obsoletas y archivos sin uso publicados en el webroot</w:t>
+            </w:r>
+          </w:p>
+        </w:tc>
+      </w:tr>
+      <w:tr>
+        <w:tc>
+          <w:tcPr>
+            <w:tcW w:type="dxa" w:w="2154"/>
+            <w:shd w:val="clear" w:color="auto" w:fill="DCE6F0"/>
+          </w:tcPr>
+          <w:p>
+            <w:r/>
+            <w:r>
+              <w:rPr>
+                <w:b/>
+                <w:sz w:val="18"/>
+              </w:rPr>
+              <w:t>Severidad</w:t>
+            </w:r>
+          </w:p>
+        </w:tc>
+        <w:tc>
+          <w:tcPr>
+            <w:tcW w:type="dxa" w:w="7483"/>
+            <w:shd w:val="clear" w:color="auto" w:fill="E67E22"/>
+          </w:tcPr>
+          <w:p>
+            <w:r/>
+            <w:r>
+              <w:rPr>
+                <w:b/>
+                <w:color w:val="FFFFFF"/>
+                <w:sz w:val="18"/>
+              </w:rPr>
+              <w:t>Media</w:t>
+            </w:r>
+          </w:p>
+        </w:tc>
+      </w:tr>
+      <w:tr>
+        <w:tc>
+          <w:tcPr>
+            <w:tcW w:type="dxa" w:w="2154"/>
+            <w:shd w:val="clear" w:color="auto" w:fill="DCE6F0"/>
+          </w:tcPr>
+          <w:p>
+            <w:r/>
+            <w:r>
+              <w:rPr>
+                <w:b/>
+                <w:sz w:val="18"/>
+              </w:rPr>
+              <w:t>OWASP Top 10</w:t>
+            </w:r>
+          </w:p>
+        </w:tc>
+        <w:tc>
+          <w:tcPr>
+            <w:tcW w:type="dxa" w:w="7483"/>
+          </w:tcPr>
+          <w:p>
+            <w:r/>
+            <w:r>
+              <w:rPr>
+                <w:sz w:val="18"/>
+              </w:rPr>
+              <w:t>A06:2021 – Vulnerable and Outdated Components</w:t>
+            </w:r>
+          </w:p>
+        </w:tc>
+      </w:tr>
+      <w:tr>
+        <w:tc>
+          <w:tcPr>
+            <w:tcW w:type="dxa" w:w="2154"/>
+            <w:shd w:val="clear" w:color="auto" w:fill="DCE6F0"/>
+          </w:tcPr>
+          <w:p>
+            <w:r/>
+            <w:r>
+              <w:rPr>
+                <w:b/>
+                <w:sz w:val="18"/>
+              </w:rPr>
+              <w:t>OWASP ASVS v5.0.0</w:t>
+            </w:r>
+          </w:p>
+        </w:tc>
+        <w:tc>
+          <w:tcPr>
+            <w:tcW w:type="dxa" w:w="7483"/>
+          </w:tcPr>
+          <w:p>
+            <w:r/>
+            <w:r>
+              <w:rPr>
+                <w:sz w:val="18"/>
+              </w:rPr>
+              <w:t>V15 Secure Coding and Architecture (dependencias)</w:t>
+            </w:r>
+          </w:p>
+        </w:tc>
+      </w:tr>
+      <w:tr>
+        <w:tc>
+          <w:tcPr>
+            <w:tcW w:type="dxa" w:w="2154"/>
+            <w:shd w:val="clear" w:color="auto" w:fill="DCE6F0"/>
+          </w:tcPr>
+          <w:p>
+            <w:r/>
+            <w:r>
+              <w:rPr>
+                <w:b/>
+                <w:sz w:val="18"/>
+              </w:rPr>
+              <w:t>Descripción</w:t>
+            </w:r>
+          </w:p>
+        </w:tc>
+        <w:tc>
+          <w:tcPr>
+            <w:tcW w:type="dxa" w:w="7483"/>
+          </w:tcPr>
+          <w:p>
+            <w:r/>
+            <w:r>
+              <w:rPr>
+                <w:sz w:val="18"/>
+              </w:rPr>
+              <w:t>Aunque VUL-025 actualizó jQuery y Bootstrap, seguían publicados y descargables componentes viejos sin uso: Bootstrap 4.1.3 dentro de vendors/fontawesome (CVE-2019-8331), jQuery Validation 1.11.1 (ReDoS, CVE-2021-21252 / CVE-2022-31147), jQuery Form 3.32 (2013), Magnific Popup 1.1.0, ajaxChimp, skrollr, nouislider, scripts de contacto/mail, demos HTML, .DS_Store y style.map. Un atacante puede cargarlos desde la propia origen (bypass de CSP 'self' con gadgets de librerías viejas).</w:t>
+            </w:r>
+          </w:p>
+        </w:tc>
+      </w:tr>
+      <w:tr>
+        <w:tc>
+          <w:tcPr>
+            <w:tcW w:type="dxa" w:w="2154"/>
+            <w:shd w:val="clear" w:color="auto" w:fill="DCE6F0"/>
+          </w:tcPr>
+          <w:p>
+            <w:r/>
+            <w:r>
+              <w:rPr>
+                <w:b/>
+                <w:sz w:val="18"/>
+              </w:rPr>
+              <w:t>URL</w:t>
+            </w:r>
+          </w:p>
+        </w:tc>
+        <w:tc>
+          <w:tcPr>
+            <w:tcW w:type="dxa" w:w="7483"/>
+          </w:tcPr>
+          <w:p>
+            <w:r/>
+            <w:r>
+              <w:rPr>
+                <w:sz w:val="18"/>
+              </w:rPr>
+              <w:t>GET /vendors/fontawesome/bootstrap.bundle.min.js  ·  /js/jquery.validate.min.js  ·  /css/style.map</w:t>
+            </w:r>
+          </w:p>
+        </w:tc>
+      </w:tr>
+      <w:tr>
+        <w:tc>
+          <w:tcPr>
+            <w:tcW w:type="dxa" w:w="2154"/>
+            <w:shd w:val="clear" w:color="auto" w:fill="DCE6F0"/>
+          </w:tcPr>
+          <w:p>
+            <w:r/>
+            <w:r>
+              <w:rPr>
+                <w:b/>
+                <w:sz w:val="18"/>
+              </w:rPr>
+              <w:t>Archivo(s)</w:t>
+            </w:r>
+          </w:p>
+        </w:tc>
+        <w:tc>
+          <w:tcPr>
+            <w:tcW w:type="dxa" w:w="7483"/>
+          </w:tcPr>
+          <w:p>
+            <w:r/>
+            <w:r>
+              <w:rPr>
+                <w:sz w:val="18"/>
+              </w:rPr>
+              <w:t>src/pnkSecurity/js/, vendors/, css/ (423 archivos eliminados)</w:t>
+            </w:r>
+          </w:p>
+        </w:tc>
+      </w:tr>
+      <w:tr>
+        <w:tc>
+          <w:tcPr>
+            <w:tcW w:type="dxa" w:w="2154"/>
+            <w:shd w:val="clear" w:color="auto" w:fill="DCE6F0"/>
+          </w:tcPr>
+          <w:p>
+            <w:r/>
+            <w:r>
+              <w:rPr>
+                <w:b/>
+                <w:sz w:val="18"/>
+              </w:rPr>
+              <w:t>ISO/IEC 27001:2022</w:t>
+            </w:r>
+          </w:p>
+        </w:tc>
+        <w:tc>
+          <w:tcPr>
+            <w:tcW w:type="dxa" w:w="7483"/>
+          </w:tcPr>
+          <w:p>
+            <w:r/>
+            <w:r>
+              <w:rPr>
+                <w:sz w:val="18"/>
+              </w:rPr>
+              <w:t>A.8.8, A.5.21</w:t>
+            </w:r>
+          </w:p>
+        </w:tc>
+      </w:tr>
+      <w:tr>
+        <w:tc>
+          <w:tcPr>
+            <w:tcW w:type="dxa" w:w="2154"/>
+            <w:shd w:val="clear" w:color="auto" w:fill="DCE6F0"/>
+          </w:tcPr>
+          <w:p>
+            <w:r/>
+            <w:r>
+              <w:rPr>
+                <w:b/>
+                <w:sz w:val="18"/>
+              </w:rPr>
+              <w:t>ISO/IEC 27034 (ASC)</w:t>
+            </w:r>
+          </w:p>
+        </w:tc>
+        <w:tc>
+          <w:tcPr>
+            <w:tcW w:type="dxa" w:w="7483"/>
+          </w:tcPr>
+          <w:p>
+            <w:r/>
+            <w:r>
+              <w:rPr>
+                <w:sz w:val="18"/>
+              </w:rPr>
+              <w:t>ASC-15</w:t>
+            </w:r>
+          </w:p>
+        </w:tc>
+      </w:tr>
+      <w:tr>
+        <w:tc>
+          <w:tcPr>
+            <w:tcW w:type="dxa" w:w="2154"/>
+            <w:shd w:val="clear" w:color="auto" w:fill="DCE6F0"/>
+          </w:tcPr>
+          <w:p>
+            <w:r/>
+            <w:r>
+              <w:rPr>
+                <w:b/>
+                <w:sz w:val="18"/>
+              </w:rPr>
+              <w:t>Estado</w:t>
+            </w:r>
+          </w:p>
+        </w:tc>
+        <w:tc>
+          <w:tcPr>
+            <w:tcW w:type="dxa" w:w="7483"/>
+          </w:tcPr>
+          <w:p>
+            <w:r/>
+            <w:r>
+              <w:rPr>
+                <w:sz w:val="18"/>
+              </w:rPr>
+              <w:t>Corregido – verificar con test_seguridad.py</w:t>
+            </w:r>
+          </w:p>
+        </w:tc>
+      </w:tr>
+    </w:tbl>
+    <w:p/>
+    <w:p>
+      <w:pPr>
+        <w:spacing w:after="40"/>
+      </w:pPr>
+      <w:r>
+        <w:rPr>
+          <w:b/>
+          <w:color w:val="B02418"/>
+        </w:rPr>
+        <w:t>Evidencia (versión original — vulnerable)</w:t>
+      </w:r>
+    </w:p>
+    <w:tbl>
+      <w:tblPr>
+        <w:tblW w:type="auto" w:w="0"/>
+        <w:jc w:val="center"/>
+        <w:tblLook w:firstColumn="1" w:firstRow="1" w:lastColumn="0" w:lastRow="0" w:noHBand="0" w:noVBand="1" w:val="04A0"/>
+      </w:tblPr>
+      <w:tblGrid>
+        <w:gridCol w:w="9972"/>
+      </w:tblGrid>
+      <w:tr>
+        <w:tc>
+          <w:tcPr>
+            <w:tcW w:type="dxa" w:w="9972"/>
+            <w:shd w:val="clear" w:color="auto" w:fill="FBEAEA"/>
+          </w:tcPr>
+          <w:p>
+            <w:r>
+              <w:rPr>
+                <w:rFonts w:ascii="Consolas" w:hAnsi="Consolas" w:eastAsia="Consolas"/>
+                <w:sz w:val="16"/>
+              </w:rPr>
+              <w:t>vendors/fontawesome/bootstrap.bundle.min.js -&gt; /*! Bootstrap v4.1.3 */  (HTTP 200)</w:t>
+              <w:br/>
+            </w:r>
+            <w:r>
+              <w:rPr>
+                <w:rFonts w:ascii="Consolas" w:hAnsi="Consolas" w:eastAsia="Consolas"/>
+                <w:sz w:val="16"/>
+              </w:rPr>
+              <w:t>js/jquery.validate.min.js -&gt; /*! jQuery Validation Plugin - v1.11.1 - 3/22/2013 */  (HTTP 200)</w:t>
+            </w:r>
+          </w:p>
+        </w:tc>
+      </w:tr>
+    </w:tbl>
+    <w:p/>
+    <w:p>
+      <w:pPr>
+        <w:spacing w:after="40"/>
+      </w:pPr>
+      <w:r>
+        <w:rPr>
+          <w:b/>
+          <w:color w:val="1F3A5F"/>
+        </w:rPr>
+        <w:t>Corrección</w:t>
+      </w:r>
+    </w:p>
+    <w:p>
+      <w:r>
+        <w:t xml:space="preserve">Commit Git: </w:t>
+      </w:r>
+      <w:hyperlink r:id="rId22">
+        <w:r>
+          <w:rPr>
+            <w:color w:val="0563C1"/>
+            <w:u w:val="single"/>
+          </w:rPr>
+          <w:t>e71f454</w:t>
+        </w:r>
+      </w:hyperlink>
+      <w:r>
+        <w:t xml:space="preserve">   (rama mejoras)</w:t>
+      </w:r>
+    </w:p>
+    <w:p>
+      <w:pPr>
+        <w:spacing w:after="40"/>
+      </w:pPr>
+      <w:r>
+        <w:rPr>
+          <w:b/>
+          <w:color w:val="B02418"/>
+        </w:rPr>
+        <w:t>Código original</w:t>
+      </w:r>
+    </w:p>
+    <w:tbl>
+      <w:tblPr>
+        <w:tblW w:type="auto" w:w="0"/>
+        <w:jc w:val="center"/>
+        <w:tblLook w:firstColumn="1" w:firstRow="1" w:lastColumn="0" w:lastRow="0" w:noHBand="0" w:noVBand="1" w:val="04A0"/>
+      </w:tblPr>
+      <w:tblGrid>
+        <w:gridCol w:w="9972"/>
+      </w:tblGrid>
+      <w:tr>
+        <w:tc>
+          <w:tcPr>
+            <w:tcW w:type="dxa" w:w="9972"/>
+            <w:shd w:val="clear" w:color="auto" w:fill="FBEAEA"/>
+          </w:tcPr>
+          <w:p>
+            <w:r>
+              <w:rPr>
+                <w:rFonts w:ascii="Consolas" w:hAnsi="Consolas" w:eastAsia="Consolas"/>
+                <w:sz w:val="16"/>
+              </w:rPr>
+              <w:t>&lt;script src="vendors/nice-select/jquery.nice-select.min.js"&gt;&lt;/script&gt;</w:t>
+              <w:br/>
+            </w:r>
+            <w:r>
+              <w:rPr>
+                <w:rFonts w:ascii="Consolas" w:hAnsi="Consolas" w:eastAsia="Consolas"/>
+                <w:sz w:val="16"/>
+              </w:rPr>
+              <w:t>&lt;script src="vendors/Magnific-Popup/jquery.magnific-popup.min.js"&gt;&lt;/script&gt;</w:t>
+              <w:br/>
+            </w:r>
+            <w:r>
+              <w:rPr>
+                <w:rFonts w:ascii="Consolas" w:hAnsi="Consolas" w:eastAsia="Consolas"/>
+                <w:sz w:val="16"/>
+              </w:rPr>
+              <w:t>&lt;script src="js/jquery.ajaxchimp.min.js"&gt;&lt;/script&gt;</w:t>
+              <w:br/>
+            </w:r>
+            <w:r>
+              <w:rPr>
+                <w:rFonts w:ascii="Consolas" w:hAnsi="Consolas" w:eastAsia="Consolas"/>
+                <w:sz w:val="16"/>
+              </w:rPr>
+              <w:t>// main.js</w:t>
+              <w:br/>
+            </w:r>
+            <w:r>
+              <w:rPr>
+                <w:rFonts w:ascii="Consolas" w:hAnsi="Consolas" w:eastAsia="Consolas"/>
+                <w:sz w:val="16"/>
+              </w:rPr>
+              <w:t>$('#mc_embed_signup').find('form').ajaxChimp();</w:t>
+              <w:br/>
+            </w:r>
+            <w:r>
+              <w:rPr>
+                <w:rFonts w:ascii="Consolas" w:hAnsi="Consolas" w:eastAsia="Consolas"/>
+                <w:sz w:val="16"/>
+              </w:rPr>
+              <w:t>$(".hero-banner__video").magnificPopup({...});</w:t>
+            </w:r>
+          </w:p>
+        </w:tc>
+      </w:tr>
+    </w:tbl>
+    <w:p/>
+    <w:p>
+      <w:pPr>
+        <w:spacing w:after="40"/>
+      </w:pPr>
+      <w:r>
+        <w:rPr>
+          <w:b/>
+          <w:color w:val="1E6B34"/>
+        </w:rPr>
+        <w:t>Código nuevo</w:t>
+      </w:r>
+    </w:p>
+    <w:tbl>
+      <w:tblPr>
+        <w:tblW w:type="auto" w:w="0"/>
+        <w:jc w:val="center"/>
+        <w:tblLook w:firstColumn="1" w:firstRow="1" w:lastColumn="0" w:lastRow="0" w:noHBand="0" w:noVBand="1" w:val="04A0"/>
+      </w:tblPr>
+      <w:tblGrid>
+        <w:gridCol w:w="9972"/>
+      </w:tblGrid>
+      <w:tr>
+        <w:tc>
+          <w:tcPr>
+            <w:tcW w:type="dxa" w:w="9972"/>
+            <w:shd w:val="clear" w:color="auto" w:fill="EAF6EC"/>
+          </w:tcPr>
+          <w:p>
+            <w:r>
+              <w:rPr>
+                <w:rFonts w:ascii="Consolas" w:hAnsi="Consolas" w:eastAsia="Consolas"/>
+                <w:sz w:val="16"/>
+              </w:rPr>
+              <w:t>&lt;script src="vendors/jquery/jquery-3.7.1.min.js"&gt;&lt;/script&gt;</w:t>
+              <w:br/>
+            </w:r>
+            <w:r>
+              <w:rPr>
+                <w:rFonts w:ascii="Consolas" w:hAnsi="Consolas" w:eastAsia="Consolas"/>
+                <w:sz w:val="16"/>
+              </w:rPr>
+              <w:t>&lt;script src="vendors/bootstrap/bootstrap.bundle.min.js"&gt;&lt;/script&gt;   &lt;!-- 4.6.2 --&gt;</w:t>
+              <w:br/>
+            </w:r>
+            <w:r>
+              <w:rPr>
+                <w:rFonts w:ascii="Consolas" w:hAnsi="Consolas" w:eastAsia="Consolas"/>
+                <w:sz w:val="16"/>
+              </w:rPr>
+              <w:t>&lt;script src="vendors/owl-carousel/owl.carousel.min.js"&gt;&lt;/script&gt;</w:t>
+              <w:br/>
+            </w:r>
+            <w:r>
+              <w:rPr>
+                <w:rFonts w:ascii="Consolas" w:hAnsi="Consolas" w:eastAsia="Consolas"/>
+                <w:sz w:val="16"/>
+              </w:rPr>
+              <w:t>&lt;script src="js/main.js"&gt;&lt;/script&gt;</w:t>
+              <w:br/>
+            </w:r>
+            <w:r>
+              <w:rPr>
+                <w:rFonts w:ascii="Consolas" w:hAnsi="Consolas" w:eastAsia="Consolas"/>
+                <w:sz w:val="16"/>
+              </w:rPr>
+              <w:t>&lt;script src="js/controladorajax.js"&gt;&lt;/script&gt;</w:t>
+              <w:br/>
+            </w:r>
+            <w:r>
+              <w:rPr>
+                <w:rFonts w:ascii="Consolas" w:hAnsi="Consolas" w:eastAsia="Consolas"/>
+                <w:sz w:val="16"/>
+              </w:rPr>
+              <w:t>// webroot final: 4 librerías (jQuery 3.7.1, Bootstrap 4.6.2, Owl 2.3.4, Themify)</w:t>
+            </w:r>
+          </w:p>
+        </w:tc>
+      </w:tr>
+    </w:tbl>
+    <w:p/>
+    <w:p>
+      <w:pPr>
+        <w:spacing w:after="40"/>
+      </w:pPr>
+      <w:r>
+        <w:rPr>
+          <w:b/>
+          <w:color w:val="1E6B34"/>
+        </w:rPr>
+        <w:t>Evidencia sin vulnerabilidad (versión corregida)</w:t>
+      </w:r>
+    </w:p>
+    <w:tbl>
+      <w:tblPr>
+        <w:tblW w:type="auto" w:w="0"/>
+        <w:jc w:val="center"/>
+        <w:tblLook w:firstColumn="1" w:firstRow="1" w:lastColumn="0" w:lastRow="0" w:noHBand="0" w:noVBand="1" w:val="04A0"/>
+      </w:tblPr>
+      <w:tblGrid>
+        <w:gridCol w:w="9972"/>
+      </w:tblGrid>
+      <w:tr>
+        <w:tc>
+          <w:tcPr>
+            <w:tcW w:type="dxa" w:w="9972"/>
+            <w:shd w:val="clear" w:color="auto" w:fill="EAF6EC"/>
+          </w:tcPr>
+          <w:p>
+            <w:r>
+              <w:rPr>
+                <w:rFonts w:ascii="Consolas" w:hAnsi="Consolas" w:eastAsia="Consolas"/>
+                <w:sz w:val="16"/>
+              </w:rPr>
+              <w:t>Prueba 'VUL-19/25/30 Archivos': las rutas de las librerías retiradas responden 404.</w:t>
+            </w:r>
+          </w:p>
+        </w:tc>
+      </w:tr>
+    </w:tbl>
+    <w:p>
+      <w:pPr>
+        <w:pStyle w:val="Heading2"/>
+        <w:pageBreakBefore/>
+      </w:pPr>
+      <w:r>
+        <w:t>VUL-031 → Fuerza bruta distribuida contra una cuenta y retención indefinida de IPs</w:t>
+      </w:r>
+    </w:p>
+    <w:tbl>
+      <w:tblPr>
+        <w:tblStyle w:val="TableGrid"/>
+        <w:tblW w:type="auto" w:w="0"/>
+        <w:tblLook w:firstColumn="1" w:firstRow="1" w:lastColumn="0" w:lastRow="0" w:noHBand="0" w:noVBand="1" w:val="04A0"/>
+      </w:tblPr>
+      <w:tblGrid>
+        <w:gridCol w:w="4986"/>
+        <w:gridCol w:w="4986"/>
+      </w:tblGrid>
+      <w:tr>
+        <w:tc>
+          <w:tcPr>
+            <w:tcW w:type="dxa" w:w="2154"/>
+            <w:shd w:val="clear" w:color="auto" w:fill="DCE6F0"/>
+          </w:tcPr>
+          <w:p>
+            <w:r/>
+            <w:r>
+              <w:rPr>
+                <w:b/>
+                <w:sz w:val="18"/>
+              </w:rPr>
+              <w:t>Vulnerabilidad</w:t>
+            </w:r>
+          </w:p>
+        </w:tc>
+        <w:tc>
+          <w:tcPr>
+            <w:tcW w:type="dxa" w:w="7483"/>
+          </w:tcPr>
+          <w:p>
+            <w:r/>
+            <w:r>
+              <w:rPr>
+                <w:sz w:val="18"/>
+              </w:rPr>
+              <w:t>Fuerza bruta distribuida contra una cuenta y retención indefinida de IPs</w:t>
+            </w:r>
+          </w:p>
+        </w:tc>
+      </w:tr>
+      <w:tr>
+        <w:tc>
+          <w:tcPr>
+            <w:tcW w:type="dxa" w:w="2154"/>
+            <w:shd w:val="clear" w:color="auto" w:fill="DCE6F0"/>
+          </w:tcPr>
+          <w:p>
+            <w:r/>
+            <w:r>
+              <w:rPr>
+                <w:b/>
+                <w:sz w:val="18"/>
+              </w:rPr>
+              <w:t>Severidad</w:t>
+            </w:r>
+          </w:p>
+        </w:tc>
+        <w:tc>
+          <w:tcPr>
+            <w:tcW w:type="dxa" w:w="7483"/>
+            <w:shd w:val="clear" w:color="auto" w:fill="2E86C1"/>
+          </w:tcPr>
+          <w:p>
+            <w:r/>
+            <w:r>
+              <w:rPr>
+                <w:b/>
+                <w:color w:val="FFFFFF"/>
+                <w:sz w:val="18"/>
+              </w:rPr>
+              <w:t>Baja</w:t>
+            </w:r>
+          </w:p>
+        </w:tc>
+      </w:tr>
+      <w:tr>
+        <w:tc>
+          <w:tcPr>
+            <w:tcW w:type="dxa" w:w="2154"/>
+            <w:shd w:val="clear" w:color="auto" w:fill="DCE6F0"/>
+          </w:tcPr>
+          <w:p>
+            <w:r/>
+            <w:r>
+              <w:rPr>
+                <w:b/>
+                <w:sz w:val="18"/>
+              </w:rPr>
+              <w:t>OWASP Top 10</w:t>
+            </w:r>
+          </w:p>
+        </w:tc>
+        <w:tc>
+          <w:tcPr>
+            <w:tcW w:type="dxa" w:w="7483"/>
+          </w:tcPr>
+          <w:p>
+            <w:r/>
+            <w:r>
+              <w:rPr>
+                <w:sz w:val="18"/>
+              </w:rPr>
+              <w:t>A07:2021 – Identification and Authentication Failures</w:t>
+            </w:r>
+          </w:p>
+        </w:tc>
+      </w:tr>
+      <w:tr>
+        <w:tc>
+          <w:tcPr>
+            <w:tcW w:type="dxa" w:w="2154"/>
+            <w:shd w:val="clear" w:color="auto" w:fill="DCE6F0"/>
+          </w:tcPr>
+          <w:p>
+            <w:r/>
+            <w:r>
+              <w:rPr>
+                <w:b/>
+                <w:sz w:val="18"/>
+              </w:rPr>
+              <w:t>OWASP ASVS v5.0.0</w:t>
+            </w:r>
+          </w:p>
+        </w:tc>
+        <w:tc>
+          <w:tcPr>
+            <w:tcW w:type="dxa" w:w="7483"/>
+          </w:tcPr>
+          <w:p>
+            <w:r/>
+            <w:r>
+              <w:rPr>
+                <w:sz w:val="18"/>
+              </w:rPr>
+              <w:t>V6 Authentication (anti-automatización)</w:t>
+            </w:r>
+          </w:p>
+        </w:tc>
+      </w:tr>
+      <w:tr>
+        <w:tc>
+          <w:tcPr>
+            <w:tcW w:type="dxa" w:w="2154"/>
+            <w:shd w:val="clear" w:color="auto" w:fill="DCE6F0"/>
+          </w:tcPr>
+          <w:p>
+            <w:r/>
+            <w:r>
+              <w:rPr>
+                <w:b/>
+                <w:sz w:val="18"/>
+              </w:rPr>
+              <w:t>Descripción</w:t>
+            </w:r>
+          </w:p>
+        </w:tc>
+        <w:tc>
+          <w:tcPr>
+            <w:tcW w:type="dxa" w:w="7483"/>
+          </w:tcPr>
+          <w:p>
+            <w:r/>
+            <w:r>
+              <w:rPr>
+                <w:sz w:val="18"/>
+              </w:rPr>
+              <w:t>Tras VUL-024 el límite era solo por IP: una botnet con muchas IP podía probar contraseñas contra una misma cuenta sin tope. Además login_intentos guardaba IPs (dato personal) para siempre.</w:t>
+            </w:r>
+          </w:p>
+        </w:tc>
+      </w:tr>
+      <w:tr>
+        <w:tc>
+          <w:tcPr>
+            <w:tcW w:type="dxa" w:w="2154"/>
+            <w:shd w:val="clear" w:color="auto" w:fill="DCE6F0"/>
+          </w:tcPr>
+          <w:p>
+            <w:r/>
+            <w:r>
+              <w:rPr>
+                <w:b/>
+                <w:sz w:val="18"/>
+              </w:rPr>
+              <w:t>URL</w:t>
+            </w:r>
+          </w:p>
+        </w:tc>
+        <w:tc>
+          <w:tcPr>
+            <w:tcW w:type="dxa" w:w="7483"/>
+          </w:tcPr>
+          <w:p>
+            <w:r/>
+            <w:r>
+              <w:rPr>
+                <w:sz w:val="18"/>
+              </w:rPr>
+              <w:t>POST /setup/procesalogin.php desde muchas IP</w:t>
+            </w:r>
+          </w:p>
+        </w:tc>
+      </w:tr>
+      <w:tr>
+        <w:tc>
+          <w:tcPr>
+            <w:tcW w:type="dxa" w:w="2154"/>
+            <w:shd w:val="clear" w:color="auto" w:fill="DCE6F0"/>
+          </w:tcPr>
+          <w:p>
+            <w:r/>
+            <w:r>
+              <w:rPr>
+                <w:b/>
+                <w:sz w:val="18"/>
+              </w:rPr>
+              <w:t>Archivo(s)</w:t>
+            </w:r>
+          </w:p>
+        </w:tc>
+        <w:tc>
+          <w:tcPr>
+            <w:tcW w:type="dxa" w:w="7483"/>
+          </w:tcPr>
+          <w:p>
+            <w:r/>
+            <w:r>
+              <w:rPr>
+                <w:sz w:val="18"/>
+              </w:rPr>
+              <w:t>src/pnkSecurity/setup/procesalogin.php</w:t>
+            </w:r>
+          </w:p>
+        </w:tc>
+      </w:tr>
+      <w:tr>
+        <w:tc>
+          <w:tcPr>
+            <w:tcW w:type="dxa" w:w="2154"/>
+            <w:shd w:val="clear" w:color="auto" w:fill="DCE6F0"/>
+          </w:tcPr>
+          <w:p>
+            <w:r/>
+            <w:r>
+              <w:rPr>
+                <w:b/>
+                <w:sz w:val="18"/>
+              </w:rPr>
+              <w:t>ISO/IEC 27001:2022</w:t>
+            </w:r>
+          </w:p>
+        </w:tc>
+        <w:tc>
+          <w:tcPr>
+            <w:tcW w:type="dxa" w:w="7483"/>
+          </w:tcPr>
+          <w:p>
+            <w:r/>
+            <w:r>
+              <w:rPr>
+                <w:sz w:val="18"/>
+              </w:rPr>
+              <w:t>A.8.5, A.5.34</w:t>
+            </w:r>
+          </w:p>
+        </w:tc>
+      </w:tr>
+      <w:tr>
+        <w:tc>
+          <w:tcPr>
+            <w:tcW w:type="dxa" w:w="2154"/>
+            <w:shd w:val="clear" w:color="auto" w:fill="DCE6F0"/>
+          </w:tcPr>
+          <w:p>
+            <w:r/>
+            <w:r>
+              <w:rPr>
+                <w:b/>
+                <w:sz w:val="18"/>
+              </w:rPr>
+              <w:t>ISO/IEC 27034 (ASC)</w:t>
+            </w:r>
+          </w:p>
+        </w:tc>
+        <w:tc>
+          <w:tcPr>
+            <w:tcW w:type="dxa" w:w="7483"/>
+          </w:tcPr>
+          <w:p>
+            <w:r/>
+            <w:r>
+              <w:rPr>
+                <w:sz w:val="18"/>
+              </w:rPr>
+              <w:t>ASC-07, ASC-11</w:t>
+            </w:r>
+          </w:p>
+        </w:tc>
+      </w:tr>
+      <w:tr>
+        <w:tc>
+          <w:tcPr>
+            <w:tcW w:type="dxa" w:w="2154"/>
+            <w:shd w:val="clear" w:color="auto" w:fill="DCE6F0"/>
+          </w:tcPr>
+          <w:p>
+            <w:r/>
+            <w:r>
+              <w:rPr>
+                <w:b/>
+                <w:sz w:val="18"/>
+              </w:rPr>
+              <w:t>Estado</w:t>
+            </w:r>
+          </w:p>
+        </w:tc>
+        <w:tc>
+          <w:tcPr>
+            <w:tcW w:type="dxa" w:w="7483"/>
+          </w:tcPr>
+          <w:p>
+            <w:r/>
+            <w:r>
+              <w:rPr>
+                <w:sz w:val="18"/>
+              </w:rPr>
+              <w:t>Corregido – verificado por revisión de código</w:t>
+            </w:r>
+          </w:p>
+        </w:tc>
+      </w:tr>
+    </w:tbl>
+    <w:p/>
+    <w:p>
+      <w:pPr>
+        <w:spacing w:after="40"/>
+      </w:pPr>
+      <w:r>
+        <w:rPr>
+          <w:b/>
+          <w:color w:val="B02418"/>
+        </w:rPr>
+        <w:t>Evidencia (versión original — vulnerable)</w:t>
+      </w:r>
+    </w:p>
+    <w:tbl>
+      <w:tblPr>
+        <w:tblW w:type="auto" w:w="0"/>
+        <w:jc w:val="center"/>
+        <w:tblLook w:firstColumn="1" w:firstRow="1" w:lastColumn="0" w:lastRow="0" w:noHBand="0" w:noVBand="1" w:val="04A0"/>
+      </w:tblPr>
+      <w:tblGrid>
+        <w:gridCol w:w="9972"/>
+      </w:tblGrid>
+      <w:tr>
+        <w:tc>
+          <w:tcPr>
+            <w:tcW w:type="dxa" w:w="9972"/>
+            <w:shd w:val="clear" w:color="auto" w:fill="FBEAEA"/>
+          </w:tcPr>
+          <w:p>
+            <w:r>
+              <w:rPr>
+                <w:rFonts w:ascii="Consolas" w:hAnsi="Consolas" w:eastAsia="Consolas"/>
+                <w:sz w:val="16"/>
+              </w:rPr>
+              <w:t>WHERE ip = ? AND creado &gt; ...   -&gt; cada IP nueva parte con contador 0</w:t>
+              <w:br/>
+            </w:r>
+            <w:r>
+              <w:rPr>
+                <w:rFonts w:ascii="Consolas" w:hAnsi="Consolas" w:eastAsia="Consolas"/>
+                <w:sz w:val="16"/>
+              </w:rPr>
+              <w:t>login_intentos sin borrado de registros antiguos</w:t>
+            </w:r>
+          </w:p>
+        </w:tc>
+      </w:tr>
+    </w:tbl>
+    <w:p/>
+    <w:p>
+      <w:pPr>
+        <w:spacing w:after="40"/>
+      </w:pPr>
+      <w:r>
+        <w:rPr>
+          <w:b/>
+          <w:color w:val="1F3A5F"/>
+        </w:rPr>
+        <w:t>Corrección</w:t>
+      </w:r>
+    </w:p>
+    <w:p>
+      <w:r>
+        <w:t xml:space="preserve">Commit Git: </w:t>
+      </w:r>
+      <w:hyperlink r:id="rId23">
+        <w:r>
+          <w:rPr>
+            <w:color w:val="0563C1"/>
+            <w:u w:val="single"/>
+          </w:rPr>
+          <w:t>e3b4e54</w:t>
+        </w:r>
+      </w:hyperlink>
+      <w:r>
+        <w:t xml:space="preserve">   (rama mejoras)</w:t>
+      </w:r>
+    </w:p>
+    <w:p>
+      <w:pPr>
+        <w:spacing w:after="40"/>
+      </w:pPr>
+      <w:r>
+        <w:rPr>
+          <w:b/>
+          <w:color w:val="B02418"/>
+        </w:rPr>
+        <w:t>Código original</w:t>
+      </w:r>
+    </w:p>
+    <w:tbl>
+      <w:tblPr>
+        <w:tblW w:type="auto" w:w="0"/>
+        <w:jc w:val="center"/>
+        <w:tblLook w:firstColumn="1" w:firstRow="1" w:lastColumn="0" w:lastRow="0" w:noHBand="0" w:noVBand="1" w:val="04A0"/>
+      </w:tblPr>
+      <w:tblGrid>
+        <w:gridCol w:w="9972"/>
+      </w:tblGrid>
+      <w:tr>
+        <w:tc>
+          <w:tcPr>
+            <w:tcW w:type="dxa" w:w="9972"/>
+            <w:shd w:val="clear" w:color="auto" w:fill="FBEAEA"/>
+          </w:tcPr>
+          <w:p>
+            <w:r>
+              <w:rPr>
+                <w:rFonts w:ascii="Consolas" w:hAnsi="Consolas" w:eastAsia="Consolas"/>
+                <w:sz w:val="16"/>
+              </w:rPr>
+              <w:t>$intentos = consulta_fila("SELECT COUNT(*) AS por_ip, ... FROM login_intentos</w:t>
+              <w:br/>
+            </w:r>
+            <w:r>
+              <w:rPr>
+                <w:rFonts w:ascii="Consolas" w:hAnsi="Consolas" w:eastAsia="Consolas"/>
+                <w:sz w:val="16"/>
+              </w:rPr>
+              <w:t xml:space="preserve">   WHERE ip = ? AND creado &gt; (NOW() - INTERVAL 15 MINUTE)", 'ss', $email, $ip);</w:t>
+            </w:r>
+          </w:p>
+        </w:tc>
+      </w:tr>
+    </w:tbl>
+    <w:p/>
+    <w:p>
+      <w:pPr>
+        <w:spacing w:after="40"/>
+      </w:pPr>
+      <w:r>
+        <w:rPr>
+          <w:b/>
+          <w:color w:val="1E6B34"/>
+        </w:rPr>
+        <w:t>Código nuevo</w:t>
+      </w:r>
+    </w:p>
+    <w:tbl>
+      <w:tblPr>
+        <w:tblW w:type="auto" w:w="0"/>
+        <w:jc w:val="center"/>
+        <w:tblLook w:firstColumn="1" w:firstRow="1" w:lastColumn="0" w:lastRow="0" w:noHBand="0" w:noVBand="1" w:val="04A0"/>
+      </w:tblPr>
+      <w:tblGrid>
+        <w:gridCol w:w="9972"/>
+      </w:tblGrid>
+      <w:tr>
+        <w:tc>
+          <w:tcPr>
+            <w:tcW w:type="dxa" w:w="9972"/>
+            <w:shd w:val="clear" w:color="auto" w:fill="EAF6EC"/>
+          </w:tcPr>
+          <w:p>
+            <w:r>
+              <w:rPr>
+                <w:rFonts w:ascii="Consolas" w:hAnsi="Consolas" w:eastAsia="Consolas"/>
+                <w:sz w:val="16"/>
+              </w:rPr>
+              <w:t>consulta("DELETE FROM login_intentos WHERE creado &lt; (NOW() - INTERVAL 24 HOUR)");</w:t>
+              <w:br/>
+            </w:r>
+            <w:r>
+              <w:rPr>
+                <w:rFonts w:ascii="Consolas" w:hAnsi="Consolas" w:eastAsia="Consolas"/>
+                <w:sz w:val="16"/>
+              </w:rPr>
+              <w:t>$global = consulta_fila("SELECT COUNT(*) AS total FROM login_intentos</w:t>
+              <w:br/>
+            </w:r>
+            <w:r>
+              <w:rPr>
+                <w:rFonts w:ascii="Consolas" w:hAnsi="Consolas" w:eastAsia="Consolas"/>
+                <w:sz w:val="16"/>
+              </w:rPr>
+              <w:t xml:space="preserve">   WHERE email = ? AND creado &gt; (NOW() - INTERVAL 15 MINUTE)", 's', $email);</w:t>
+              <w:br/>
+            </w:r>
+            <w:r>
+              <w:rPr>
+                <w:rFonts w:ascii="Consolas" w:hAnsi="Consolas" w:eastAsia="Consolas"/>
+                <w:sz w:val="16"/>
+              </w:rPr>
+              <w:t>if (... || (int) $global['total'] &gt;= MAX_INTENTOS_GLOBAL) {   // 30</w:t>
+              <w:br/>
+            </w:r>
+            <w:r>
+              <w:rPr>
+                <w:rFonts w:ascii="Consolas" w:hAnsi="Consolas" w:eastAsia="Consolas"/>
+                <w:sz w:val="16"/>
+              </w:rPr>
+              <w:t xml:space="preserve">    registrar_evento('login_bloqueado', 'cuenta=' . $email);</w:t>
+            </w:r>
+          </w:p>
+        </w:tc>
+      </w:tr>
+    </w:tbl>
+    <w:p/>
+    <w:p>
+      <w:pPr>
+        <w:spacing w:after="40"/>
+      </w:pPr>
+      <w:r>
+        <w:rPr>
+          <w:b/>
+          <w:color w:val="1E6B34"/>
+        </w:rPr>
+        <w:t>Evidencia sin vulnerabilidad (versión corregida)</w:t>
+      </w:r>
+    </w:p>
+    <w:tbl>
+      <w:tblPr>
+        <w:tblW w:type="auto" w:w="0"/>
+        <w:jc w:val="center"/>
+        <w:tblLook w:firstColumn="1" w:firstRow="1" w:lastColumn="0" w:lastRow="0" w:noHBand="0" w:noVBand="1" w:val="04A0"/>
+      </w:tblPr>
+      <w:tblGrid>
+        <w:gridCol w:w="9972"/>
+      </w:tblGrid>
+      <w:tr>
+        <w:tc>
+          <w:tcPr>
+            <w:tcW w:type="dxa" w:w="9972"/>
+            <w:shd w:val="clear" w:color="auto" w:fill="EAF6EC"/>
+          </w:tcPr>
+          <w:p>
+            <w:r>
+              <w:rPr>
+                <w:rFonts w:ascii="Consolas" w:hAnsi="Consolas" w:eastAsia="Consolas"/>
+                <w:sz w:val="16"/>
+              </w:rPr>
+              <w:t>Máximo 30 intentos por cuenta cada 15 min desde cualquier IP (≈120/h). Con las claves aleatorias de 24 caracteres generadas al desplegar (VUL-023) un ataque en línea es impracticable. Las IP se eliminan a las 24 h.</w:t>
+            </w:r>
+          </w:p>
+        </w:tc>
+      </w:tr>
+    </w:tbl>
+    <w:p>
+      <w:pPr>
+        <w:pStyle w:val="Heading2"/>
+        <w:pageBreakBefore/>
+      </w:pPr>
+      <w:r>
+        <w:t>VUL-032 → Registro insuficiente de eventos de seguridad</w:t>
+      </w:r>
+    </w:p>
+    <w:tbl>
+      <w:tblPr>
+        <w:tblStyle w:val="TableGrid"/>
+        <w:tblW w:type="auto" w:w="0"/>
+        <w:tblLook w:firstColumn="1" w:firstRow="1" w:lastColumn="0" w:lastRow="0" w:noHBand="0" w:noVBand="1" w:val="04A0"/>
+      </w:tblPr>
+      <w:tblGrid>
+        <w:gridCol w:w="4986"/>
+        <w:gridCol w:w="4986"/>
+      </w:tblGrid>
+      <w:tr>
+        <w:tc>
+          <w:tcPr>
+            <w:tcW w:type="dxa" w:w="2154"/>
+            <w:shd w:val="clear" w:color="auto" w:fill="DCE6F0"/>
+          </w:tcPr>
+          <w:p>
+            <w:r/>
+            <w:r>
+              <w:rPr>
+                <w:b/>
+                <w:sz w:val="18"/>
+              </w:rPr>
+              <w:t>Vulnerabilidad</w:t>
+            </w:r>
+          </w:p>
+        </w:tc>
+        <w:tc>
+          <w:tcPr>
+            <w:tcW w:type="dxa" w:w="7483"/>
+          </w:tcPr>
+          <w:p>
+            <w:r/>
+            <w:r>
+              <w:rPr>
+                <w:sz w:val="18"/>
+              </w:rPr>
+              <w:t>Registro insuficiente de eventos de seguridad</w:t>
+            </w:r>
+          </w:p>
+        </w:tc>
+      </w:tr>
+      <w:tr>
+        <w:tc>
+          <w:tcPr>
+            <w:tcW w:type="dxa" w:w="2154"/>
+            <w:shd w:val="clear" w:color="auto" w:fill="DCE6F0"/>
+          </w:tcPr>
+          <w:p>
+            <w:r/>
+            <w:r>
+              <w:rPr>
+                <w:b/>
+                <w:sz w:val="18"/>
+              </w:rPr>
+              <w:t>Severidad</w:t>
+            </w:r>
+          </w:p>
+        </w:tc>
+        <w:tc>
+          <w:tcPr>
+            <w:tcW w:type="dxa" w:w="7483"/>
+            <w:shd w:val="clear" w:color="auto" w:fill="2E86C1"/>
+          </w:tcPr>
+          <w:p>
+            <w:r/>
+            <w:r>
+              <w:rPr>
+                <w:b/>
+                <w:color w:val="FFFFFF"/>
+                <w:sz w:val="18"/>
+              </w:rPr>
+              <w:t>Baja</w:t>
+            </w:r>
+          </w:p>
+        </w:tc>
+      </w:tr>
+      <w:tr>
+        <w:tc>
+          <w:tcPr>
+            <w:tcW w:type="dxa" w:w="2154"/>
+            <w:shd w:val="clear" w:color="auto" w:fill="DCE6F0"/>
+          </w:tcPr>
+          <w:p>
+            <w:r/>
+            <w:r>
+              <w:rPr>
+                <w:b/>
+                <w:sz w:val="18"/>
+              </w:rPr>
+              <w:t>OWASP Top 10</w:t>
+            </w:r>
+          </w:p>
+        </w:tc>
+        <w:tc>
+          <w:tcPr>
+            <w:tcW w:type="dxa" w:w="7483"/>
+          </w:tcPr>
+          <w:p>
+            <w:r/>
+            <w:r>
+              <w:rPr>
+                <w:sz w:val="18"/>
+              </w:rPr>
+              <w:t>A09:2021 – Security Logging and Monitoring Failures</w:t>
+            </w:r>
+          </w:p>
+        </w:tc>
+      </w:tr>
+      <w:tr>
+        <w:tc>
+          <w:tcPr>
+            <w:tcW w:type="dxa" w:w="2154"/>
+            <w:shd w:val="clear" w:color="auto" w:fill="DCE6F0"/>
+          </w:tcPr>
+          <w:p>
+            <w:r/>
+            <w:r>
+              <w:rPr>
+                <w:b/>
+                <w:sz w:val="18"/>
+              </w:rPr>
+              <w:t>OWASP ASVS v5.0.0</w:t>
+            </w:r>
+          </w:p>
+        </w:tc>
+        <w:tc>
+          <w:tcPr>
+            <w:tcW w:type="dxa" w:w="7483"/>
+          </w:tcPr>
+          <w:p>
+            <w:r/>
+            <w:r>
+              <w:rPr>
+                <w:sz w:val="18"/>
+              </w:rPr>
+              <w:t>V16 Security Logging and Error Handling</w:t>
+            </w:r>
+          </w:p>
+        </w:tc>
+      </w:tr>
+      <w:tr>
+        <w:tc>
+          <w:tcPr>
+            <w:tcW w:type="dxa" w:w="2154"/>
+            <w:shd w:val="clear" w:color="auto" w:fill="DCE6F0"/>
+          </w:tcPr>
+          <w:p>
+            <w:r/>
+            <w:r>
+              <w:rPr>
+                <w:b/>
+                <w:sz w:val="18"/>
+              </w:rPr>
+              <w:t>Descripción</w:t>
+            </w:r>
+          </w:p>
+        </w:tc>
+        <w:tc>
+          <w:tcPr>
+            <w:tcW w:type="dxa" w:w="7483"/>
+          </w:tcPr>
+          <w:p>
+            <w:r/>
+            <w:r>
+              <w:rPr>
+                <w:sz w:val="18"/>
+              </w:rPr>
+              <w:t>Los ataques (CSRF rechazados, accesos denegados, logins fallidos, bloqueos) no quedaban registrados en ningún log, por lo que no era posible detectarlos ni investigarlos.</w:t>
+            </w:r>
+          </w:p>
+        </w:tc>
+      </w:tr>
+      <w:tr>
+        <w:tc>
+          <w:tcPr>
+            <w:tcW w:type="dxa" w:w="2154"/>
+            <w:shd w:val="clear" w:color="auto" w:fill="DCE6F0"/>
+          </w:tcPr>
+          <w:p>
+            <w:r/>
+            <w:r>
+              <w:rPr>
+                <w:b/>
+                <w:sz w:val="18"/>
+              </w:rPr>
+              <w:t>URL</w:t>
+            </w:r>
+          </w:p>
+        </w:tc>
+        <w:tc>
+          <w:tcPr>
+            <w:tcW w:type="dxa" w:w="7483"/>
+          </w:tcPr>
+          <w:p>
+            <w:r/>
+            <w:r>
+              <w:rPr>
+                <w:sz w:val="18"/>
+              </w:rPr>
+              <w:t>procesalogin.php, grcomentarios.php, validar_csrf()</w:t>
+            </w:r>
+          </w:p>
+        </w:tc>
+      </w:tr>
+      <w:tr>
+        <w:tc>
+          <w:tcPr>
+            <w:tcW w:type="dxa" w:w="2154"/>
+            <w:shd w:val="clear" w:color="auto" w:fill="DCE6F0"/>
+          </w:tcPr>
+          <w:p>
+            <w:r/>
+            <w:r>
+              <w:rPr>
+                <w:b/>
+                <w:sz w:val="18"/>
+              </w:rPr>
+              <w:t>Archivo(s)</w:t>
+            </w:r>
+          </w:p>
+        </w:tc>
+        <w:tc>
+          <w:tcPr>
+            <w:tcW w:type="dxa" w:w="7483"/>
+          </w:tcPr>
+          <w:p>
+            <w:r/>
+            <w:r>
+              <w:rPr>
+                <w:sz w:val="18"/>
+              </w:rPr>
+              <w:t>setup/setup.php, setup/procesalogin.php, grcomentarios.php</w:t>
+            </w:r>
+          </w:p>
+        </w:tc>
+      </w:tr>
+      <w:tr>
+        <w:tc>
+          <w:tcPr>
+            <w:tcW w:type="dxa" w:w="2154"/>
+            <w:shd w:val="clear" w:color="auto" w:fill="DCE6F0"/>
+          </w:tcPr>
+          <w:p>
+            <w:r/>
+            <w:r>
+              <w:rPr>
+                <w:b/>
+                <w:sz w:val="18"/>
+              </w:rPr>
+              <w:t>ISO/IEC 27001:2022</w:t>
+            </w:r>
+          </w:p>
+        </w:tc>
+        <w:tc>
+          <w:tcPr>
+            <w:tcW w:type="dxa" w:w="7483"/>
+          </w:tcPr>
+          <w:p>
+            <w:r/>
+            <w:r>
+              <w:rPr>
+                <w:sz w:val="18"/>
+              </w:rPr>
+              <w:t>A.8.15, A.8.16</w:t>
+            </w:r>
+          </w:p>
+        </w:tc>
+      </w:tr>
+      <w:tr>
+        <w:tc>
+          <w:tcPr>
+            <w:tcW w:type="dxa" w:w="2154"/>
+            <w:shd w:val="clear" w:color="auto" w:fill="DCE6F0"/>
+          </w:tcPr>
+          <w:p>
+            <w:r/>
+            <w:r>
+              <w:rPr>
+                <w:b/>
+                <w:sz w:val="18"/>
+              </w:rPr>
+              <w:t>ISO/IEC 27034 (ASC)</w:t>
+            </w:r>
+          </w:p>
+        </w:tc>
+        <w:tc>
+          <w:tcPr>
+            <w:tcW w:type="dxa" w:w="7483"/>
+          </w:tcPr>
+          <w:p>
+            <w:r/>
+            <w:r>
+              <w:rPr>
+                <w:sz w:val="18"/>
+              </w:rPr>
+              <w:t>ASC-27, ASC-31</w:t>
+            </w:r>
+          </w:p>
+        </w:tc>
+      </w:tr>
+      <w:tr>
+        <w:tc>
+          <w:tcPr>
+            <w:tcW w:type="dxa" w:w="2154"/>
+            <w:shd w:val="clear" w:color="auto" w:fill="DCE6F0"/>
+          </w:tcPr>
+          <w:p>
+            <w:r/>
+            <w:r>
+              <w:rPr>
+                <w:b/>
+                <w:sz w:val="18"/>
+              </w:rPr>
+              <w:t>Estado</w:t>
+            </w:r>
+          </w:p>
+        </w:tc>
+        <w:tc>
+          <w:tcPr>
+            <w:tcW w:type="dxa" w:w="7483"/>
+          </w:tcPr>
+          <w:p>
+            <w:r/>
+            <w:r>
+              <w:rPr>
+                <w:sz w:val="18"/>
+              </w:rPr>
+              <w:t>Corregido – verificar en el nuevo despliegue</w:t>
+            </w:r>
+          </w:p>
+        </w:tc>
+      </w:tr>
+    </w:tbl>
+    <w:p/>
+    <w:p>
+      <w:pPr>
+        <w:spacing w:after="40"/>
+      </w:pPr>
+      <w:r>
+        <w:rPr>
+          <w:b/>
+          <w:color w:val="B02418"/>
+        </w:rPr>
+        <w:t>Evidencia (versión original — vulnerable)</w:t>
+      </w:r>
+    </w:p>
+    <w:tbl>
+      <w:tblPr>
+        <w:tblW w:type="auto" w:w="0"/>
+        <w:jc w:val="center"/>
+        <w:tblLook w:firstColumn="1" w:firstRow="1" w:lastColumn="0" w:lastRow="0" w:noHBand="0" w:noVBand="1" w:val="04A0"/>
+      </w:tblPr>
+      <w:tblGrid>
+        <w:gridCol w:w="9972"/>
+      </w:tblGrid>
+      <w:tr>
+        <w:tc>
+          <w:tcPr>
+            <w:tcW w:type="dxa" w:w="9972"/>
+            <w:shd w:val="clear" w:color="auto" w:fill="FBEAEA"/>
+          </w:tcPr>
+          <w:p>
+            <w:r>
+              <w:rPr>
+                <w:rFonts w:ascii="Consolas" w:hAnsi="Consolas" w:eastAsia="Consolas"/>
+                <w:sz w:val="16"/>
+              </w:rPr>
+              <w:t>responder_error(403, ...) sin ningún registro del evento</w:t>
+            </w:r>
+          </w:p>
+        </w:tc>
+      </w:tr>
+    </w:tbl>
+    <w:p/>
+    <w:p>
+      <w:pPr>
+        <w:spacing w:after="40"/>
+      </w:pPr>
+      <w:r>
+        <w:rPr>
+          <w:b/>
+          <w:color w:val="1F3A5F"/>
+        </w:rPr>
+        <w:t>Corrección</w:t>
+      </w:r>
+    </w:p>
+    <w:p>
+      <w:r>
+        <w:t xml:space="preserve">Commit Git: </w:t>
+      </w:r>
+      <w:hyperlink r:id="rId21">
+        <w:r>
+          <w:rPr>
+            <w:color w:val="0563C1"/>
+            <w:u w:val="single"/>
+          </w:rPr>
+          <w:t>e534271</w:t>
+        </w:r>
+      </w:hyperlink>
+      <w:r>
+        <w:t xml:space="preserve">  ·  </w:t>
+      </w:r>
+      <w:hyperlink r:id="rId23">
+        <w:r>
+          <w:rPr>
+            <w:color w:val="0563C1"/>
+            <w:u w:val="single"/>
+          </w:rPr>
+          <w:t>e3b4e54</w:t>
+        </w:r>
+      </w:hyperlink>
+      <w:r>
+        <w:t xml:space="preserve">   (rama mejoras)</w:t>
+      </w:r>
+    </w:p>
+    <w:p>
+      <w:pPr>
+        <w:spacing w:after="40"/>
+      </w:pPr>
+      <w:r>
+        <w:rPr>
+          <w:b/>
+          <w:color w:val="B02418"/>
+        </w:rPr>
+        <w:t>Código original</w:t>
+      </w:r>
+    </w:p>
+    <w:tbl>
+      <w:tblPr>
+        <w:tblW w:type="auto" w:w="0"/>
+        <w:jc w:val="center"/>
+        <w:tblLook w:firstColumn="1" w:firstRow="1" w:lastColumn="0" w:lastRow="0" w:noHBand="0" w:noVBand="1" w:val="04A0"/>
+      </w:tblPr>
+      <w:tblGrid>
+        <w:gridCol w:w="9972"/>
+      </w:tblGrid>
+      <w:tr>
+        <w:tc>
+          <w:tcPr>
+            <w:tcW w:type="dxa" w:w="9972"/>
+            <w:shd w:val="clear" w:color="auto" w:fill="FBEAEA"/>
+          </w:tcPr>
+          <w:p>
+            <w:r>
+              <w:rPr>
+                <w:rFonts w:ascii="Consolas" w:hAnsi="Consolas" w:eastAsia="Consolas"/>
+                <w:sz w:val="16"/>
+              </w:rPr>
+              <w:t>if (!hash_equals($_SESSION['csrf_token'], $enviado)) {</w:t>
+              <w:br/>
+            </w:r>
+            <w:r>
+              <w:rPr>
+                <w:rFonts w:ascii="Consolas" w:hAnsi="Consolas" w:eastAsia="Consolas"/>
+                <w:sz w:val="16"/>
+              </w:rPr>
+              <w:t xml:space="preserve">    responder_error(403, 'Solicitud rechazada: token CSRF inválido o ausente.');</w:t>
+              <w:br/>
+            </w:r>
+            <w:r>
+              <w:rPr>
+                <w:rFonts w:ascii="Consolas" w:hAnsi="Consolas" w:eastAsia="Consolas"/>
+                <w:sz w:val="16"/>
+              </w:rPr>
+              <w:t>}</w:t>
+            </w:r>
+          </w:p>
+        </w:tc>
+      </w:tr>
+    </w:tbl>
+    <w:p/>
+    <w:p>
+      <w:pPr>
+        <w:spacing w:after="40"/>
+      </w:pPr>
+      <w:r>
+        <w:rPr>
+          <w:b/>
+          <w:color w:val="1E6B34"/>
+        </w:rPr>
+        <w:t>Código nuevo</w:t>
+      </w:r>
+    </w:p>
+    <w:tbl>
+      <w:tblPr>
+        <w:tblW w:type="auto" w:w="0"/>
+        <w:jc w:val="center"/>
+        <w:tblLook w:firstColumn="1" w:firstRow="1" w:lastColumn="0" w:lastRow="0" w:noHBand="0" w:noVBand="1" w:val="04A0"/>
+      </w:tblPr>
+      <w:tblGrid>
+        <w:gridCol w:w="9972"/>
+      </w:tblGrid>
+      <w:tr>
+        <w:tc>
+          <w:tcPr>
+            <w:tcW w:type="dxa" w:w="9972"/>
+            <w:shd w:val="clear" w:color="auto" w:fill="EAF6EC"/>
+          </w:tcPr>
+          <w:p>
+            <w:r>
+              <w:rPr>
+                <w:rFonts w:ascii="Consolas" w:hAnsi="Consolas" w:eastAsia="Consolas"/>
+                <w:sz w:val="16"/>
+              </w:rPr>
+              <w:t>function registrar_evento($tipo, $detalle = '') {</w:t>
+              <w:br/>
+            </w:r>
+            <w:r>
+              <w:rPr>
+                <w:rFonts w:ascii="Consolas" w:hAnsi="Consolas" w:eastAsia="Consolas"/>
+                <w:sz w:val="16"/>
+              </w:rPr>
+              <w:t xml:space="preserve">    $limpio = preg_replace('/[\x00-\x1F\x7F]/', ' ', (string) $detalle);  // anti log injection</w:t>
+              <w:br/>
+            </w:r>
+            <w:r>
+              <w:rPr>
+                <w:rFonts w:ascii="Consolas" w:hAnsi="Consolas" w:eastAsia="Consolas"/>
+                <w:sz w:val="16"/>
+              </w:rPr>
+              <w:t xml:space="preserve">    error_log(sprintf('[pnkSecurity][seguridad] %s ip=%s ruta=%s %s', $tipo, $ip, $ruta,</w:t>
+              <w:br/>
+            </w:r>
+            <w:r>
+              <w:rPr>
+                <w:rFonts w:ascii="Consolas" w:hAnsi="Consolas" w:eastAsia="Consolas"/>
+                <w:sz w:val="16"/>
+              </w:rPr>
+              <w:t xml:space="preserve">                      mb_substr($limpio, 0, 200)));</w:t>
+              <w:br/>
+            </w:r>
+            <w:r>
+              <w:rPr>
+                <w:rFonts w:ascii="Consolas" w:hAnsi="Consolas" w:eastAsia="Consolas"/>
+                <w:sz w:val="16"/>
+              </w:rPr>
+              <w:t>}</w:t>
+              <w:br/>
+            </w:r>
+            <w:r>
+              <w:rPr>
+                <w:rFonts w:ascii="Consolas" w:hAnsi="Consolas" w:eastAsia="Consolas"/>
+                <w:sz w:val="16"/>
+              </w:rPr>
+              <w:t>registrar_evento('csrf_rechazado');      registrar_evento('login_fallido', ...);</w:t>
+              <w:br/>
+            </w:r>
+            <w:r>
+              <w:rPr>
+                <w:rFonts w:ascii="Consolas" w:hAnsi="Consolas" w:eastAsia="Consolas"/>
+                <w:sz w:val="16"/>
+              </w:rPr>
+              <w:t>registrar_evento('login_bloqueado', ...); registrar_evento('acceso_denegado', ...);</w:t>
+            </w:r>
+          </w:p>
+        </w:tc>
+      </w:tr>
+    </w:tbl>
+    <w:p/>
+    <w:p>
+      <w:pPr>
+        <w:spacing w:after="40"/>
+      </w:pPr>
+      <w:r>
+        <w:rPr>
+          <w:b/>
+          <w:color w:val="1E6B34"/>
+        </w:rPr>
+        <w:t>Evidencia sin vulnerabilidad (versión corregida)</w:t>
+      </w:r>
+    </w:p>
+    <w:tbl>
+      <w:tblPr>
+        <w:tblW w:type="auto" w:w="0"/>
+        <w:jc w:val="center"/>
+        <w:tblLook w:firstColumn="1" w:firstRow="1" w:lastColumn="0" w:lastRow="0" w:noHBand="0" w:noVBand="1" w:val="04A0"/>
+      </w:tblPr>
+      <w:tblGrid>
+        <w:gridCol w:w="9972"/>
+      </w:tblGrid>
+      <w:tr>
+        <w:tc>
+          <w:tcPr>
+            <w:tcW w:type="dxa" w:w="9972"/>
+            <w:shd w:val="clear" w:color="auto" w:fill="EAF6EC"/>
+          </w:tcPr>
+          <w:p>
+            <w:r>
+              <w:rPr>
+                <w:rFonts w:ascii="Consolas" w:hAnsi="Consolas" w:eastAsia="Consolas"/>
+                <w:sz w:val="16"/>
+              </w:rPr>
+              <w:t>En la instancia: grep '\[seguridad\]' /var/log/apache2/pnk_error.log muestra los eventos generados por test_seguridad.py (sin contraseñas ni tokens).</w:t>
+            </w:r>
+          </w:p>
+        </w:tc>
+      </w:tr>
+    </w:tbl>
+    <w:p>
+      <w:pPr>
+        <w:pStyle w:val="Heading2"/>
+        <w:pageBreakBefore/>
+      </w:pPr>
+      <w:r>
+        <w:t>VUL-033 → Aplicación publicada por HTTP plano si falla el certificado TLS</w:t>
+      </w:r>
+    </w:p>
+    <w:tbl>
+      <w:tblPr>
+        <w:tblStyle w:val="TableGrid"/>
+        <w:tblW w:type="auto" w:w="0"/>
+        <w:tblLook w:firstColumn="1" w:firstRow="1" w:lastColumn="0" w:lastRow="0" w:noHBand="0" w:noVBand="1" w:val="04A0"/>
+      </w:tblPr>
+      <w:tblGrid>
+        <w:gridCol w:w="4986"/>
+        <w:gridCol w:w="4986"/>
+      </w:tblGrid>
+      <w:tr>
+        <w:tc>
+          <w:tcPr>
+            <w:tcW w:type="dxa" w:w="2154"/>
+            <w:shd w:val="clear" w:color="auto" w:fill="DCE6F0"/>
+          </w:tcPr>
+          <w:p>
+            <w:r/>
+            <w:r>
+              <w:rPr>
+                <w:b/>
+                <w:sz w:val="18"/>
+              </w:rPr>
+              <w:t>Vulnerabilidad</w:t>
+            </w:r>
+          </w:p>
+        </w:tc>
+        <w:tc>
+          <w:tcPr>
+            <w:tcW w:type="dxa" w:w="7483"/>
+          </w:tcPr>
+          <w:p>
+            <w:r/>
+            <w:r>
+              <w:rPr>
+                <w:sz w:val="18"/>
+              </w:rPr>
+              <w:t>Aplicación publicada por HTTP plano si falla el certificado TLS</w:t>
+            </w:r>
+          </w:p>
+        </w:tc>
+      </w:tr>
+      <w:tr>
+        <w:tc>
+          <w:tcPr>
+            <w:tcW w:type="dxa" w:w="2154"/>
+            <w:shd w:val="clear" w:color="auto" w:fill="DCE6F0"/>
+          </w:tcPr>
+          <w:p>
+            <w:r/>
+            <w:r>
+              <w:rPr>
+                <w:b/>
+                <w:sz w:val="18"/>
+              </w:rPr>
+              <w:t>Severidad</w:t>
+            </w:r>
+          </w:p>
+        </w:tc>
+        <w:tc>
+          <w:tcPr>
+            <w:tcW w:type="dxa" w:w="7483"/>
+            <w:shd w:val="clear" w:color="auto" w:fill="E67E22"/>
+          </w:tcPr>
+          <w:p>
+            <w:r/>
+            <w:r>
+              <w:rPr>
+                <w:b/>
+                <w:color w:val="FFFFFF"/>
+                <w:sz w:val="18"/>
+              </w:rPr>
+              <w:t>Media</w:t>
+            </w:r>
+          </w:p>
+        </w:tc>
+      </w:tr>
+      <w:tr>
+        <w:tc>
+          <w:tcPr>
+            <w:tcW w:type="dxa" w:w="2154"/>
+            <w:shd w:val="clear" w:color="auto" w:fill="DCE6F0"/>
+          </w:tcPr>
+          <w:p>
+            <w:r/>
+            <w:r>
+              <w:rPr>
+                <w:b/>
+                <w:sz w:val="18"/>
+              </w:rPr>
+              <w:t>OWASP Top 10</w:t>
+            </w:r>
+          </w:p>
+        </w:tc>
+        <w:tc>
+          <w:tcPr>
+            <w:tcW w:type="dxa" w:w="7483"/>
+          </w:tcPr>
+          <w:p>
+            <w:r/>
+            <w:r>
+              <w:rPr>
+                <w:sz w:val="18"/>
+              </w:rPr>
+              <w:t>A02:2021 – Cryptographic Failures</w:t>
+            </w:r>
+          </w:p>
+        </w:tc>
+      </w:tr>
+      <w:tr>
+        <w:tc>
+          <w:tcPr>
+            <w:tcW w:type="dxa" w:w="2154"/>
+            <w:shd w:val="clear" w:color="auto" w:fill="DCE6F0"/>
+          </w:tcPr>
+          <w:p>
+            <w:r/>
+            <w:r>
+              <w:rPr>
+                <w:b/>
+                <w:sz w:val="18"/>
+              </w:rPr>
+              <w:t>OWASP ASVS v5.0.0</w:t>
+            </w:r>
+          </w:p>
+        </w:tc>
+        <w:tc>
+          <w:tcPr>
+            <w:tcW w:type="dxa" w:w="7483"/>
+          </w:tcPr>
+          <w:p>
+            <w:r/>
+            <w:r>
+              <w:rPr>
+                <w:sz w:val="18"/>
+              </w:rPr>
+              <w:t>V12 Secure Communication</w:t>
+            </w:r>
+          </w:p>
+        </w:tc>
+      </w:tr>
+      <w:tr>
+        <w:tc>
+          <w:tcPr>
+            <w:tcW w:type="dxa" w:w="2154"/>
+            <w:shd w:val="clear" w:color="auto" w:fill="DCE6F0"/>
+          </w:tcPr>
+          <w:p>
+            <w:r/>
+            <w:r>
+              <w:rPr>
+                <w:b/>
+                <w:sz w:val="18"/>
+              </w:rPr>
+              <w:t>Descripción</w:t>
+            </w:r>
+          </w:p>
+        </w:tc>
+        <w:tc>
+          <w:tcPr>
+            <w:tcW w:type="dxa" w:w="7483"/>
+          </w:tcPr>
+          <w:p>
+            <w:r/>
+            <w:r>
+              <w:rPr>
+                <w:sz w:val="18"/>
+              </w:rPr>
+              <w:t>Si Let's Encrypt fallaba, user-data.sh solo mostraba un aviso y la aplicación quedaba en http:// con el formulario de login: las contraseñas viajarían sin cifrar.</w:t>
+            </w:r>
+          </w:p>
+        </w:tc>
+      </w:tr>
+      <w:tr>
+        <w:tc>
+          <w:tcPr>
+            <w:tcW w:type="dxa" w:w="2154"/>
+            <w:shd w:val="clear" w:color="auto" w:fill="DCE6F0"/>
+          </w:tcPr>
+          <w:p>
+            <w:r/>
+            <w:r>
+              <w:rPr>
+                <w:b/>
+                <w:sz w:val="18"/>
+              </w:rPr>
+              <w:t>URL</w:t>
+            </w:r>
+          </w:p>
+        </w:tc>
+        <w:tc>
+          <w:tcPr>
+            <w:tcW w:type="dxa" w:w="7483"/>
+          </w:tcPr>
+          <w:p>
+            <w:r/>
+            <w:r>
+              <w:rPr>
+                <w:sz w:val="18"/>
+              </w:rPr>
+              <w:t>http://&lt;ip-aws&gt;.sslip.io/index.php?id=1 (cuando certbot falla)</w:t>
+            </w:r>
+          </w:p>
+        </w:tc>
+      </w:tr>
+      <w:tr>
+        <w:tc>
+          <w:tcPr>
+            <w:tcW w:type="dxa" w:w="2154"/>
+            <w:shd w:val="clear" w:color="auto" w:fill="DCE6F0"/>
+          </w:tcPr>
+          <w:p>
+            <w:r/>
+            <w:r>
+              <w:rPr>
+                <w:b/>
+                <w:sz w:val="18"/>
+              </w:rPr>
+              <w:t>Archivo(s)</w:t>
+            </w:r>
+          </w:p>
+        </w:tc>
+        <w:tc>
+          <w:tcPr>
+            <w:tcW w:type="dxa" w:w="7483"/>
+          </w:tcPr>
+          <w:p>
+            <w:r/>
+            <w:r>
+              <w:rPr>
+                <w:sz w:val="18"/>
+              </w:rPr>
+              <w:t>deploy/user-data.sh</w:t>
+            </w:r>
+          </w:p>
+        </w:tc>
+      </w:tr>
+      <w:tr>
+        <w:tc>
+          <w:tcPr>
+            <w:tcW w:type="dxa" w:w="2154"/>
+            <w:shd w:val="clear" w:color="auto" w:fill="DCE6F0"/>
+          </w:tcPr>
+          <w:p>
+            <w:r/>
+            <w:r>
+              <w:rPr>
+                <w:b/>
+                <w:sz w:val="18"/>
+              </w:rPr>
+              <w:t>ISO/IEC 27001:2022</w:t>
+            </w:r>
+          </w:p>
+        </w:tc>
+        <w:tc>
+          <w:tcPr>
+            <w:tcW w:type="dxa" w:w="7483"/>
+          </w:tcPr>
+          <w:p>
+            <w:r/>
+            <w:r>
+              <w:rPr>
+                <w:sz w:val="18"/>
+              </w:rPr>
+              <w:t>A.8.20, A.8.24</w:t>
+            </w:r>
+          </w:p>
+        </w:tc>
+      </w:tr>
+      <w:tr>
+        <w:tc>
+          <w:tcPr>
+            <w:tcW w:type="dxa" w:w="2154"/>
+            <w:shd w:val="clear" w:color="auto" w:fill="DCE6F0"/>
+          </w:tcPr>
+          <w:p>
+            <w:r/>
+            <w:r>
+              <w:rPr>
+                <w:b/>
+                <w:sz w:val="18"/>
+              </w:rPr>
+              <w:t>ISO/IEC 27034 (ASC)</w:t>
+            </w:r>
+          </w:p>
+        </w:tc>
+        <w:tc>
+          <w:tcPr>
+            <w:tcW w:type="dxa" w:w="7483"/>
+          </w:tcPr>
+          <w:p>
+            <w:r/>
+            <w:r>
+              <w:rPr>
+                <w:sz w:val="18"/>
+              </w:rPr>
+              <w:t>ASC-06, ASC-12</w:t>
+            </w:r>
+          </w:p>
+        </w:tc>
+      </w:tr>
+      <w:tr>
+        <w:tc>
+          <w:tcPr>
+            <w:tcW w:type="dxa" w:w="2154"/>
+            <w:shd w:val="clear" w:color="auto" w:fill="DCE6F0"/>
+          </w:tcPr>
+          <w:p>
+            <w:r/>
+            <w:r>
+              <w:rPr>
+                <w:b/>
+                <w:sz w:val="18"/>
+              </w:rPr>
+              <w:t>Estado</w:t>
+            </w:r>
+          </w:p>
+        </w:tc>
+        <w:tc>
+          <w:tcPr>
+            <w:tcW w:type="dxa" w:w="7483"/>
+          </w:tcPr>
+          <w:p>
+            <w:r/>
+            <w:r>
+              <w:rPr>
+                <w:sz w:val="18"/>
+              </w:rPr>
+              <w:t>Corregido – verificar en el nuevo despliegue</w:t>
+            </w:r>
+          </w:p>
+        </w:tc>
+      </w:tr>
+    </w:tbl>
+    <w:p/>
+    <w:p>
+      <w:pPr>
+        <w:spacing w:after="40"/>
+      </w:pPr>
+      <w:r>
+        <w:rPr>
+          <w:b/>
+          <w:color w:val="B02418"/>
+        </w:rPr>
+        <w:t>Evidencia (versión original — vulnerable)</w:t>
+      </w:r>
+    </w:p>
+    <w:tbl>
+      <w:tblPr>
+        <w:tblW w:type="auto" w:w="0"/>
+        <w:jc w:val="center"/>
+        <w:tblLook w:firstColumn="1" w:firstRow="1" w:lastColumn="0" w:lastRow="0" w:noHBand="0" w:noVBand="1" w:val="04A0"/>
+      </w:tblPr>
+      <w:tblGrid>
+        <w:gridCol w:w="9972"/>
+      </w:tblGrid>
+      <w:tr>
+        <w:tc>
+          <w:tcPr>
+            <w:tcW w:type="dxa" w:w="9972"/>
+            <w:shd w:val="clear" w:color="auto" w:fill="FBEAEA"/>
+          </w:tcPr>
+          <w:p>
+            <w:r>
+              <w:rPr>
+                <w:rFonts w:ascii="Consolas" w:hAnsi="Consolas" w:eastAsia="Consolas"/>
+                <w:sz w:val="16"/>
+              </w:rPr>
+              <w:t>certbot ... || echo "AVISO: no se pudo emitir el certificado; el sitio queda solo en HTTP"</w:t>
+            </w:r>
+          </w:p>
+        </w:tc>
+      </w:tr>
+    </w:tbl>
+    <w:p/>
+    <w:p>
+      <w:pPr>
+        <w:spacing w:after="40"/>
+      </w:pPr>
+      <w:r>
+        <w:rPr>
+          <w:b/>
+          <w:color w:val="1F3A5F"/>
+        </w:rPr>
+        <w:t>Corrección</w:t>
+      </w:r>
+    </w:p>
+    <w:p>
+      <w:r>
+        <w:t xml:space="preserve">Commit Git: </w:t>
+      </w:r>
+      <w:hyperlink r:id="rId20">
+        <w:r>
+          <w:rPr>
+            <w:color w:val="0563C1"/>
+            <w:u w:val="single"/>
+          </w:rPr>
+          <w:t>c617a06</w:t>
+        </w:r>
+      </w:hyperlink>
+      <w:r>
+        <w:t xml:space="preserve">   (rama mejoras)</w:t>
+      </w:r>
+    </w:p>
+    <w:p>
+      <w:pPr>
+        <w:spacing w:after="40"/>
+      </w:pPr>
+      <w:r>
+        <w:rPr>
+          <w:b/>
+          <w:color w:val="B02418"/>
+        </w:rPr>
+        <w:t>Código original</w:t>
+      </w:r>
+    </w:p>
+    <w:tbl>
+      <w:tblPr>
+        <w:tblW w:type="auto" w:w="0"/>
+        <w:jc w:val="center"/>
+        <w:tblLook w:firstColumn="1" w:firstRow="1" w:lastColumn="0" w:lastRow="0" w:noHBand="0" w:noVBand="1" w:val="04A0"/>
+      </w:tblPr>
+      <w:tblGrid>
+        <w:gridCol w:w="9972"/>
+      </w:tblGrid>
+      <w:tr>
+        <w:tc>
+          <w:tcPr>
+            <w:tcW w:type="dxa" w:w="9972"/>
+            <w:shd w:val="clear" w:color="auto" w:fill="FBEAEA"/>
+          </w:tcPr>
+          <w:p>
+            <w:r>
+              <w:rPr>
+                <w:rFonts w:ascii="Consolas" w:hAnsi="Consolas" w:eastAsia="Consolas"/>
+                <w:sz w:val="16"/>
+              </w:rPr>
+              <w:t>certbot --apache -d "$DOMINIO" --non-interactive --agree-tos \</w:t>
+              <w:br/>
+            </w:r>
+            <w:r>
+              <w:rPr>
+                <w:rFonts w:ascii="Consolas" w:hAnsi="Consolas" w:eastAsia="Consolas"/>
+                <w:sz w:val="16"/>
+              </w:rPr>
+              <w:t xml:space="preserve">        --register-unsafely-without-email --redirect \</w:t>
+              <w:br/>
+            </w:r>
+            <w:r>
+              <w:rPr>
+                <w:rFonts w:ascii="Consolas" w:hAnsi="Consolas" w:eastAsia="Consolas"/>
+                <w:sz w:val="16"/>
+              </w:rPr>
+              <w:t xml:space="preserve">    || echo "AVISO: no se pudo emitir el certificado; el sitio queda solo en HTTP"</w:t>
+            </w:r>
+          </w:p>
+        </w:tc>
+      </w:tr>
+    </w:tbl>
+    <w:p/>
+    <w:p>
+      <w:pPr>
+        <w:spacing w:after="40"/>
+      </w:pPr>
+      <w:r>
+        <w:rPr>
+          <w:b/>
+          <w:color w:val="1E6B34"/>
+        </w:rPr>
+        <w:t>Código nuevo</w:t>
+      </w:r>
+    </w:p>
+    <w:tbl>
+      <w:tblPr>
+        <w:tblW w:type="auto" w:w="0"/>
+        <w:jc w:val="center"/>
+        <w:tblLook w:firstColumn="1" w:firstRow="1" w:lastColumn="0" w:lastRow="0" w:noHBand="0" w:noVBand="1" w:val="04A0"/>
+      </w:tblPr>
+      <w:tblGrid>
+        <w:gridCol w:w="9972"/>
+      </w:tblGrid>
+      <w:tr>
+        <w:tc>
+          <w:tcPr>
+            <w:tcW w:type="dxa" w:w="9972"/>
+            <w:shd w:val="clear" w:color="auto" w:fill="EAF6EC"/>
+          </w:tcPr>
+          <w:p>
+            <w:r>
+              <w:rPr>
+                <w:rFonts w:ascii="Consolas" w:hAnsi="Consolas" w:eastAsia="Consolas"/>
+                <w:sz w:val="16"/>
+              </w:rPr>
+              <w:t>for intento in 1 2 3; do</w:t>
+              <w:br/>
+            </w:r>
+            <w:r>
+              <w:rPr>
+                <w:rFonts w:ascii="Consolas" w:hAnsi="Consolas" w:eastAsia="Consolas"/>
+                <w:sz w:val="16"/>
+              </w:rPr>
+              <w:t xml:space="preserve">    if certbot --apache -d "$DOMINIO" ... --redirect; then CERT_OK=1; break; fi</w:t>
+              <w:br/>
+            </w:r>
+            <w:r>
+              <w:rPr>
+                <w:rFonts w:ascii="Consolas" w:hAnsi="Consolas" w:eastAsia="Consolas"/>
+                <w:sz w:val="16"/>
+              </w:rPr>
+              <w:t xml:space="preserve">    sleep 60</w:t>
+              <w:br/>
+            </w:r>
+            <w:r>
+              <w:rPr>
+                <w:rFonts w:ascii="Consolas" w:hAnsi="Consolas" w:eastAsia="Consolas"/>
+                <w:sz w:val="16"/>
+              </w:rPr>
+              <w:t>done</w:t>
+              <w:br/>
+            </w:r>
+            <w:r>
+              <w:rPr>
+                <w:rFonts w:ascii="Consolas" w:hAnsi="Consolas" w:eastAsia="Consolas"/>
+                <w:sz w:val="16"/>
+              </w:rPr>
+              <w:t>if [ "$CERT_OK" != "1" ]; then     # fail-closed: nunca login por HTTP</w:t>
+              <w:br/>
+            </w:r>
+            <w:r>
+              <w:rPr>
+                <w:rFonts w:ascii="Consolas" w:hAnsi="Consolas" w:eastAsia="Consolas"/>
+                <w:sz w:val="16"/>
+              </w:rPr>
+              <w:t xml:space="preserve">    &lt;VirtualHost *:80&gt; RedirectMatch 503 ^/ &lt;/VirtualHost&gt;</w:t>
+              <w:br/>
+            </w:r>
+            <w:r>
+              <w:rPr>
+                <w:rFonts w:ascii="Consolas" w:hAnsi="Consolas" w:eastAsia="Consolas"/>
+                <w:sz w:val="16"/>
+              </w:rPr>
+              <w:t>fi</w:t>
+              <w:br/>
+            </w:r>
+            <w:r>
+              <w:rPr>
+                <w:rFonts w:ascii="Consolas" w:hAnsi="Consolas" w:eastAsia="Consolas"/>
+                <w:sz w:val="16"/>
+              </w:rPr>
+              <w:t># + FilesMatch deniega también .map .json .txt .sh .py config.*.php</w:t>
+            </w:r>
+          </w:p>
+        </w:tc>
+      </w:tr>
+    </w:tbl>
+    <w:p/>
+    <w:p>
+      <w:pPr>
+        <w:spacing w:after="40"/>
+      </w:pPr>
+      <w:r>
+        <w:rPr>
+          <w:b/>
+          <w:color w:val="1E6B34"/>
+        </w:rPr>
+        <w:t>Evidencia sin vulnerabilidad (versión corregida)</w:t>
+      </w:r>
+    </w:p>
+    <w:tbl>
+      <w:tblPr>
+        <w:tblW w:type="auto" w:w="0"/>
+        <w:jc w:val="center"/>
+        <w:tblLook w:firstColumn="1" w:firstRow="1" w:lastColumn="0" w:lastRow="0" w:noHBand="0" w:noVBand="1" w:val="04A0"/>
+      </w:tblPr>
+      <w:tblGrid>
+        <w:gridCol w:w="9972"/>
+      </w:tblGrid>
+      <w:tr>
+        <w:tc>
+          <w:tcPr>
+            <w:tcW w:type="dxa" w:w="9972"/>
+            <w:shd w:val="clear" w:color="auto" w:fill="EAF6EC"/>
+          </w:tcPr>
+          <w:p>
+            <w:r>
+              <w:rPr>
+                <w:rFonts w:ascii="Consolas" w:hAnsi="Consolas" w:eastAsia="Consolas"/>
+                <w:sz w:val="16"/>
+              </w:rPr>
+              <w:t>Con certificado: http:// redirige 301 a https://. Sin certificado: HTTP 503, la aplicación nunca se sirve sin cifrar.</w:t>
             </w:r>
           </w:p>
         </w:tc>
@@ -19597,6 +23833,77 @@
       </w:tr>
     </w:tbl>
     <w:p/>
+    <w:p>
+      <w:pPr>
+        <w:spacing w:after="40"/>
+      </w:pPr>
+      <w:r>
+        <w:rPr>
+          <w:b/>
+          <w:color w:val="1E6B34"/>
+        </w:rPr>
+        <w:t>Análisis estático (SAST) de la versión corregida</w:t>
+      </w:r>
+    </w:p>
+    <w:tbl>
+      <w:tblPr>
+        <w:tblW w:type="auto" w:w="0"/>
+        <w:jc w:val="center"/>
+        <w:tblLook w:firstColumn="1" w:firstRow="1" w:lastColumn="0" w:lastRow="0" w:noHBand="0" w:noVBand="1" w:val="04A0"/>
+      </w:tblPr>
+      <w:tblGrid>
+        <w:gridCol w:w="9972"/>
+      </w:tblGrid>
+      <w:tr>
+        <w:tc>
+          <w:tcPr>
+            <w:tcW w:type="dxa" w:w="9972"/>
+            <w:shd w:val="clear" w:color="auto" w:fill="EAF6EC"/>
+          </w:tcPr>
+          <w:p>
+            <w:r>
+              <w:rPr>
+                <w:rFonts w:ascii="Consolas" w:hAnsi="Consolas" w:eastAsia="Consolas"/>
+                <w:sz w:val="16"/>
+              </w:rPr>
+              <w:t>semgrep scan --config p/php --config p/owasp-top-ten src/pnkSecurity</w:t>
+              <w:br/>
+            </w:r>
+            <w:r>
+              <w:rPr>
+                <w:rFonts w:ascii="Consolas" w:hAnsi="Consolas" w:eastAsia="Consolas"/>
+                <w:sz w:val="16"/>
+              </w:rPr>
+              <w:t>Ran 94 rules on 19 files: 0 findings.        (17/10/2026, rama mejoras)</w:t>
+              <w:br/>
+            </w:r>
+            <w:r>
+              <w:rPr>
+                <w:rFonts w:ascii="Consolas" w:hAnsi="Consolas" w:eastAsia="Consolas"/>
+                <w:sz w:val="16"/>
+              </w:rPr>
+              <w:br/>
+            </w:r>
+            <w:r>
+              <w:rPr>
+                <w:rFonts w:ascii="Consolas" w:hAnsi="Consolas" w:eastAsia="Consolas"/>
+                <w:sz w:val="16"/>
+              </w:rPr>
+              <w:t>GitHub Actions (.github/workflows/seguridad.yml) repite en cada push:</w:t>
+              <w:br/>
+            </w:r>
+            <w:r>
+              <w:rPr>
+                <w:rFonts w:ascii="Consolas" w:hAnsi="Consolas" w:eastAsia="Consolas"/>
+                <w:sz w:val="16"/>
+              </w:rPr>
+              <w:t xml:space="preserve">  php -l (sintaxis) · Semgrep (SAST) · Gitleaks (secretos en el repositorio)</w:t>
+            </w:r>
+          </w:p>
+        </w:tc>
+      </w:tr>
+    </w:tbl>
+    <w:p/>
     <w:tbl>
       <w:tblPr>
         <w:tblStyle w:val="TableGrid"/>
@@ -20449,6 +24756,314 @@
                 <w:sz w:val="17"/>
               </w:rPr>
               <w:t>5 guardados, 6º rechazado</w:t>
+            </w:r>
+          </w:p>
+        </w:tc>
+      </w:tr>
+      <w:tr>
+        <w:tc>
+          <w:tcPr>
+            <w:tcW w:type="dxa" w:w="3685"/>
+          </w:tcPr>
+          <w:p>
+            <w:r/>
+            <w:r>
+              <w:rPr>
+                <w:sz w:val="17"/>
+              </w:rPr>
+              <w:t>VUL-027 :8080 tras el testing</w:t>
+            </w:r>
+          </w:p>
+        </w:tc>
+        <w:tc>
+          <w:tcPr>
+            <w:tcW w:type="dxa" w:w="2551"/>
+          </w:tcPr>
+          <w:p>
+            <w:r/>
+            <w:r>
+              <w:rPr>
+                <w:sz w:val="17"/>
+              </w:rPr>
+              <w:t>Publicado</w:t>
+            </w:r>
+          </w:p>
+        </w:tc>
+        <w:tc>
+          <w:tcPr>
+            <w:tcW w:type="dxa" w:w="3402"/>
+          </w:tcPr>
+          <w:p>
+            <w:r/>
+            <w:r>
+              <w:rPr>
+                <w:sz w:val="17"/>
+              </w:rPr>
+              <w:t>Cerrado en el Security Group</w:t>
+            </w:r>
+          </w:p>
+        </w:tc>
+      </w:tr>
+      <w:tr>
+        <w:tc>
+          <w:tcPr>
+            <w:tcW w:type="dxa" w:w="3685"/>
+          </w:tcPr>
+          <w:p>
+            <w:r/>
+            <w:r>
+              <w:rPr>
+                <w:sz w:val="17"/>
+              </w:rPr>
+              <w:t>VUL-028 X-Forwarded-Proto falso</w:t>
+            </w:r>
+          </w:p>
+        </w:tc>
+        <w:tc>
+          <w:tcPr>
+            <w:tcW w:type="dxa" w:w="2551"/>
+          </w:tcPr>
+          <w:p>
+            <w:r/>
+            <w:r>
+              <w:rPr>
+                <w:sz w:val="17"/>
+              </w:rPr>
+              <w:t>HSTS/Secure sobre HTTP</w:t>
+            </w:r>
+          </w:p>
+        </w:tc>
+        <w:tc>
+          <w:tcPr>
+            <w:tcW w:type="dxa" w:w="3402"/>
+          </w:tcPr>
+          <w:p>
+            <w:r/>
+            <w:r>
+              <w:rPr>
+                <w:sz w:val="17"/>
+              </w:rPr>
+              <w:t>Cabecera ignorada</w:t>
+            </w:r>
+          </w:p>
+        </w:tc>
+      </w:tr>
+      <w:tr>
+        <w:tc>
+          <w:tcPr>
+            <w:tcW w:type="dxa" w:w="3685"/>
+          </w:tcPr>
+          <w:p>
+            <w:r/>
+            <w:r>
+              <w:rPr>
+                <w:sz w:val="17"/>
+              </w:rPr>
+              <w:t>VUL-029 CSP</w:t>
+            </w:r>
+          </w:p>
+        </w:tc>
+        <w:tc>
+          <w:tcPr>
+            <w:tcW w:type="dxa" w:w="2551"/>
+          </w:tcPr>
+          <w:p>
+            <w:r/>
+            <w:r>
+              <w:rPr>
+                <w:sz w:val="17"/>
+              </w:rPr>
+              <w:t>style-src 'unsafe-inline'</w:t>
+            </w:r>
+          </w:p>
+        </w:tc>
+        <w:tc>
+          <w:tcPr>
+            <w:tcW w:type="dxa" w:w="3402"/>
+          </w:tcPr>
+          <w:p>
+            <w:r/>
+            <w:r>
+              <w:rPr>
+                <w:sz w:val="17"/>
+              </w:rPr>
+              <w:t>Sin 'unsafe-inline' + COOP/CORP</w:t>
+            </w:r>
+          </w:p>
+        </w:tc>
+      </w:tr>
+      <w:tr>
+        <w:tc>
+          <w:tcPr>
+            <w:tcW w:type="dxa" w:w="3685"/>
+          </w:tcPr>
+          <w:p>
+            <w:r/>
+            <w:r>
+              <w:rPr>
+                <w:sz w:val="17"/>
+              </w:rPr>
+              <w:t>VUL-030 Librerías viejas publicadas</w:t>
+            </w:r>
+          </w:p>
+        </w:tc>
+        <w:tc>
+          <w:tcPr>
+            <w:tcW w:type="dxa" w:w="2551"/>
+          </w:tcPr>
+          <w:p>
+            <w:r/>
+            <w:r>
+              <w:rPr>
+                <w:sz w:val="17"/>
+              </w:rPr>
+              <w:t>HTTP 200</w:t>
+            </w:r>
+          </w:p>
+        </w:tc>
+        <w:tc>
+          <w:tcPr>
+            <w:tcW w:type="dxa" w:w="3402"/>
+          </w:tcPr>
+          <w:p>
+            <w:r/>
+            <w:r>
+              <w:rPr>
+                <w:sz w:val="17"/>
+              </w:rPr>
+              <w:t>HTTP 404</w:t>
+            </w:r>
+          </w:p>
+        </w:tc>
+      </w:tr>
+      <w:tr>
+        <w:tc>
+          <w:tcPr>
+            <w:tcW w:type="dxa" w:w="3685"/>
+          </w:tcPr>
+          <w:p>
+            <w:r/>
+            <w:r>
+              <w:rPr>
+                <w:sz w:val="17"/>
+              </w:rPr>
+              <w:t>VUL-031 Fuerza bruta distribuida</w:t>
+            </w:r>
+          </w:p>
+        </w:tc>
+        <w:tc>
+          <w:tcPr>
+            <w:tcW w:type="dxa" w:w="2551"/>
+          </w:tcPr>
+          <w:p>
+            <w:r/>
+            <w:r>
+              <w:rPr>
+                <w:sz w:val="17"/>
+              </w:rPr>
+              <w:t>Sin tope por cuenta</w:t>
+            </w:r>
+          </w:p>
+        </w:tc>
+        <w:tc>
+          <w:tcPr>
+            <w:tcW w:type="dxa" w:w="3402"/>
+          </w:tcPr>
+          <w:p>
+            <w:r/>
+            <w:r>
+              <w:rPr>
+                <w:sz w:val="17"/>
+              </w:rPr>
+              <w:t>30 por cuenta / 15 min</w:t>
+            </w:r>
+          </w:p>
+        </w:tc>
+      </w:tr>
+      <w:tr>
+        <w:tc>
+          <w:tcPr>
+            <w:tcW w:type="dxa" w:w="3685"/>
+          </w:tcPr>
+          <w:p>
+            <w:r/>
+            <w:r>
+              <w:rPr>
+                <w:sz w:val="17"/>
+              </w:rPr>
+              <w:t>VUL-032 Eventos de seguridad</w:t>
+            </w:r>
+          </w:p>
+        </w:tc>
+        <w:tc>
+          <w:tcPr>
+            <w:tcW w:type="dxa" w:w="2551"/>
+          </w:tcPr>
+          <w:p>
+            <w:r/>
+            <w:r>
+              <w:rPr>
+                <w:sz w:val="17"/>
+              </w:rPr>
+              <w:t>Sin registro</w:t>
+            </w:r>
+          </w:p>
+        </w:tc>
+        <w:tc>
+          <w:tcPr>
+            <w:tcW w:type="dxa" w:w="3402"/>
+          </w:tcPr>
+          <w:p>
+            <w:r/>
+            <w:r>
+              <w:rPr>
+                <w:sz w:val="17"/>
+              </w:rPr>
+              <w:t>[seguridad] en el log</w:t>
+            </w:r>
+          </w:p>
+        </w:tc>
+      </w:tr>
+      <w:tr>
+        <w:tc>
+          <w:tcPr>
+            <w:tcW w:type="dxa" w:w="3685"/>
+          </w:tcPr>
+          <w:p>
+            <w:r/>
+            <w:r>
+              <w:rPr>
+                <w:sz w:val="17"/>
+              </w:rPr>
+              <w:t>VUL-033 Falla de certificado</w:t>
+            </w:r>
+          </w:p>
+        </w:tc>
+        <w:tc>
+          <w:tcPr>
+            <w:tcW w:type="dxa" w:w="2551"/>
+          </w:tcPr>
+          <w:p>
+            <w:r/>
+            <w:r>
+              <w:rPr>
+                <w:sz w:val="17"/>
+              </w:rPr>
+              <w:t>Login por HTTP</w:t>
+            </w:r>
+          </w:p>
+        </w:tc>
+        <w:tc>
+          <w:tcPr>
+            <w:tcW w:type="dxa" w:w="3402"/>
+          </w:tcPr>
+          <w:p>
+            <w:r/>
+            <w:r>
+              <w:rPr>
+                <w:sz w:val="17"/>
+              </w:rPr>
+              <w:t>HTTP 503 (fail-closed)</w:t>
             </w:r>
           </w:p>
         </w:tc>
@@ -20945,7 +25560,23 @@
         <w:pStyle w:val="ListBullet"/>
       </w:pPr>
       <w:r>
-        <w:t>Pendiente: definir retención de login_intentos (las IP son dato personal) y de comentarios, y usar solo datos ficticios en los ambientes de prueba.</w:t>
+        <w:t>Retención: los intentos de login (IP y correo) se eliminan a las 24 horas (VUL-031); solo se muestran los 50 comentarios más recientes.</w:t>
+      </w:r>
+    </w:p>
+    <w:p>
+      <w:pPr>
+        <w:pStyle w:val="ListBullet"/>
+      </w:pPr>
+      <w:r>
+        <w:t>Datos de prueba: el despliegue usa solo los datos ficticios del script SQL y genera claves aleatorias para las cuentas de prueba (VUL-023).</w:t>
+      </w:r>
+    </w:p>
+    <w:p>
+      <w:pPr>
+        <w:pStyle w:val="ListBullet"/>
+      </w:pPr>
+      <w:r>
+        <w:t>Registro: los eventos de seguridad se registran sin contraseñas ni tokens (VUL-032).</w:t>
       </w:r>
     </w:p>
     <w:p>
@@ -21027,7 +25658,7 @@
               <w:rPr>
                 <w:sz w:val="17"/>
               </w:rPr>
-              <w:t>pnkSecurity · rama mejoras (86a7b71)</w:t>
+              <w:t>pnkSecurity · rama mejoras</w:t>
             </w:r>
           </w:p>
         </w:tc>
@@ -21057,7 +25688,7 @@
               <w:rPr>
                 <w:sz w:val="17"/>
               </w:rPr>
-              <w:t>APROBADO CON OBSERVACIONES</w:t>
+              <w:t>APROBADO</w:t>
             </w:r>
           </w:p>
         </w:tc>
@@ -21073,7 +25704,7 @@
               <w:rPr>
                 <w:sz w:val="17"/>
               </w:rPr>
-              <w:t>Críticos / altos abiertos</w:t>
+              <w:t>Hallazgos abiertos</w:t>
             </w:r>
           </w:p>
         </w:tc>
@@ -21087,7 +25718,7 @@
               <w:rPr>
                 <w:sz w:val="17"/>
               </w:rPr>
-              <w:t>0 / 0</w:t>
+              <w:t>0 de 33 (críticos 0 · altos 0 · medios 0 · bajos 0)</w:t>
             </w:r>
           </w:p>
         </w:tc>
@@ -21103,7 +25734,7 @@
               <w:rPr>
                 <w:sz w:val="17"/>
               </w:rPr>
-              <w:t>Observación 1</w:t>
+              <w:t>Controles automáticos</w:t>
             </w:r>
           </w:p>
         </w:tc>
@@ -21117,7 +25748,7 @@
               <w:rPr>
                 <w:sz w:val="17"/>
               </w:rPr>
-              <w:t>Re-ejecutar tests/test_seguridad.py en cada nuevo despliegue de AWS y adjuntar la salida</w:t>
+              <w:t>tests/test_seguridad.py (9 pruebas) + GitHub Actions: php -l, Semgrep (SAST) y Gitleaks (secretos) en cada push</w:t>
             </w:r>
           </w:p>
         </w:tc>
@@ -21133,7 +25764,7 @@
               <w:rPr>
                 <w:sz w:val="17"/>
               </w:rPr>
-              <w:t>Observación 2</w:t>
+              <w:t>Condición de liberación</w:t>
             </w:r>
           </w:p>
         </w:tc>
@@ -21147,7 +25778,7 @@
               <w:rPr>
                 <w:sz w:val="17"/>
               </w:rPr>
-              <w:t>Verificar en la instancia VUL-023 (permisos 600, claves aleatorias) y VUL-027 (timer de 2 h)</w:t>
+              <w:t>desplegar_y_evidenciar.ps1 debe terminar con todas las pruebas en PASA y el puerto 8080 cerrado</w:t>
             </w:r>
           </w:p>
         </w:tc>
@@ -21177,7 +25808,7 @@
               <w:rPr>
                 <w:sz w:val="17"/>
               </w:rPr>
-              <w:t>Bajo. Sin SAST/SCA automatizado en CI; la CSP mantiene style-src 'unsafe-inline'; el límite de intentos se basa en IP (detrás de NAT varios usuarios comparten contador).</w:t>
+              <w:t>Bajo y aceptado: el tope de 30 intentos por cuenta permite bloquear temporalmente (15 min) una cuenta con un ataque sostenido; se prefirió frente a permitir fuerza bruta distribuida.</w:t>
             </w:r>
           </w:p>
         </w:tc>

</xml_diff>

<commit_message>
test(evidencia): despliegue en AWS del 17/10/2026 e informe con VUL-034
- Versión corregida en https://174-129-56-84.sslip.io (rama mejoras).
- tests/test_seguridad.py: 8 de 9 pruebas en PASA; la de cabeceras detectó
  VUL-034 (duplicadas), corregida en 62c29e9 para el próximo despliegue.
- Evidencia en la instancia: logs [seguridad], permisos 600, timer de :8080,
  privilegios mínimos de pnk_app; puerto 8080 cerrado en el Security Group.
- Informe y README actualizados con la IP real (34 hallazgos).

Co-Authored-By: Claude Opus 5.5 <noreply@anthropic.com>
</commit_message>
<xml_diff>
--- a/docs/informe_vulnerabilidades.docx
+++ b/docs/informe_vulnerabilidades.docx
@@ -313,7 +313,7 @@
               <w:rPr>
                 <w:sz w:val="17"/>
               </w:rPr>
-              <w:t>33 (9 Críticos · 5 Altos · 1 Media-Alta · 9 Medios · 9 Bajos) — todos corregidos</w:t>
+              <w:t>34 (9 Críticos · 5 Altos · 1 Media-Alta · 9 Medios · 10 Bajos) — todos corregidos en el código</w:t>
             </w:r>
           </w:p>
         </w:tc>
@@ -335,12 +335,12 @@
     </w:p>
     <w:p>
       <w:r>
-        <w:t>Se auditó la aplicación pnkSecurity (menú digital de restaurantes) mediante revisión manual de código (caja blanca) y pruebas dinámicas que repiten cada ataque contra la versión original y la corregida. La primera auditoría identificó 22 hallazgos (informe_pentesting_inicial.docx); una segunda revisión sobre la versión corregida y su despliegue agregó 5 más (VUL-023 a VUL-027) y una tercera revisión completa (código, librerías publicadas y aprovisionamiento de AWS) agregó 6 más (VUL-028 a VUL-033).</w:t>
+        <w:t>Se auditó la aplicación pnkSecurity (menú digital de restaurantes) mediante revisión manual de código (caja blanca) y pruebas dinámicas que repiten cada ataque contra la versión original y la corregida. La primera auditoría identificó 22 hallazgos (informe_pentesting_inicial.docx); una segunda revisión sobre la versión corregida y su despliegue agregó 5 más (VUL-023 a VUL-027) y una tercera revisión completa (código, librerías publicadas y aprovisionamiento de AWS) agregó 6 más (VUL-028 a VUL-033). El testing en AWS del 17/10/2026 detectó una más (VUL-034).</w:t>
       </w:r>
     </w:p>
     <w:p>
       <w:r>
-        <w:t>Las 33 vulnerabilidades quedaron corregidas en la rama mejoras; no queda ningún hallazgo abierto. VUL-001 a VUL-026 tienen evidencia de prueba (el ataque falla en la versión corregida). VUL-027 a VUL-033 se verifican con tests/test_seguridad.py (9 pruebas automáticas) y con la configuración versionada del despliegue, y se re-evidencian en cada despliegue con deploy/desplegar_y_evidenciar.ps1.</w:t>
+        <w:t>Las 34 vulnerabilidades quedaron corregidas en el código de la rama mejoras. VUL-001 a VUL-026 tienen evidencia de prueba (el ataque falla en la versión corregida). VUL-027 a VUL-033 se verifican con tests/test_seguridad.py (9 pruebas automáticas) y con la configuración versionada del despliegue, y se re-evidencian en cada despliegue con deploy/desplegar_y_evidenciar.ps1.</w:t>
       </w:r>
     </w:p>
     <w:p>
@@ -2700,7 +2700,7 @@
               <w:rPr>
                 <w:sz w:val="17"/>
               </w:rPr>
-              <w:t>Corregido – re-verificar en el nuevo despliegue</w:t>
+              <w:t>Corregido – verificado en AWS (17/10/2026)</w:t>
             </w:r>
           </w:p>
         </w:tc>
@@ -3076,7 +3076,7 @@
               <w:rPr>
                 <w:sz w:val="17"/>
               </w:rPr>
-              <w:t>Corregido – re-verificar en el nuevo despliegue</w:t>
+              <w:t>Corregido – verificado en AWS (17/10/2026)</w:t>
             </w:r>
           </w:p>
         </w:tc>
@@ -3264,7 +3264,7 @@
               <w:rPr>
                 <w:sz w:val="17"/>
               </w:rPr>
-              <w:t>Corregido – verificar con test_seguridad.py</w:t>
+              <w:t>Corregido – verificado en AWS (17/10/2026)</w:t>
             </w:r>
           </w:p>
         </w:tc>
@@ -3358,7 +3358,7 @@
               <w:rPr>
                 <w:sz w:val="17"/>
               </w:rPr>
-              <w:t>Corregido – verificar con test_seguridad.py</w:t>
+              <w:t>Corregido – verificado en AWS (17/10/2026)</w:t>
             </w:r>
           </w:p>
         </w:tc>
@@ -3546,7 +3546,7 @@
               <w:rPr>
                 <w:sz w:val="17"/>
               </w:rPr>
-              <w:t>Corregido – verificar en el nuevo despliegue</w:t>
+              <w:t>Corregido – verificado en AWS (17/10/2026)</w:t>
             </w:r>
           </w:p>
         </w:tc>
@@ -3640,7 +3640,101 @@
               <w:rPr>
                 <w:sz w:val="17"/>
               </w:rPr>
-              <w:t>Corregido – verificar en el nuevo despliegue</w:t>
+              <w:t>Corregido – verificado en AWS (17/10/2026)</w:t>
+            </w:r>
+          </w:p>
+        </w:tc>
+      </w:tr>
+      <w:tr>
+        <w:tc>
+          <w:tcPr>
+            <w:tcW w:type="dxa" w:w="1020"/>
+          </w:tcPr>
+          <w:p>
+            <w:r/>
+            <w:r>
+              <w:rPr>
+                <w:sz w:val="17"/>
+              </w:rPr>
+              <w:t>VUL-034</w:t>
+            </w:r>
+          </w:p>
+        </w:tc>
+        <w:tc>
+          <w:tcPr>
+            <w:tcW w:type="dxa" w:w="3685"/>
+          </w:tcPr>
+          <w:p>
+            <w:r/>
+            <w:r>
+              <w:rPr>
+                <w:sz w:val="17"/>
+              </w:rPr>
+              <w:t>Cabeceras de seguridad duplicadas (Apache + PHP)</w:t>
+            </w:r>
+          </w:p>
+        </w:tc>
+        <w:tc>
+          <w:tcPr>
+            <w:tcW w:type="dxa" w:w="1020"/>
+          </w:tcPr>
+          <w:p>
+            <w:r/>
+            <w:r>
+              <w:rPr>
+                <w:sz w:val="17"/>
+              </w:rPr>
+              <w:t>A05:2021</w:t>
+            </w:r>
+          </w:p>
+        </w:tc>
+        <w:tc>
+          <w:tcPr>
+            <w:tcW w:type="dxa" w:w="1077"/>
+            <w:shd w:val="clear" w:color="auto" w:fill="2E86C1"/>
+          </w:tcPr>
+          <w:p>
+            <w:r>
+              <w:rPr>
+                <w:b/>
+                <w:color w:val="FFFFFF"/>
+              </w:rPr>
+            </w:r>
+            <w:r>
+              <w:rPr>
+                <w:b/>
+                <w:color w:val="FFFFFF"/>
+                <w:sz w:val="17"/>
+              </w:rPr>
+              <w:t>Baja</w:t>
+            </w:r>
+          </w:p>
+        </w:tc>
+        <w:tc>
+          <w:tcPr>
+            <w:tcW w:type="dxa" w:w="1304"/>
+          </w:tcPr>
+          <w:p>
+            <w:r/>
+            <w:r>
+              <w:rPr>
+                <w:sz w:val="17"/>
+              </w:rPr>
+              <w:t>62c29e9</w:t>
+            </w:r>
+          </w:p>
+        </w:tc>
+        <w:tc>
+          <w:tcPr>
+            <w:tcW w:type="dxa" w:w="1814"/>
+          </w:tcPr>
+          <w:p>
+            <w:r/>
+            <w:r>
+              <w:rPr>
+                <w:sz w:val="17"/>
+              </w:rPr>
+              <w:t>Corregido en código – aplicar en AWS</w:t>
             </w:r>
           </w:p>
         </w:tc>
@@ -3676,7 +3770,7 @@
     </w:p>
     <w:p>
       <w:r>
-        <w:t>URL base — versión original (rama main): http://&lt;IP-AWS&gt;:8080   ·   versión corregida (rama mejoras): https://&lt;ip-aws&gt;.sslip.io. En el laboratorio local: original http://127.0.0.1:8080 y corregida http://127.0.0.1:8000 (tests/lab_local.sh).</w:t>
+        <w:t>URL base — versión original (rama main): http://174.129.56.84:8080   ·   versión corregida (rama mejoras): https://174-129-56-84.sslip.io. En el laboratorio local: original http://127.0.0.1:8080 y corregida http://127.0.0.1:8000 (tests/lab_local.sh).</w:t>
       </w:r>
     </w:p>
     <w:p>
@@ -17412,7 +17506,7 @@
               <w:rPr>
                 <w:sz w:val="18"/>
               </w:rPr>
-              <w:t>Login en https://&lt;ip-aws&gt;.sslip.io con las claves del README; /var/log/pnk-deploy.log</w:t>
+              <w:t>Login en https://174-129-56-84.sslip.io con las claves del README; /var/log/pnk-deploy.log</w:t>
             </w:r>
           </w:p>
         </w:tc>
@@ -17540,7 +17634,7 @@
               <w:rPr>
                 <w:sz w:val="18"/>
               </w:rPr>
-              <w:t>Corregido – re-verificar en el nuevo despliegue</w:t>
+              <w:t>Corregido – verificado en AWS (17/10/2026)</w:t>
             </w:r>
           </w:p>
         </w:tc>
@@ -19740,7 +19834,7 @@
               <w:rPr>
                 <w:sz w:val="18"/>
               </w:rPr>
-              <w:t>http://&lt;IP-AWS&gt;:8080/index.php?id=1</w:t>
+              <w:t>http://174.129.56.84:8080/index.php?id=1</w:t>
             </w:r>
           </w:p>
         </w:tc>
@@ -19868,7 +19962,7 @@
               <w:rPr>
                 <w:sz w:val="18"/>
               </w:rPr>
-              <w:t>Corregido – re-verificar en el nuevo despliegue</w:t>
+              <w:t>Corregido – verificado en AWS (17/10/2026)</w:t>
             </w:r>
           </w:p>
         </w:tc>
@@ -21088,7 +21182,7 @@
               <w:rPr>
                 <w:sz w:val="18"/>
               </w:rPr>
-              <w:t>Corregido – verificar con test_seguridad.py</w:t>
+              <w:t>Corregido – verificado en AWS (17/10/2026)</w:t>
             </w:r>
           </w:p>
         </w:tc>
@@ -21692,7 +21786,7 @@
               <w:rPr>
                 <w:sz w:val="18"/>
               </w:rPr>
-              <w:t>Corregido – verificar con test_seguridad.py</w:t>
+              <w:t>Corregido – verificado en AWS (17/10/2026)</w:t>
             </w:r>
           </w:p>
         </w:tc>
@@ -22892,7 +22986,7 @@
               <w:rPr>
                 <w:sz w:val="18"/>
               </w:rPr>
-              <w:t>Corregido – verificar en el nuevo despliegue</w:t>
+              <w:t>Corregido – verificado en AWS (17/10/2026)</w:t>
             </w:r>
           </w:p>
         </w:tc>
@@ -23500,7 +23594,7 @@
               <w:rPr>
                 <w:sz w:val="18"/>
               </w:rPr>
-              <w:t>Corregido – verificar en el nuevo despliegue</w:t>
+              <w:t>Corregido – verificado en AWS (17/10/2026)</w:t>
             </w:r>
           </w:p>
         </w:tc>
@@ -23769,16 +23863,358 @@
     </w:tbl>
     <w:p>
       <w:pPr>
-        <w:pStyle w:val="Heading1"/>
+        <w:pStyle w:val="Heading2"/>
         <w:pageBreakBefore/>
       </w:pPr>
       <w:r>
-        <w:t>4. Evidencia de testing (sin vulnerabilidad)</w:t>
+        <w:t>VUL-034 → Cabeceras de seguridad duplicadas (Apache + PHP)</w:t>
       </w:r>
     </w:p>
+    <w:tbl>
+      <w:tblPr>
+        <w:tblStyle w:val="TableGrid"/>
+        <w:tblW w:type="auto" w:w="0"/>
+        <w:tblLook w:firstColumn="1" w:firstRow="1" w:lastColumn="0" w:lastRow="0" w:noHBand="0" w:noVBand="1" w:val="04A0"/>
+      </w:tblPr>
+      <w:tblGrid>
+        <w:gridCol w:w="4986"/>
+        <w:gridCol w:w="4986"/>
+      </w:tblGrid>
+      <w:tr>
+        <w:tc>
+          <w:tcPr>
+            <w:tcW w:type="dxa" w:w="2154"/>
+            <w:shd w:val="clear" w:color="auto" w:fill="DCE6F0"/>
+          </w:tcPr>
+          <w:p>
+            <w:r/>
+            <w:r>
+              <w:rPr>
+                <w:b/>
+                <w:sz w:val="18"/>
+              </w:rPr>
+              <w:t>Vulnerabilidad</w:t>
+            </w:r>
+          </w:p>
+        </w:tc>
+        <w:tc>
+          <w:tcPr>
+            <w:tcW w:type="dxa" w:w="7483"/>
+          </w:tcPr>
+          <w:p>
+            <w:r/>
+            <w:r>
+              <w:rPr>
+                <w:sz w:val="18"/>
+              </w:rPr>
+              <w:t>Cabeceras de seguridad duplicadas (Apache + PHP)</w:t>
+            </w:r>
+          </w:p>
+        </w:tc>
+      </w:tr>
+      <w:tr>
+        <w:tc>
+          <w:tcPr>
+            <w:tcW w:type="dxa" w:w="2154"/>
+            <w:shd w:val="clear" w:color="auto" w:fill="DCE6F0"/>
+          </w:tcPr>
+          <w:p>
+            <w:r/>
+            <w:r>
+              <w:rPr>
+                <w:b/>
+                <w:sz w:val="18"/>
+              </w:rPr>
+              <w:t>Severidad</w:t>
+            </w:r>
+          </w:p>
+        </w:tc>
+        <w:tc>
+          <w:tcPr>
+            <w:tcW w:type="dxa" w:w="7483"/>
+            <w:shd w:val="clear" w:color="auto" w:fill="2E86C1"/>
+          </w:tcPr>
+          <w:p>
+            <w:r/>
+            <w:r>
+              <w:rPr>
+                <w:b/>
+                <w:color w:val="FFFFFF"/>
+                <w:sz w:val="18"/>
+              </w:rPr>
+              <w:t>Baja</w:t>
+            </w:r>
+          </w:p>
+        </w:tc>
+      </w:tr>
+      <w:tr>
+        <w:tc>
+          <w:tcPr>
+            <w:tcW w:type="dxa" w:w="2154"/>
+            <w:shd w:val="clear" w:color="auto" w:fill="DCE6F0"/>
+          </w:tcPr>
+          <w:p>
+            <w:r/>
+            <w:r>
+              <w:rPr>
+                <w:b/>
+                <w:sz w:val="18"/>
+              </w:rPr>
+              <w:t>OWASP Top 10</w:t>
+            </w:r>
+          </w:p>
+        </w:tc>
+        <w:tc>
+          <w:tcPr>
+            <w:tcW w:type="dxa" w:w="7483"/>
+          </w:tcPr>
+          <w:p>
+            <w:r/>
+            <w:r>
+              <w:rPr>
+                <w:sz w:val="18"/>
+              </w:rPr>
+              <w:t>A05:2021 – Security Misconfiguration</w:t>
+            </w:r>
+          </w:p>
+        </w:tc>
+      </w:tr>
+      <w:tr>
+        <w:tc>
+          <w:tcPr>
+            <w:tcW w:type="dxa" w:w="2154"/>
+            <w:shd w:val="clear" w:color="auto" w:fill="DCE6F0"/>
+          </w:tcPr>
+          <w:p>
+            <w:r/>
+            <w:r>
+              <w:rPr>
+                <w:b/>
+                <w:sz w:val="18"/>
+              </w:rPr>
+              <w:t>OWASP ASVS v5.0.0</w:t>
+            </w:r>
+          </w:p>
+        </w:tc>
+        <w:tc>
+          <w:tcPr>
+            <w:tcW w:type="dxa" w:w="7483"/>
+          </w:tcPr>
+          <w:p>
+            <w:r/>
+            <w:r>
+              <w:rPr>
+                <w:sz w:val="18"/>
+              </w:rPr>
+              <w:t>V3 Web Frontend Security</w:t>
+            </w:r>
+          </w:p>
+        </w:tc>
+      </w:tr>
+      <w:tr>
+        <w:tc>
+          <w:tcPr>
+            <w:tcW w:type="dxa" w:w="2154"/>
+            <w:shd w:val="clear" w:color="auto" w:fill="DCE6F0"/>
+          </w:tcPr>
+          <w:p>
+            <w:r/>
+            <w:r>
+              <w:rPr>
+                <w:b/>
+                <w:sz w:val="18"/>
+              </w:rPr>
+              <w:t>Descripción</w:t>
+            </w:r>
+          </w:p>
+        </w:tc>
+        <w:tc>
+          <w:tcPr>
+            <w:tcW w:type="dxa" w:w="7483"/>
+          </w:tcPr>
+          <w:p>
+            <w:r/>
+            <w:r>
+              <w:rPr>
+                <w:sz w:val="18"/>
+              </w:rPr>
+              <w:t>Detectado por tests/test_seguridad.py al desplegar en AWS: Apache agregaba X-Content-Type-Options, X-Frame-Options y Referrer-Policy además de las que ya envía PHP. El navegador recibe "nosniff, nosniff" y "DENY, DENY"; algunos navegadores y proxies descartan valores repetidos, con lo que la protección contra MIME sniffing y clickjacking puede quedar sin efecto (la CSP frame-ancestors 'none' sigue protegiendo el framing).</w:t>
+            </w:r>
+          </w:p>
+        </w:tc>
+      </w:tr>
+      <w:tr>
+        <w:tc>
+          <w:tcPr>
+            <w:tcW w:type="dxa" w:w="2154"/>
+            <w:shd w:val="clear" w:color="auto" w:fill="DCE6F0"/>
+          </w:tcPr>
+          <w:p>
+            <w:r/>
+            <w:r>
+              <w:rPr>
+                <w:b/>
+                <w:sz w:val="18"/>
+              </w:rPr>
+              <w:t>URL</w:t>
+            </w:r>
+          </w:p>
+        </w:tc>
+        <w:tc>
+          <w:tcPr>
+            <w:tcW w:type="dxa" w:w="7483"/>
+          </w:tcPr>
+          <w:p>
+            <w:r/>
+            <w:r>
+              <w:rPr>
+                <w:sz w:val="18"/>
+              </w:rPr>
+              <w:t>https://174-129-56-84.sslip.io/index.php?id=1 (cabeceras de respuesta)</w:t>
+            </w:r>
+          </w:p>
+        </w:tc>
+      </w:tr>
+      <w:tr>
+        <w:tc>
+          <w:tcPr>
+            <w:tcW w:type="dxa" w:w="2154"/>
+            <w:shd w:val="clear" w:color="auto" w:fill="DCE6F0"/>
+          </w:tcPr>
+          <w:p>
+            <w:r/>
+            <w:r>
+              <w:rPr>
+                <w:b/>
+                <w:sz w:val="18"/>
+              </w:rPr>
+              <w:t>Archivo(s)</w:t>
+            </w:r>
+          </w:p>
+        </w:tc>
+        <w:tc>
+          <w:tcPr>
+            <w:tcW w:type="dxa" w:w="7483"/>
+          </w:tcPr>
+          <w:p>
+            <w:r/>
+            <w:r>
+              <w:rPr>
+                <w:sz w:val="18"/>
+              </w:rPr>
+              <w:t>deploy/user-data.sh, src/pnkSecurity/.htaccess</w:t>
+            </w:r>
+          </w:p>
+        </w:tc>
+      </w:tr>
+      <w:tr>
+        <w:tc>
+          <w:tcPr>
+            <w:tcW w:type="dxa" w:w="2154"/>
+            <w:shd w:val="clear" w:color="auto" w:fill="DCE6F0"/>
+          </w:tcPr>
+          <w:p>
+            <w:r/>
+            <w:r>
+              <w:rPr>
+                <w:b/>
+                <w:sz w:val="18"/>
+              </w:rPr>
+              <w:t>ISO/IEC 27001:2022</w:t>
+            </w:r>
+          </w:p>
+        </w:tc>
+        <w:tc>
+          <w:tcPr>
+            <w:tcW w:type="dxa" w:w="7483"/>
+          </w:tcPr>
+          <w:p>
+            <w:r/>
+            <w:r>
+              <w:rPr>
+                <w:sz w:val="18"/>
+              </w:rPr>
+              <w:t>A.8.9</w:t>
+            </w:r>
+          </w:p>
+        </w:tc>
+      </w:tr>
+      <w:tr>
+        <w:tc>
+          <w:tcPr>
+            <w:tcW w:type="dxa" w:w="2154"/>
+            <w:shd w:val="clear" w:color="auto" w:fill="DCE6F0"/>
+          </w:tcPr>
+          <w:p>
+            <w:r/>
+            <w:r>
+              <w:rPr>
+                <w:b/>
+                <w:sz w:val="18"/>
+              </w:rPr>
+              <w:t>ISO/IEC 27034 (ASC)</w:t>
+            </w:r>
+          </w:p>
+        </w:tc>
+        <w:tc>
+          <w:tcPr>
+            <w:tcW w:type="dxa" w:w="7483"/>
+          </w:tcPr>
+          <w:p>
+            <w:r/>
+            <w:r>
+              <w:rPr>
+                <w:sz w:val="18"/>
+              </w:rPr>
+              <w:t>ASC-06, ASC-20</w:t>
+            </w:r>
+          </w:p>
+        </w:tc>
+      </w:tr>
+      <w:tr>
+        <w:tc>
+          <w:tcPr>
+            <w:tcW w:type="dxa" w:w="2154"/>
+            <w:shd w:val="clear" w:color="auto" w:fill="DCE6F0"/>
+          </w:tcPr>
+          <w:p>
+            <w:r/>
+            <w:r>
+              <w:rPr>
+                <w:b/>
+                <w:sz w:val="18"/>
+              </w:rPr>
+              <w:t>Estado</w:t>
+            </w:r>
+          </w:p>
+        </w:tc>
+        <w:tc>
+          <w:tcPr>
+            <w:tcW w:type="dxa" w:w="7483"/>
+          </w:tcPr>
+          <w:p>
+            <w:r/>
+            <w:r>
+              <w:rPr>
+                <w:sz w:val="18"/>
+              </w:rPr>
+              <w:t>Corregido en código – aplicar en AWS</w:t>
+            </w:r>
+          </w:p>
+        </w:tc>
+      </w:tr>
+    </w:tbl>
+    <w:p/>
     <w:p>
+      <w:pPr>
+        <w:spacing w:after="40"/>
+      </w:pPr>
       <w:r>
-        <w:t>El script tests/test_seguridad.py repite los ataques contra ambas versiones; tests/lab_local.sh levanta las dos ramas en bases de datos aisladas para reproducirlo sin AWS. Resultados completos en docs/evidencias/resultado_testing.txt (AWS) y docs/evidencias/resultado_local.txt (local, 05/10/2026).</w:t>
+        <w:rPr>
+          <w:b/>
+          <w:color w:val="B02418"/>
+        </w:rPr>
+        <w:t>Evidencia (versión original — vulnerable)</w:t>
       </w:r>
     </w:p>
     <w:tbl>
@@ -23794,7 +24230,7 @@
         <w:tc>
           <w:tcPr>
             <w:tcW w:type="dxa" w:w="9972"/>
-            <w:shd w:val="clear" w:color="auto" w:fill="F4F4F4"/>
+            <w:shd w:val="clear" w:color="auto" w:fill="FBEAEA"/>
           </w:tcPr>
           <w:p>
             <w:r>
@@ -23802,6 +24238,300 @@
                 <w:rFonts w:ascii="Consolas" w:hAnsi="Consolas" w:eastAsia="Consolas"/>
                 <w:sz w:val="16"/>
               </w:rPr>
+              <w:t>X-Content-Type-Options: nosniff</w:t>
+              <w:br/>
+            </w:r>
+            <w:r>
+              <w:rPr>
+                <w:rFonts w:ascii="Consolas" w:hAnsi="Consolas" w:eastAsia="Consolas"/>
+                <w:sz w:val="16"/>
+              </w:rPr>
+              <w:t>X-Frame-Options: DENY</w:t>
+              <w:br/>
+            </w:r>
+            <w:r>
+              <w:rPr>
+                <w:rFonts w:ascii="Consolas" w:hAnsi="Consolas" w:eastAsia="Consolas"/>
+                <w:sz w:val="16"/>
+              </w:rPr>
+              <w:t>...</w:t>
+              <w:br/>
+            </w:r>
+            <w:r>
+              <w:rPr>
+                <w:rFonts w:ascii="Consolas" w:hAnsi="Consolas" w:eastAsia="Consolas"/>
+                <w:sz w:val="16"/>
+              </w:rPr>
+              <w:t>X-Content-Type-Options: nosniff</w:t>
+              <w:br/>
+            </w:r>
+            <w:r>
+              <w:rPr>
+                <w:rFonts w:ascii="Consolas" w:hAnsi="Consolas" w:eastAsia="Consolas"/>
+                <w:sz w:val="16"/>
+              </w:rPr>
+              <w:t>X-Frame-Options: DENY</w:t>
+              <w:br/>
+            </w:r>
+            <w:r>
+              <w:rPr>
+                <w:rFonts w:ascii="Consolas" w:hAnsi="Consolas" w:eastAsia="Consolas"/>
+                <w:sz w:val="16"/>
+              </w:rPr>
+              <w:t xml:space="preserve">  [FALLA] VUL-22/29 Cabeceras -&gt; FALTAN: nosniff, X-Frame-Options</w:t>
+            </w:r>
+          </w:p>
+        </w:tc>
+      </w:tr>
+    </w:tbl>
+    <w:p/>
+    <w:p>
+      <w:pPr>
+        <w:spacing w:after="40"/>
+      </w:pPr>
+      <w:r>
+        <w:rPr>
+          <w:b/>
+          <w:color w:val="1F3A5F"/>
+        </w:rPr>
+        <w:t>Corrección</w:t>
+      </w:r>
+    </w:p>
+    <w:p>
+      <w:r>
+        <w:t xml:space="preserve">Commit Git: </w:t>
+      </w:r>
+      <w:hyperlink r:id="rId24">
+        <w:r>
+          <w:rPr>
+            <w:color w:val="0563C1"/>
+            <w:u w:val="single"/>
+          </w:rPr>
+          <w:t>62c29e9</w:t>
+        </w:r>
+      </w:hyperlink>
+      <w:r>
+        <w:t xml:space="preserve">   (rama mejoras)</w:t>
+      </w:r>
+    </w:p>
+    <w:p>
+      <w:pPr>
+        <w:spacing w:after="40"/>
+      </w:pPr>
+      <w:r>
+        <w:rPr>
+          <w:b/>
+          <w:color w:val="B02418"/>
+        </w:rPr>
+        <w:t>Código original</w:t>
+      </w:r>
+    </w:p>
+    <w:tbl>
+      <w:tblPr>
+        <w:tblW w:type="auto" w:w="0"/>
+        <w:jc w:val="center"/>
+        <w:tblLook w:firstColumn="1" w:firstRow="1" w:lastColumn="0" w:lastRow="0" w:noHBand="0" w:noVBand="1" w:val="04A0"/>
+      </w:tblPr>
+      <w:tblGrid>
+        <w:gridCol w:w="9972"/>
+      </w:tblGrid>
+      <w:tr>
+        <w:tc>
+          <w:tcPr>
+            <w:tcW w:type="dxa" w:w="9972"/>
+            <w:shd w:val="clear" w:color="auto" w:fill="FBEAEA"/>
+          </w:tcPr>
+          <w:p>
+            <w:r>
+              <w:rPr>
+                <w:rFonts w:ascii="Consolas" w:hAnsi="Consolas" w:eastAsia="Consolas"/>
+                <w:sz w:val="16"/>
+              </w:rPr>
+              <w:t>Header always set X-Content-Type-Options "nosniff"</w:t>
+              <w:br/>
+            </w:r>
+            <w:r>
+              <w:rPr>
+                <w:rFonts w:ascii="Consolas" w:hAnsi="Consolas" w:eastAsia="Consolas"/>
+                <w:sz w:val="16"/>
+              </w:rPr>
+              <w:t>Header always set X-Frame-Options "DENY"</w:t>
+              <w:br/>
+            </w:r>
+            <w:r>
+              <w:rPr>
+                <w:rFonts w:ascii="Consolas" w:hAnsi="Consolas" w:eastAsia="Consolas"/>
+                <w:sz w:val="16"/>
+              </w:rPr>
+              <w:t xml:space="preserve">Header always set Referrer-Policy "strict-origin-when-cross-origin" </w:t>
+            </w:r>
+          </w:p>
+        </w:tc>
+      </w:tr>
+    </w:tbl>
+    <w:p/>
+    <w:p>
+      <w:pPr>
+        <w:spacing w:after="40"/>
+      </w:pPr>
+      <w:r>
+        <w:rPr>
+          <w:b/>
+          <w:color w:val="1E6B34"/>
+        </w:rPr>
+        <w:t>Código nuevo</w:t>
+      </w:r>
+    </w:p>
+    <w:tbl>
+      <w:tblPr>
+        <w:tblW w:type="auto" w:w="0"/>
+        <w:jc w:val="center"/>
+        <w:tblLook w:firstColumn="1" w:firstRow="1" w:lastColumn="0" w:lastRow="0" w:noHBand="0" w:noVBand="1" w:val="04A0"/>
+      </w:tblPr>
+      <w:tblGrid>
+        <w:gridCol w:w="9972"/>
+      </w:tblGrid>
+      <w:tr>
+        <w:tc>
+          <w:tcPr>
+            <w:tcW w:type="dxa" w:w="9972"/>
+            <w:shd w:val="clear" w:color="auto" w:fill="EAF6EC"/>
+          </w:tcPr>
+          <w:p>
+            <w:r>
+              <w:rPr>
+                <w:rFonts w:ascii="Consolas" w:hAnsi="Consolas" w:eastAsia="Consolas"/>
+                <w:sz w:val="16"/>
+              </w:rPr>
+              <w:t># PHP también envía estas cabeceras; se quita su copia y Apache deja una sola</w:t>
+              <w:br/>
+            </w:r>
+            <w:r>
+              <w:rPr>
+                <w:rFonts w:ascii="Consolas" w:hAnsi="Consolas" w:eastAsia="Consolas"/>
+                <w:sz w:val="16"/>
+              </w:rPr>
+              <w:t>Header unset X-Content-Type-Options</w:t>
+              <w:br/>
+            </w:r>
+            <w:r>
+              <w:rPr>
+                <w:rFonts w:ascii="Consolas" w:hAnsi="Consolas" w:eastAsia="Consolas"/>
+                <w:sz w:val="16"/>
+              </w:rPr>
+              <w:t>Header always set X-Content-Type-Options "nosniff"</w:t>
+              <w:br/>
+            </w:r>
+            <w:r>
+              <w:rPr>
+                <w:rFonts w:ascii="Consolas" w:hAnsi="Consolas" w:eastAsia="Consolas"/>
+                <w:sz w:val="16"/>
+              </w:rPr>
+              <w:t>Header unset X-Frame-Options</w:t>
+              <w:br/>
+            </w:r>
+            <w:r>
+              <w:rPr>
+                <w:rFonts w:ascii="Consolas" w:hAnsi="Consolas" w:eastAsia="Consolas"/>
+                <w:sz w:val="16"/>
+              </w:rPr>
+              <w:t>Header always set X-Frame-Options "DENY"</w:t>
+              <w:br/>
+            </w:r>
+            <w:r>
+              <w:rPr>
+                <w:rFonts w:ascii="Consolas" w:hAnsi="Consolas" w:eastAsia="Consolas"/>
+                <w:sz w:val="16"/>
+              </w:rPr>
+              <w:t>Header unset Referrer-Policy</w:t>
+              <w:br/>
+            </w:r>
+            <w:r>
+              <w:rPr>
+                <w:rFonts w:ascii="Consolas" w:hAnsi="Consolas" w:eastAsia="Consolas"/>
+                <w:sz w:val="16"/>
+              </w:rPr>
+              <w:t xml:space="preserve">Header always set Referrer-Policy "strict-origin-when-cross-origin" </w:t>
+            </w:r>
+          </w:p>
+        </w:tc>
+      </w:tr>
+    </w:tbl>
+    <w:p/>
+    <w:p>
+      <w:pPr>
+        <w:spacing w:after="40"/>
+      </w:pPr>
+      <w:r>
+        <w:rPr>
+          <w:b/>
+          <w:color w:val="1E6B34"/>
+        </w:rPr>
+        <w:t>Evidencia sin vulnerabilidad (versión corregida)</w:t>
+      </w:r>
+    </w:p>
+    <w:tbl>
+      <w:tblPr>
+        <w:tblW w:type="auto" w:w="0"/>
+        <w:jc w:val="center"/>
+        <w:tblLook w:firstColumn="1" w:firstRow="1" w:lastColumn="0" w:lastRow="0" w:noHBand="0" w:noVBand="1" w:val="04A0"/>
+      </w:tblPr>
+      <w:tblGrid>
+        <w:gridCol w:w="9972"/>
+      </w:tblGrid>
+      <w:tr>
+        <w:tc>
+          <w:tcPr>
+            <w:tcW w:type="dxa" w:w="9972"/>
+            <w:shd w:val="clear" w:color="auto" w:fill="EAF6EC"/>
+          </w:tcPr>
+          <w:p>
+            <w:r>
+              <w:rPr>
+                <w:rFonts w:ascii="Consolas" w:hAnsi="Consolas" w:eastAsia="Consolas"/>
+                <w:sz w:val="16"/>
+              </w:rPr>
+              <w:t>Corregido en el repositorio. Se aplica al servidor con el próximo despliegue (desplegar_y_evidenciar.ps1), donde la prueba 'VUL-22/29 Cabeceras' debe quedar en PASA.</w:t>
+            </w:r>
+          </w:p>
+        </w:tc>
+      </w:tr>
+    </w:tbl>
+    <w:p>
+      <w:pPr>
+        <w:pStyle w:val="Heading1"/>
+        <w:pageBreakBefore/>
+      </w:pPr>
+      <w:r>
+        <w:t>4. Evidencia de testing (sin vulnerabilidad)</w:t>
+      </w:r>
+    </w:p>
+    <w:p>
+      <w:r>
+        <w:t>El script tests/test_seguridad.py repite los ataques contra ambas versiones; tests/lab_local.sh levanta las dos ramas en bases de datos aisladas para reproducirlo sin AWS. Resultados completos en docs/evidencias/resultado_testing.txt (AWS) y docs/evidencias/resultado_local.txt (local, 05/10/2026). Despliegue en AWS del 17/10/2026: 8 de 9 pruebas en PASA; la novena detectó VUL-034 (cabeceras duplicadas).</w:t>
+      </w:r>
+    </w:p>
+    <w:tbl>
+      <w:tblPr>
+        <w:tblW w:type="auto" w:w="0"/>
+        <w:jc w:val="center"/>
+        <w:tblLook w:firstColumn="1" w:firstRow="1" w:lastColumn="0" w:lastRow="0" w:noHBand="0" w:noVBand="1" w:val="04A0"/>
+      </w:tblPr>
+      <w:tblGrid>
+        <w:gridCol w:w="9972"/>
+      </w:tblGrid>
+      <w:tr>
+        <w:tc>
+          <w:tcPr>
+            <w:tcW w:type="dxa" w:w="9972"/>
+            <w:shd w:val="clear" w:color="auto" w:fill="F4F4F4"/>
+          </w:tcPr>
+          <w:p>
+            <w:r>
+              <w:rPr>
+                <w:rFonts w:ascii="Consolas" w:hAnsi="Consolas" w:eastAsia="Consolas"/>
+                <w:sz w:val="16"/>
+              </w:rPr>
               <w:t>pip install requests</w:t>
               <w:br/>
             </w:r>
@@ -23818,7 +24548,7 @@
                 <w:rFonts w:ascii="Consolas" w:hAnsi="Consolas" w:eastAsia="Consolas"/>
                 <w:sz w:val="16"/>
               </w:rPr>
-              <w:t xml:space="preserve">    --vulnerable http://&lt;IP-AWS&gt;:8080 \</w:t>
+              <w:t xml:space="preserve">    --vulnerable http://174.129.56.84:8080 \</w:t>
               <w:br/>
             </w:r>
             <w:r>
@@ -23826,7 +24556,7 @@
                 <w:rFonts w:ascii="Consolas" w:hAnsi="Consolas" w:eastAsia="Consolas"/>
                 <w:sz w:val="16"/>
               </w:rPr>
-              <w:t xml:space="preserve">    --corregida  https://&lt;ip-aws&gt;.sslip.io</w:t>
+              <w:t xml:space="preserve">    --corregida  https://174-129-56-84.sslip.io</w:t>
             </w:r>
           </w:p>
         </w:tc>
@@ -25184,7 +25914,7 @@
               <w:rPr>
                 <w:sz w:val="17"/>
               </w:rPr>
-              <w:t>https://&lt;ip-aws&gt;.sslip.io/index.php?id=1</w:t>
+              <w:t>https://174-129-56-84.sslip.io/index.php?id=1</w:t>
             </w:r>
           </w:p>
         </w:tc>
@@ -25688,7 +26418,7 @@
               <w:rPr>
                 <w:sz w:val="17"/>
               </w:rPr>
-              <w:t>APROBADO</w:t>
+              <w:t>APROBADO CON OBSERVACIÓN (VUL-034 pendiente de aplicar en AWS)</w:t>
             </w:r>
           </w:p>
         </w:tc>
@@ -25718,7 +26448,7 @@
               <w:rPr>
                 <w:sz w:val="17"/>
               </w:rPr>
-              <w:t>0 de 33 (críticos 0 · altos 0 · medios 0 · bajos 0)</w:t>
+              <w:t>0 críticos · 0 altos · 0 medios · 1 bajo en AWS (VUL-034: corregido en código, falta aplicarlo a la instancia)</w:t>
             </w:r>
           </w:p>
         </w:tc>

</xml_diff>

<commit_message>
test(evidencia): VUL-034 aplicado en AWS, 9 de 9 pruebas en PASA
- Cabeceras de seguridad con una sola copia en la instancia (Apache recargado).
- tests/test_seguridad.py contra https://174-129-56-84.sslip.io: 9/9 PASA.
- Instancia anterior 54.197.67.4 (código previo) detenida.
- Informe y README: 34 de 34 corregidas y verificadas; Security Gate APROBADO.

Co-Authored-By: Claude Opus 5.5 <noreply@anthropic.com>
</commit_message>
<xml_diff>
--- a/docs/informe_vulnerabilidades.docx
+++ b/docs/informe_vulnerabilidades.docx
@@ -313,7 +313,7 @@
               <w:rPr>
                 <w:sz w:val="17"/>
               </w:rPr>
-              <w:t>34 (9 Críticos · 5 Altos · 1 Media-Alta · 9 Medios · 10 Bajos) — todos corregidos en el código</w:t>
+              <w:t>34 (9 Críticos · 5 Altos · 1 Media-Alta · 9 Medios · 10 Bajos) — todos corregidos y verificados en AWS</w:t>
             </w:r>
           </w:p>
         </w:tc>
@@ -340,7 +340,7 @@
     </w:p>
     <w:p>
       <w:r>
-        <w:t>Las 34 vulnerabilidades quedaron corregidas en el código de la rama mejoras. VUL-001 a VUL-026 tienen evidencia de prueba (el ataque falla en la versión corregida). VUL-027 a VUL-033 se verifican con tests/test_seguridad.py (9 pruebas automáticas) y con la configuración versionada del despliegue, y se re-evidencian en cada despliegue con deploy/desplegar_y_evidenciar.ps1.</w:t>
+        <w:t>Las 34 vulnerabilidades quedaron corregidas en la rama mejoras y la versión publicada en AWS pasa las 9 pruebas automáticas (17/10/2026). VUL-001 a VUL-026 tienen evidencia de prueba (el ataque falla en la versión corregida). VUL-027 a VUL-033 se verifican con tests/test_seguridad.py (9 pruebas automáticas) y con la configuración versionada del despliegue, y se re-evidencian en cada despliegue con deploy/desplegar_y_evidenciar.ps1.</w:t>
       </w:r>
     </w:p>
     <w:p>
@@ -3734,7 +3734,7 @@
               <w:rPr>
                 <w:sz w:val="17"/>
               </w:rPr>
-              <w:t>Corregido en código – aplicar en AWS</w:t>
+              <w:t>Corregido – verificado en AWS (17/10/2026)</w:t>
             </w:r>
           </w:p>
         </w:tc>
@@ -24198,7 +24198,7 @@
               <w:rPr>
                 <w:sz w:val="18"/>
               </w:rPr>
-              <w:t>Corregido en código – aplicar en AWS</w:t>
+              <w:t>Corregido – verificado en AWS (17/10/2026)</w:t>
             </w:r>
           </w:p>
         </w:tc>
@@ -24491,7 +24491,23 @@
                 <w:rFonts w:ascii="Consolas" w:hAnsi="Consolas" w:eastAsia="Consolas"/>
                 <w:sz w:val="16"/>
               </w:rPr>
-              <w:t>Corregido en el repositorio. Se aplica al servidor con el próximo despliegue (desplegar_y_evidenciar.ps1), donde la prueba 'VUL-22/29 Cabeceras' debe quedar en PASA.</w:t>
+              <w:t>Aplicado en la instancia y recargado Apache: cada cabecera aparece una sola vez (también en las respuestas 403).</w:t>
+              <w:br/>
+            </w:r>
+            <w:r>
+              <w:rPr>
+                <w:rFonts w:ascii="Consolas" w:hAnsi="Consolas" w:eastAsia="Consolas"/>
+                <w:sz w:val="16"/>
+              </w:rPr>
+              <w:t xml:space="preserve">  [PASA] VUL-22/29 Cabeceras -&gt; todas presentes</w:t>
+              <w:br/>
+            </w:r>
+            <w:r>
+              <w:rPr>
+                <w:rFonts w:ascii="Consolas" w:hAnsi="Consolas" w:eastAsia="Consolas"/>
+                <w:sz w:val="16"/>
+              </w:rPr>
+              <w:t>RESULTADO: 9 de 9 pruebas en PASA.</w:t>
             </w:r>
           </w:p>
         </w:tc>
@@ -24508,7 +24524,7 @@
     </w:p>
     <w:p>
       <w:r>
-        <w:t>El script tests/test_seguridad.py repite los ataques contra ambas versiones; tests/lab_local.sh levanta las dos ramas en bases de datos aisladas para reproducirlo sin AWS. Resultados completos en docs/evidencias/resultado_testing.txt (AWS) y docs/evidencias/resultado_local.txt (local, 05/10/2026). Despliegue en AWS del 17/10/2026: 8 de 9 pruebas en PASA; la novena detectó VUL-034 (cabeceras duplicadas).</w:t>
+        <w:t>El script tests/test_seguridad.py repite los ataques contra ambas versiones; tests/lab_local.sh levanta las dos ramas en bases de datos aisladas para reproducirlo sin AWS. Resultados completos en docs/evidencias/resultado_testing.txt (AWS) y docs/evidencias/resultado_local.txt (local, 05/10/2026). Despliegue en AWS del 17/10/2026: la primera ejecución detectó VUL-034 (cabeceras duplicadas); tras corregirla, 9 de 9 pruebas en PASA.</w:t>
       </w:r>
     </w:p>
     <w:tbl>
@@ -26418,7 +26434,7 @@
               <w:rPr>
                 <w:sz w:val="17"/>
               </w:rPr>
-              <w:t>APROBADO CON OBSERVACIÓN (VUL-034 pendiente de aplicar en AWS)</w:t>
+              <w:t>APROBADO</w:t>
             </w:r>
           </w:p>
         </w:tc>
@@ -26448,7 +26464,7 @@
               <w:rPr>
                 <w:sz w:val="17"/>
               </w:rPr>
-              <w:t>0 críticos · 0 altos · 0 medios · 1 bajo en AWS (VUL-034: corregido en código, falta aplicarlo a la instancia)</w:t>
+              <w:t>0 de 34 (críticos 0 · altos 0 · medios 0 · bajos 0)</w:t>
             </w:r>
           </w:p>
         </w:tc>

</xml_diff>

<commit_message>
docs: capturas de pantalla antes/después, URLs completas y VUL-035
- 14 capturas (docs/evidencias/capturas/) de VUL-001, 015, 019, 021, 022,
  025 y 030: ataque en la versión original (http://52.2.60.65:8080) y
  bloqueo en la corregida (https://174-129-56-84.sslip.io).
- Cada vulnerabilidad muestra la URL completa de ambas versiones.
- VUL-035 (versión de Apache visible) documentada; 35 de 35 corregidas.

Co-Authored-By: Claude Opus 5.5 <noreply@anthropic.com>
</commit_message>
<xml_diff>
--- a/docs/informe_vulnerabilidades.docx
+++ b/docs/informe_vulnerabilidades.docx
@@ -313,7 +313,7 @@
               <w:rPr>
                 <w:sz w:val="17"/>
               </w:rPr>
-              <w:t>34 (9 Críticos · 5 Altos · 1 Media-Alta · 9 Medios · 10 Bajos) — todos corregidos y verificados en AWS</w:t>
+              <w:t>35 (9 Críticos · 5 Altos · 1 Media-Alta · 9 Medios · 11 Bajos) — todos corregidos</w:t>
             </w:r>
           </w:p>
         </w:tc>
@@ -335,12 +335,12 @@
     </w:p>
     <w:p>
       <w:r>
-        <w:t>Se auditó la aplicación pnkSecurity (menú digital de restaurantes) mediante revisión manual de código (caja blanca) y pruebas dinámicas que repiten cada ataque contra la versión original y la corregida. La primera auditoría identificó 22 hallazgos (informe_pentesting_inicial.docx); una segunda revisión sobre la versión corregida y su despliegue agregó 5 más (VUL-023 a VUL-027) y una tercera revisión completa (código, librerías publicadas y aprovisionamiento de AWS) agregó 6 más (VUL-028 a VUL-033). El testing en AWS del 17/10/2026 detectó una más (VUL-034).</w:t>
+        <w:t>Se auditó la aplicación pnkSecurity (menú digital de restaurantes) mediante revisión manual de código (caja blanca) y pruebas dinámicas que repiten cada ataque contra la versión original y la corregida. La primera auditoría identificó 22 hallazgos (informe_pentesting_inicial.docx); una segunda revisión sobre la versión corregida y su despliegue agregó 5 más (VUL-023 a VUL-027) y una tercera revisión completa (código, librerías publicadas y aprovisionamiento de AWS) agregó 6 más (VUL-028 a VUL-033). El testing en AWS del 17/10/2026 detectó una más (VUL-034) y las capturas del 18/10/2026 otra (VUL-035).</w:t>
       </w:r>
     </w:p>
     <w:p>
       <w:r>
-        <w:t>Las 34 vulnerabilidades quedaron corregidas en la rama mejoras y la versión publicada en AWS pasa las 9 pruebas automáticas (17/10/2026). VUL-001 a VUL-026 tienen evidencia de prueba (el ataque falla en la versión corregida). VUL-027 a VUL-033 se verifican con tests/test_seguridad.py (9 pruebas automáticas) y con la configuración versionada del despliegue, y se re-evidencian en cada despliegue con deploy/desplegar_y_evidenciar.ps1.</w:t>
+        <w:t>Las 35 vulnerabilidades quedaron corregidas en la rama mejoras y la versión publicada en AWS pasa las 9 pruebas automáticas. Las vulnerabilidades principales incluyen capturas de pantalla del ataque en la versión original y del bloqueo en la corregida. VUL-001 a VUL-026 tienen evidencia de prueba (el ataque falla en la versión corregida). VUL-027 a VUL-033 se verifican con tests/test_seguridad.py (9 pruebas automáticas) y con la configuración versionada del despliegue, y se re-evidencian en cada despliegue con deploy/desplegar_y_evidenciar.ps1.</w:t>
       </w:r>
     </w:p>
     <w:p>
@@ -3739,6 +3739,100 @@
           </w:p>
         </w:tc>
       </w:tr>
+      <w:tr>
+        <w:tc>
+          <w:tcPr>
+            <w:tcW w:type="dxa" w:w="1020"/>
+          </w:tcPr>
+          <w:p>
+            <w:r/>
+            <w:r>
+              <w:rPr>
+                <w:sz w:val="17"/>
+              </w:rPr>
+              <w:t>VUL-035</w:t>
+            </w:r>
+          </w:p>
+        </w:tc>
+        <w:tc>
+          <w:tcPr>
+            <w:tcW w:type="dxa" w:w="3685"/>
+          </w:tcPr>
+          <w:p>
+            <w:r/>
+            <w:r>
+              <w:rPr>
+                <w:sz w:val="17"/>
+              </w:rPr>
+              <w:t>Versión de Apache visible en cabeceras y páginas de error</w:t>
+            </w:r>
+          </w:p>
+        </w:tc>
+        <w:tc>
+          <w:tcPr>
+            <w:tcW w:type="dxa" w:w="1020"/>
+          </w:tcPr>
+          <w:p>
+            <w:r/>
+            <w:r>
+              <w:rPr>
+                <w:sz w:val="17"/>
+              </w:rPr>
+              <w:t>A05:2021</w:t>
+            </w:r>
+          </w:p>
+        </w:tc>
+        <w:tc>
+          <w:tcPr>
+            <w:tcW w:type="dxa" w:w="1077"/>
+            <w:shd w:val="clear" w:color="auto" w:fill="2E86C1"/>
+          </w:tcPr>
+          <w:p>
+            <w:r>
+              <w:rPr>
+                <w:b/>
+                <w:color w:val="FFFFFF"/>
+              </w:rPr>
+            </w:r>
+            <w:r>
+              <w:rPr>
+                <w:b/>
+                <w:color w:val="FFFFFF"/>
+                <w:sz w:val="17"/>
+              </w:rPr>
+              <w:t>Baja</w:t>
+            </w:r>
+          </w:p>
+        </w:tc>
+        <w:tc>
+          <w:tcPr>
+            <w:tcW w:type="dxa" w:w="1304"/>
+          </w:tcPr>
+          <w:p>
+            <w:r/>
+            <w:r>
+              <w:rPr>
+                <w:sz w:val="17"/>
+              </w:rPr>
+              <w:t>baf7250</w:t>
+            </w:r>
+          </w:p>
+        </w:tc>
+        <w:tc>
+          <w:tcPr>
+            <w:tcW w:type="dxa" w:w="1814"/>
+          </w:tcPr>
+          <w:p>
+            <w:r/>
+            <w:r>
+              <w:rPr>
+                <w:sz w:val="17"/>
+              </w:rPr>
+              <w:t>Corregido en código – aplicar en AWS</w:t>
+            </w:r>
+          </w:p>
+        </w:tc>
+      </w:tr>
     </w:tbl>
     <w:p/>
     <w:p>
@@ -3770,7 +3864,7 @@
     </w:p>
     <w:p>
       <w:r>
-        <w:t>URL base — versión original (rama main): http://174.129.56.84:8080   ·   versión corregida (rama mejoras): https://174-129-56-84.sslip.io. En el laboratorio local: original http://127.0.0.1:8080 y corregida http://127.0.0.1:8000 (tests/lab_local.sh).</w:t>
+        <w:t>URL base — versión original (rama main): http://52.2.60.65:8080   ·   versión corregida (rama mejoras): https://174-129-56-84.sslip.io. En el laboratorio local: original http://127.0.0.1:8080 y corregida http://127.0.0.1:8000 (tests/lab_local.sh).</w:t>
       </w:r>
     </w:p>
     <w:p>
@@ -3968,7 +4062,71 @@
                 <w:b/>
                 <w:sz w:val="18"/>
               </w:rPr>
-              <w:t>URL</w:t>
+              <w:t>URL original</w:t>
+            </w:r>
+          </w:p>
+        </w:tc>
+        <w:tc>
+          <w:tcPr>
+            <w:tcW w:type="dxa" w:w="7483"/>
+          </w:tcPr>
+          <w:p>
+            <w:r/>
+            <w:r>
+              <w:rPr>
+                <w:sz w:val="18"/>
+              </w:rPr>
+              <w:t>http://52.2.60.65:8080/setup/procesalogin.php</w:t>
+            </w:r>
+          </w:p>
+        </w:tc>
+      </w:tr>
+      <w:tr>
+        <w:tc>
+          <w:tcPr>
+            <w:tcW w:type="dxa" w:w="2154"/>
+            <w:shd w:val="clear" w:color="auto" w:fill="DCE6F0"/>
+          </w:tcPr>
+          <w:p>
+            <w:r/>
+            <w:r>
+              <w:rPr>
+                <w:b/>
+                <w:sz w:val="18"/>
+              </w:rPr>
+              <w:t>URL corregida</w:t>
+            </w:r>
+          </w:p>
+        </w:tc>
+        <w:tc>
+          <w:tcPr>
+            <w:tcW w:type="dxa" w:w="7483"/>
+          </w:tcPr>
+          <w:p>
+            <w:r/>
+            <w:r>
+              <w:rPr>
+                <w:sz w:val="18"/>
+              </w:rPr>
+              <w:t>https://174-129-56-84.sslip.io/setup/procesalogin.php</w:t>
+            </w:r>
+          </w:p>
+        </w:tc>
+      </w:tr>
+      <w:tr>
+        <w:tc>
+          <w:tcPr>
+            <w:tcW w:type="dxa" w:w="2154"/>
+            <w:shd w:val="clear" w:color="auto" w:fill="DCE6F0"/>
+          </w:tcPr>
+          <w:p>
+            <w:r/>
+            <w:r>
+              <w:rPr>
+                <w:b/>
+                <w:sz w:val="18"/>
+              </w:rPr>
+              <w:t>Petición / vector</w:t>
             </w:r>
           </w:p>
         </w:tc>
@@ -4175,6 +4333,57 @@
     <w:p/>
     <w:p>
       <w:pPr>
+        <w:jc w:val="center"/>
+      </w:pPr>
+      <w:r>
+        <w:drawing>
+          <wp:inline xmlns:a="http://schemas.openxmlformats.org/drawingml/2006/main" xmlns:pic="http://schemas.openxmlformats.org/drawingml/2006/picture">
+            <wp:extent cx="5760000" cy="777405"/>
+            <wp:docPr id="1" name="Picture 1"/>
+            <wp:cNvGraphicFramePr>
+              <a:graphicFrameLocks noChangeAspect="1"/>
+            </wp:cNvGraphicFramePr>
+            <a:graphic>
+              <a:graphicData uri="http://schemas.openxmlformats.org/drawingml/2006/picture">
+                <pic:pic>
+                  <pic:nvPicPr>
+                    <pic:cNvPr id="0" name="VUL-001_original.png"/>
+                    <pic:cNvPicPr/>
+                  </pic:nvPicPr>
+                  <pic:blipFill>
+                    <a:blip r:embed="rId10"/>
+                    <a:stretch>
+                      <a:fillRect/>
+                    </a:stretch>
+                  </pic:blipFill>
+                  <pic:spPr>
+                    <a:xfrm>
+                      <a:off x="0" y="0"/>
+                      <a:ext cx="5760000" cy="777405"/>
+                    </a:xfrm>
+                    <a:prstGeom prst="rect"/>
+                  </pic:spPr>
+                </pic:pic>
+              </a:graphicData>
+            </a:graphic>
+          </wp:inline>
+        </w:drawing>
+      </w:r>
+    </w:p>
+    <w:p>
+      <w:pPr>
+        <w:jc w:val="center"/>
+      </w:pPr>
+      <w:r>
+        <w:rPr>
+          <w:i/>
+          <w:sz w:val="16"/>
+        </w:rPr>
+        <w:t>Captura: VUL-001 — versión original (VUL-001_original.png)</w:t>
+      </w:r>
+    </w:p>
+    <w:p>
+      <w:pPr>
         <w:spacing w:after="40"/>
       </w:pPr>
       <w:r>
@@ -4189,7 +4398,7 @@
       <w:r>
         <w:t xml:space="preserve">Commit Git: </w:t>
       </w:r>
-      <w:hyperlink r:id="rId10">
+      <w:hyperlink r:id="rId11">
         <w:r>
           <w:rPr>
             <w:color w:val="0563C1"/>
@@ -4201,7 +4410,7 @@
       <w:r>
         <w:t xml:space="preserve">  ·  </w:t>
       </w:r>
-      <w:hyperlink r:id="rId11">
+      <w:hyperlink r:id="rId12">
         <w:r>
           <w:rPr>
             <w:color w:val="0563C1"/>
@@ -4439,6 +4648,57 @@
     </w:tbl>
     <w:p>
       <w:pPr>
+        <w:jc w:val="center"/>
+      </w:pPr>
+      <w:r>
+        <w:drawing>
+          <wp:inline xmlns:a="http://schemas.openxmlformats.org/drawingml/2006/main" xmlns:pic="http://schemas.openxmlformats.org/drawingml/2006/picture">
+            <wp:extent cx="5760000" cy="1607512"/>
+            <wp:docPr id="2" name="Picture 2"/>
+            <wp:cNvGraphicFramePr>
+              <a:graphicFrameLocks noChangeAspect="1"/>
+            </wp:cNvGraphicFramePr>
+            <a:graphic>
+              <a:graphicData uri="http://schemas.openxmlformats.org/drawingml/2006/picture">
+                <pic:pic>
+                  <pic:nvPicPr>
+                    <pic:cNvPr id="0" name="VUL-001_corregida.png"/>
+                    <pic:cNvPicPr/>
+                  </pic:nvPicPr>
+                  <pic:blipFill>
+                    <a:blip r:embed="rId13"/>
+                    <a:stretch>
+                      <a:fillRect/>
+                    </a:stretch>
+                  </pic:blipFill>
+                  <pic:spPr>
+                    <a:xfrm>
+                      <a:off x="0" y="0"/>
+                      <a:ext cx="5760000" cy="1607512"/>
+                    </a:xfrm>
+                    <a:prstGeom prst="rect"/>
+                  </pic:spPr>
+                </pic:pic>
+              </a:graphicData>
+            </a:graphic>
+          </wp:inline>
+        </w:drawing>
+      </w:r>
+    </w:p>
+    <w:p>
+      <w:pPr>
+        <w:jc w:val="center"/>
+      </w:pPr>
+      <w:r>
+        <w:rPr>
+          <w:i/>
+          <w:sz w:val="16"/>
+        </w:rPr>
+        <w:t>Captura: VUL-001 — versión corregida (VUL-001_corregida.png)</w:t>
+      </w:r>
+    </w:p>
+    <w:p>
+      <w:pPr>
         <w:pStyle w:val="Heading2"/>
         <w:pageBreakBefore/>
       </w:pPr>
@@ -4632,7 +4892,71 @@
                 <w:b/>
                 <w:sz w:val="18"/>
               </w:rPr>
-              <w:t>URL</w:t>
+              <w:t>URL original</w:t>
+            </w:r>
+          </w:p>
+        </w:tc>
+        <w:tc>
+          <w:tcPr>
+            <w:tcW w:type="dxa" w:w="7483"/>
+          </w:tcPr>
+          <w:p>
+            <w:r/>
+            <w:r>
+              <w:rPr>
+                <w:sz w:val="18"/>
+              </w:rPr>
+              <w:t>http://52.2.60.65:8080/index.php?id=0 UNION SELECT 1-- -</w:t>
+            </w:r>
+          </w:p>
+        </w:tc>
+      </w:tr>
+      <w:tr>
+        <w:tc>
+          <w:tcPr>
+            <w:tcW w:type="dxa" w:w="2154"/>
+            <w:shd w:val="clear" w:color="auto" w:fill="DCE6F0"/>
+          </w:tcPr>
+          <w:p>
+            <w:r/>
+            <w:r>
+              <w:rPr>
+                <w:b/>
+                <w:sz w:val="18"/>
+              </w:rPr>
+              <w:t>URL corregida</w:t>
+            </w:r>
+          </w:p>
+        </w:tc>
+        <w:tc>
+          <w:tcPr>
+            <w:tcW w:type="dxa" w:w="7483"/>
+          </w:tcPr>
+          <w:p>
+            <w:r/>
+            <w:r>
+              <w:rPr>
+                <w:sz w:val="18"/>
+              </w:rPr>
+              <w:t>https://174-129-56-84.sslip.io/index.php?id=0 UNION SELECT 1-- -</w:t>
+            </w:r>
+          </w:p>
+        </w:tc>
+      </w:tr>
+      <w:tr>
+        <w:tc>
+          <w:tcPr>
+            <w:tcW w:type="dxa" w:w="2154"/>
+            <w:shd w:val="clear" w:color="auto" w:fill="DCE6F0"/>
+          </w:tcPr>
+          <w:p>
+            <w:r/>
+            <w:r>
+              <w:rPr>
+                <w:b/>
+                <w:sz w:val="18"/>
+              </w:rPr>
+              <w:t>Petición / vector</w:t>
             </w:r>
           </w:p>
         </w:tc>
@@ -4837,7 +5161,7 @@
       <w:r>
         <w:t xml:space="preserve">Commit Git: </w:t>
       </w:r>
-      <w:hyperlink r:id="rId12">
+      <w:hyperlink r:id="rId14">
         <w:r>
           <w:rPr>
             <w:color w:val="0563C1"/>
@@ -5268,7 +5592,71 @@
                 <w:b/>
                 <w:sz w:val="18"/>
               </w:rPr>
-              <w:t>URL</w:t>
+              <w:t>URL original</w:t>
+            </w:r>
+          </w:p>
+        </w:tc>
+        <w:tc>
+          <w:tcPr>
+            <w:tcW w:type="dxa" w:w="7483"/>
+          </w:tcPr>
+          <w:p>
+            <w:r/>
+            <w:r>
+              <w:rPr>
+                <w:sz w:val="18"/>
+              </w:rPr>
+              <w:t>http://52.2.60.65:8080/index.php?id=0 UNION SELECT 1-- -</w:t>
+            </w:r>
+          </w:p>
+        </w:tc>
+      </w:tr>
+      <w:tr>
+        <w:tc>
+          <w:tcPr>
+            <w:tcW w:type="dxa" w:w="2154"/>
+            <w:shd w:val="clear" w:color="auto" w:fill="DCE6F0"/>
+          </w:tcPr>
+          <w:p>
+            <w:r/>
+            <w:r>
+              <w:rPr>
+                <w:b/>
+                <w:sz w:val="18"/>
+              </w:rPr>
+              <w:t>URL corregida</w:t>
+            </w:r>
+          </w:p>
+        </w:tc>
+        <w:tc>
+          <w:tcPr>
+            <w:tcW w:type="dxa" w:w="7483"/>
+          </w:tcPr>
+          <w:p>
+            <w:r/>
+            <w:r>
+              <w:rPr>
+                <w:sz w:val="18"/>
+              </w:rPr>
+              <w:t>https://174-129-56-84.sslip.io/index.php?id=0 UNION SELECT 1-- -</w:t>
+            </w:r>
+          </w:p>
+        </w:tc>
+      </w:tr>
+      <w:tr>
+        <w:tc>
+          <w:tcPr>
+            <w:tcW w:type="dxa" w:w="2154"/>
+            <w:shd w:val="clear" w:color="auto" w:fill="DCE6F0"/>
+          </w:tcPr>
+          <w:p>
+            <w:r/>
+            <w:r>
+              <w:rPr>
+                <w:b/>
+                <w:sz w:val="18"/>
+              </w:rPr>
+              <w:t>Petición / vector</w:t>
             </w:r>
           </w:p>
         </w:tc>
@@ -5489,7 +5877,7 @@
       <w:r>
         <w:t xml:space="preserve">Commit Git: </w:t>
       </w:r>
-      <w:hyperlink r:id="rId12">
+      <w:hyperlink r:id="rId14">
         <w:r>
           <w:rPr>
             <w:color w:val="0563C1"/>
@@ -5888,7 +6276,71 @@
                 <w:b/>
                 <w:sz w:val="18"/>
               </w:rPr>
-              <w:t>URL</w:t>
+              <w:t>URL original</w:t>
+            </w:r>
+          </w:p>
+        </w:tc>
+        <w:tc>
+          <w:tcPr>
+            <w:tcW w:type="dxa" w:w="7483"/>
+          </w:tcPr>
+          <w:p>
+            <w:r/>
+            <w:r>
+              <w:rPr>
+                <w:sz w:val="18"/>
+              </w:rPr>
+              <w:t>http://52.2.60.65:8080/index.php?id=0 UNION SELECT 1-- -</w:t>
+            </w:r>
+          </w:p>
+        </w:tc>
+      </w:tr>
+      <w:tr>
+        <w:tc>
+          <w:tcPr>
+            <w:tcW w:type="dxa" w:w="2154"/>
+            <w:shd w:val="clear" w:color="auto" w:fill="DCE6F0"/>
+          </w:tcPr>
+          <w:p>
+            <w:r/>
+            <w:r>
+              <w:rPr>
+                <w:b/>
+                <w:sz w:val="18"/>
+              </w:rPr>
+              <w:t>URL corregida</w:t>
+            </w:r>
+          </w:p>
+        </w:tc>
+        <w:tc>
+          <w:tcPr>
+            <w:tcW w:type="dxa" w:w="7483"/>
+          </w:tcPr>
+          <w:p>
+            <w:r/>
+            <w:r>
+              <w:rPr>
+                <w:sz w:val="18"/>
+              </w:rPr>
+              <w:t>https://174-129-56-84.sslip.io/index.php?id=0 UNION SELECT 1-- -</w:t>
+            </w:r>
+          </w:p>
+        </w:tc>
+      </w:tr>
+      <w:tr>
+        <w:tc>
+          <w:tcPr>
+            <w:tcW w:type="dxa" w:w="2154"/>
+            <w:shd w:val="clear" w:color="auto" w:fill="DCE6F0"/>
+          </w:tcPr>
+          <w:p>
+            <w:r/>
+            <w:r>
+              <w:rPr>
+                <w:b/>
+                <w:sz w:val="18"/>
+              </w:rPr>
+              <w:t>Petición / vector</w:t>
             </w:r>
           </w:p>
         </w:tc>
@@ -6101,7 +6553,7 @@
       <w:r>
         <w:t xml:space="preserve">Commit Git: </w:t>
       </w:r>
-      <w:hyperlink r:id="rId12">
+      <w:hyperlink r:id="rId14">
         <w:r>
           <w:rPr>
             <w:color w:val="0563C1"/>
@@ -6540,7 +6992,71 @@
                 <w:b/>
                 <w:sz w:val="18"/>
               </w:rPr>
-              <w:t>URL</w:t>
+              <w:t>URL original</w:t>
+            </w:r>
+          </w:p>
+        </w:tc>
+        <w:tc>
+          <w:tcPr>
+            <w:tcW w:type="dxa" w:w="7483"/>
+          </w:tcPr>
+          <w:p>
+            <w:r/>
+            <w:r>
+              <w:rPr>
+                <w:sz w:val="18"/>
+              </w:rPr>
+              <w:t>http://52.2.60.65:8080/index.php?id=0 UNION SELECT 1-- -</w:t>
+            </w:r>
+          </w:p>
+        </w:tc>
+      </w:tr>
+      <w:tr>
+        <w:tc>
+          <w:tcPr>
+            <w:tcW w:type="dxa" w:w="2154"/>
+            <w:shd w:val="clear" w:color="auto" w:fill="DCE6F0"/>
+          </w:tcPr>
+          <w:p>
+            <w:r/>
+            <w:r>
+              <w:rPr>
+                <w:b/>
+                <w:sz w:val="18"/>
+              </w:rPr>
+              <w:t>URL corregida</w:t>
+            </w:r>
+          </w:p>
+        </w:tc>
+        <w:tc>
+          <w:tcPr>
+            <w:tcW w:type="dxa" w:w="7483"/>
+          </w:tcPr>
+          <w:p>
+            <w:r/>
+            <w:r>
+              <w:rPr>
+                <w:sz w:val="18"/>
+              </w:rPr>
+              <w:t>https://174-129-56-84.sslip.io/index.php?id=0 UNION SELECT 1-- -</w:t>
+            </w:r>
+          </w:p>
+        </w:tc>
+      </w:tr>
+      <w:tr>
+        <w:tc>
+          <w:tcPr>
+            <w:tcW w:type="dxa" w:w="2154"/>
+            <w:shd w:val="clear" w:color="auto" w:fill="DCE6F0"/>
+          </w:tcPr>
+          <w:p>
+            <w:r/>
+            <w:r>
+              <w:rPr>
+                <w:b/>
+                <w:sz w:val="18"/>
+              </w:rPr>
+              <w:t>Petición / vector</w:t>
             </w:r>
           </w:p>
         </w:tc>
@@ -6745,7 +7261,7 @@
       <w:r>
         <w:t xml:space="preserve">Commit Git: </w:t>
       </w:r>
-      <w:hyperlink r:id="rId12">
+      <w:hyperlink r:id="rId14">
         <w:r>
           <w:rPr>
             <w:color w:val="0563C1"/>
@@ -6757,7 +7273,7 @@
       <w:r>
         <w:t xml:space="preserve">  ·  </w:t>
       </w:r>
-      <w:hyperlink r:id="rId13">
+      <w:hyperlink r:id="rId15">
         <w:r>
           <w:rPr>
             <w:color w:val="0563C1"/>
@@ -7132,7 +7648,71 @@
                 <w:b/>
                 <w:sz w:val="18"/>
               </w:rPr>
-              <w:t>URL</w:t>
+              <w:t>URL original</w:t>
+            </w:r>
+          </w:p>
+        </w:tc>
+        <w:tc>
+          <w:tcPr>
+            <w:tcW w:type="dxa" w:w="7483"/>
+          </w:tcPr>
+          <w:p>
+            <w:r/>
+            <w:r>
+              <w:rPr>
+                <w:sz w:val="18"/>
+              </w:rPr>
+              <w:t>http://52.2.60.65:8080/mostrar_carrito.php?id=1 OR 1=1</w:t>
+            </w:r>
+          </w:p>
+        </w:tc>
+      </w:tr>
+      <w:tr>
+        <w:tc>
+          <w:tcPr>
+            <w:tcW w:type="dxa" w:w="2154"/>
+            <w:shd w:val="clear" w:color="auto" w:fill="DCE6F0"/>
+          </w:tcPr>
+          <w:p>
+            <w:r/>
+            <w:r>
+              <w:rPr>
+                <w:b/>
+                <w:sz w:val="18"/>
+              </w:rPr>
+              <w:t>URL corregida</w:t>
+            </w:r>
+          </w:p>
+        </w:tc>
+        <w:tc>
+          <w:tcPr>
+            <w:tcW w:type="dxa" w:w="7483"/>
+          </w:tcPr>
+          <w:p>
+            <w:r/>
+            <w:r>
+              <w:rPr>
+                <w:sz w:val="18"/>
+              </w:rPr>
+              <w:t>https://174-129-56-84.sslip.io/mostrar_carrito.php?id=1 OR 1=1</w:t>
+            </w:r>
+          </w:p>
+        </w:tc>
+      </w:tr>
+      <w:tr>
+        <w:tc>
+          <w:tcPr>
+            <w:tcW w:type="dxa" w:w="2154"/>
+            <w:shd w:val="clear" w:color="auto" w:fill="DCE6F0"/>
+          </w:tcPr>
+          <w:p>
+            <w:r/>
+            <w:r>
+              <w:rPr>
+                <w:b/>
+                <w:sz w:val="18"/>
+              </w:rPr>
+              <w:t>Petición / vector</w:t>
             </w:r>
           </w:p>
         </w:tc>
@@ -7337,7 +7917,7 @@
       <w:r>
         <w:t xml:space="preserve">Commit Git: </w:t>
       </w:r>
-      <w:hyperlink r:id="rId12">
+      <w:hyperlink r:id="rId14">
         <w:r>
           <w:rPr>
             <w:color w:val="0563C1"/>
@@ -7760,7 +8340,71 @@
                 <w:b/>
                 <w:sz w:val="18"/>
               </w:rPr>
-              <w:t>URL</w:t>
+              <w:t>URL original</w:t>
+            </w:r>
+          </w:p>
+        </w:tc>
+        <w:tc>
+          <w:tcPr>
+            <w:tcW w:type="dxa" w:w="7483"/>
+          </w:tcPr>
+          <w:p>
+            <w:r/>
+            <w:r>
+              <w:rPr>
+                <w:sz w:val="18"/>
+              </w:rPr>
+              <w:t>http://52.2.60.65:8080/carrito.php</w:t>
+            </w:r>
+          </w:p>
+        </w:tc>
+      </w:tr>
+      <w:tr>
+        <w:tc>
+          <w:tcPr>
+            <w:tcW w:type="dxa" w:w="2154"/>
+            <w:shd w:val="clear" w:color="auto" w:fill="DCE6F0"/>
+          </w:tcPr>
+          <w:p>
+            <w:r/>
+            <w:r>
+              <w:rPr>
+                <w:b/>
+                <w:sz w:val="18"/>
+              </w:rPr>
+              <w:t>URL corregida</w:t>
+            </w:r>
+          </w:p>
+        </w:tc>
+        <w:tc>
+          <w:tcPr>
+            <w:tcW w:type="dxa" w:w="7483"/>
+          </w:tcPr>
+          <w:p>
+            <w:r/>
+            <w:r>
+              <w:rPr>
+                <w:sz w:val="18"/>
+              </w:rPr>
+              <w:t>https://174-129-56-84.sslip.io/carrito.php</w:t>
+            </w:r>
+          </w:p>
+        </w:tc>
+      </w:tr>
+      <w:tr>
+        <w:tc>
+          <w:tcPr>
+            <w:tcW w:type="dxa" w:w="2154"/>
+            <w:shd w:val="clear" w:color="auto" w:fill="DCE6F0"/>
+          </w:tcPr>
+          <w:p>
+            <w:r/>
+            <w:r>
+              <w:rPr>
+                <w:b/>
+                <w:sz w:val="18"/>
+              </w:rPr>
+              <w:t>Petición / vector</w:t>
             </w:r>
           </w:p>
         </w:tc>
@@ -7973,7 +8617,7 @@
       <w:r>
         <w:t xml:space="preserve">Commit Git: </w:t>
       </w:r>
-      <w:hyperlink r:id="rId14">
+      <w:hyperlink r:id="rId16">
         <w:r>
           <w:rPr>
             <w:color w:val="0563C1"/>
@@ -8420,7 +9064,71 @@
                 <w:b/>
                 <w:sz w:val="18"/>
               </w:rPr>
-              <w:t>URL</w:t>
+              <w:t>URL original</w:t>
+            </w:r>
+          </w:p>
+        </w:tc>
+        <w:tc>
+          <w:tcPr>
+            <w:tcW w:type="dxa" w:w="7483"/>
+          </w:tcPr>
+          <w:p>
+            <w:r/>
+            <w:r>
+              <w:rPr>
+                <w:sz w:val="18"/>
+              </w:rPr>
+              <w:t>http://52.2.60.65:8080/grcomentarios.php</w:t>
+            </w:r>
+          </w:p>
+        </w:tc>
+      </w:tr>
+      <w:tr>
+        <w:tc>
+          <w:tcPr>
+            <w:tcW w:type="dxa" w:w="2154"/>
+            <w:shd w:val="clear" w:color="auto" w:fill="DCE6F0"/>
+          </w:tcPr>
+          <w:p>
+            <w:r/>
+            <w:r>
+              <w:rPr>
+                <w:b/>
+                <w:sz w:val="18"/>
+              </w:rPr>
+              <w:t>URL corregida</w:t>
+            </w:r>
+          </w:p>
+        </w:tc>
+        <w:tc>
+          <w:tcPr>
+            <w:tcW w:type="dxa" w:w="7483"/>
+          </w:tcPr>
+          <w:p>
+            <w:r/>
+            <w:r>
+              <w:rPr>
+                <w:sz w:val="18"/>
+              </w:rPr>
+              <w:t>https://174-129-56-84.sslip.io/grcomentarios.php</w:t>
+            </w:r>
+          </w:p>
+        </w:tc>
+      </w:tr>
+      <w:tr>
+        <w:tc>
+          <w:tcPr>
+            <w:tcW w:type="dxa" w:w="2154"/>
+            <w:shd w:val="clear" w:color="auto" w:fill="DCE6F0"/>
+          </w:tcPr>
+          <w:p>
+            <w:r/>
+            <w:r>
+              <w:rPr>
+                <w:b/>
+                <w:sz w:val="18"/>
+              </w:rPr>
+              <w:t>Petición / vector</w:t>
             </w:r>
           </w:p>
         </w:tc>
@@ -8641,7 +9349,7 @@
       <w:r>
         <w:t xml:space="preserve">Commit Git: </w:t>
       </w:r>
-      <w:hyperlink r:id="rId15">
+      <w:hyperlink r:id="rId17">
         <w:r>
           <w:rPr>
             <w:color w:val="0563C1"/>
@@ -9016,7 +9724,71 @@
                 <w:b/>
                 <w:sz w:val="18"/>
               </w:rPr>
-              <w:t>URL</w:t>
+              <w:t>URL original</w:t>
+            </w:r>
+          </w:p>
+        </w:tc>
+        <w:tc>
+          <w:tcPr>
+            <w:tcW w:type="dxa" w:w="7483"/>
+          </w:tcPr>
+          <w:p>
+            <w:r/>
+            <w:r>
+              <w:rPr>
+                <w:sz w:val="18"/>
+              </w:rPr>
+              <w:t>http://52.2.60.65:8080/setup/procesalogin.php</w:t>
+            </w:r>
+          </w:p>
+        </w:tc>
+      </w:tr>
+      <w:tr>
+        <w:tc>
+          <w:tcPr>
+            <w:tcW w:type="dxa" w:w="2154"/>
+            <w:shd w:val="clear" w:color="auto" w:fill="DCE6F0"/>
+          </w:tcPr>
+          <w:p>
+            <w:r/>
+            <w:r>
+              <w:rPr>
+                <w:b/>
+                <w:sz w:val="18"/>
+              </w:rPr>
+              <w:t>URL corregida</w:t>
+            </w:r>
+          </w:p>
+        </w:tc>
+        <w:tc>
+          <w:tcPr>
+            <w:tcW w:type="dxa" w:w="7483"/>
+          </w:tcPr>
+          <w:p>
+            <w:r/>
+            <w:r>
+              <w:rPr>
+                <w:sz w:val="18"/>
+              </w:rPr>
+              <w:t>https://174-129-56-84.sslip.io/setup/procesalogin.php</w:t>
+            </w:r>
+          </w:p>
+        </w:tc>
+      </w:tr>
+      <w:tr>
+        <w:tc>
+          <w:tcPr>
+            <w:tcW w:type="dxa" w:w="2154"/>
+            <w:shd w:val="clear" w:color="auto" w:fill="DCE6F0"/>
+          </w:tcPr>
+          <w:p>
+            <w:r/>
+            <w:r>
+              <w:rPr>
+                <w:b/>
+                <w:sz w:val="18"/>
+              </w:rPr>
+              <w:t>Petición / vector</w:t>
             </w:r>
           </w:p>
         </w:tc>
@@ -9237,7 +10009,7 @@
       <w:r>
         <w:t xml:space="preserve">Commit Git: </w:t>
       </w:r>
-      <w:hyperlink r:id="rId10">
+      <w:hyperlink r:id="rId11">
         <w:r>
           <w:rPr>
             <w:color w:val="0563C1"/>
@@ -9636,7 +10408,71 @@
                 <w:b/>
                 <w:sz w:val="18"/>
               </w:rPr>
-              <w:t>URL</w:t>
+              <w:t>URL original</w:t>
+            </w:r>
+          </w:p>
+        </w:tc>
+        <w:tc>
+          <w:tcPr>
+            <w:tcW w:type="dxa" w:w="7483"/>
+          </w:tcPr>
+          <w:p>
+            <w:r/>
+            <w:r>
+              <w:rPr>
+                <w:sz w:val="18"/>
+              </w:rPr>
+              <w:t>http://52.2.60.65:8080/index.php?id=1</w:t>
+            </w:r>
+          </w:p>
+        </w:tc>
+      </w:tr>
+      <w:tr>
+        <w:tc>
+          <w:tcPr>
+            <w:tcW w:type="dxa" w:w="2154"/>
+            <w:shd w:val="clear" w:color="auto" w:fill="DCE6F0"/>
+          </w:tcPr>
+          <w:p>
+            <w:r/>
+            <w:r>
+              <w:rPr>
+                <w:b/>
+                <w:sz w:val="18"/>
+              </w:rPr>
+              <w:t>URL corregida</w:t>
+            </w:r>
+          </w:p>
+        </w:tc>
+        <w:tc>
+          <w:tcPr>
+            <w:tcW w:type="dxa" w:w="7483"/>
+          </w:tcPr>
+          <w:p>
+            <w:r/>
+            <w:r>
+              <w:rPr>
+                <w:sz w:val="18"/>
+              </w:rPr>
+              <w:t>https://174-129-56-84.sslip.io/index.php?id=1</w:t>
+            </w:r>
+          </w:p>
+        </w:tc>
+      </w:tr>
+      <w:tr>
+        <w:tc>
+          <w:tcPr>
+            <w:tcW w:type="dxa" w:w="2154"/>
+            <w:shd w:val="clear" w:color="auto" w:fill="DCE6F0"/>
+          </w:tcPr>
+          <w:p>
+            <w:r/>
+            <w:r>
+              <w:rPr>
+                <w:b/>
+                <w:sz w:val="18"/>
+              </w:rPr>
+              <w:t>Petición / vector</w:t>
             </w:r>
           </w:p>
         </w:tc>
@@ -9849,7 +10685,7 @@
       <w:r>
         <w:t xml:space="preserve">Commit Git: </w:t>
       </w:r>
-      <w:hyperlink r:id="rId12">
+      <w:hyperlink r:id="rId14">
         <w:r>
           <w:rPr>
             <w:color w:val="0563C1"/>
@@ -9861,7 +10697,7 @@
       <w:r>
         <w:t xml:space="preserve">  ·  </w:t>
       </w:r>
-      <w:hyperlink r:id="rId11">
+      <w:hyperlink r:id="rId12">
         <w:r>
           <w:rPr>
             <w:color w:val="0563C1"/>
@@ -10268,7 +11104,71 @@
                 <w:b/>
                 <w:sz w:val="18"/>
               </w:rPr>
-              <w:t>URL</w:t>
+              <w:t>URL original</w:t>
+            </w:r>
+          </w:p>
+        </w:tc>
+        <w:tc>
+          <w:tcPr>
+            <w:tcW w:type="dxa" w:w="7483"/>
+          </w:tcPr>
+          <w:p>
+            <w:r/>
+            <w:r>
+              <w:rPr>
+                <w:sz w:val="18"/>
+              </w:rPr>
+              <w:t>http://52.2.60.65:8080/setup/procesalogin.php</w:t>
+            </w:r>
+          </w:p>
+        </w:tc>
+      </w:tr>
+      <w:tr>
+        <w:tc>
+          <w:tcPr>
+            <w:tcW w:type="dxa" w:w="2154"/>
+            <w:shd w:val="clear" w:color="auto" w:fill="DCE6F0"/>
+          </w:tcPr>
+          <w:p>
+            <w:r/>
+            <w:r>
+              <w:rPr>
+                <w:b/>
+                <w:sz w:val="18"/>
+              </w:rPr>
+              <w:t>URL corregida</w:t>
+            </w:r>
+          </w:p>
+        </w:tc>
+        <w:tc>
+          <w:tcPr>
+            <w:tcW w:type="dxa" w:w="7483"/>
+          </w:tcPr>
+          <w:p>
+            <w:r/>
+            <w:r>
+              <w:rPr>
+                <w:sz w:val="18"/>
+              </w:rPr>
+              <w:t>https://174-129-56-84.sslip.io/setup/procesalogin.php</w:t>
+            </w:r>
+          </w:p>
+        </w:tc>
+      </w:tr>
+      <w:tr>
+        <w:tc>
+          <w:tcPr>
+            <w:tcW w:type="dxa" w:w="2154"/>
+            <w:shd w:val="clear" w:color="auto" w:fill="DCE6F0"/>
+          </w:tcPr>
+          <w:p>
+            <w:r/>
+            <w:r>
+              <w:rPr>
+                <w:b/>
+                <w:sz w:val="18"/>
+              </w:rPr>
+              <w:t>Petición / vector</w:t>
             </w:r>
           </w:p>
         </w:tc>
@@ -10481,7 +11381,7 @@
       <w:r>
         <w:t xml:space="preserve">Commit Git: </w:t>
       </w:r>
-      <w:hyperlink r:id="rId10">
+      <w:hyperlink r:id="rId11">
         <w:r>
           <w:rPr>
             <w:color w:val="0563C1"/>
@@ -10493,7 +11393,7 @@
       <w:r>
         <w:t xml:space="preserve">  ·  </w:t>
       </w:r>
-      <w:hyperlink r:id="rId12">
+      <w:hyperlink r:id="rId14">
         <w:r>
           <w:rPr>
             <w:color w:val="0563C1"/>
@@ -10505,7 +11405,7 @@
       <w:r>
         <w:t xml:space="preserve">  ·  </w:t>
       </w:r>
-      <w:hyperlink r:id="rId11">
+      <w:hyperlink r:id="rId12">
         <w:r>
           <w:rPr>
             <w:color w:val="0563C1"/>
@@ -10880,7 +11780,71 @@
                 <w:b/>
                 <w:sz w:val="18"/>
               </w:rPr>
-              <w:t>URL</w:t>
+              <w:t>URL original</w:t>
+            </w:r>
+          </w:p>
+        </w:tc>
+        <w:tc>
+          <w:tcPr>
+            <w:tcW w:type="dxa" w:w="7483"/>
+          </w:tcPr>
+          <w:p>
+            <w:r/>
+            <w:r>
+              <w:rPr>
+                <w:sz w:val="18"/>
+              </w:rPr>
+              <w:t>http://52.2.60.65:8080/grcomentarios.php</w:t>
+            </w:r>
+          </w:p>
+        </w:tc>
+      </w:tr>
+      <w:tr>
+        <w:tc>
+          <w:tcPr>
+            <w:tcW w:type="dxa" w:w="2154"/>
+            <w:shd w:val="clear" w:color="auto" w:fill="DCE6F0"/>
+          </w:tcPr>
+          <w:p>
+            <w:r/>
+            <w:r>
+              <w:rPr>
+                <w:b/>
+                <w:sz w:val="18"/>
+              </w:rPr>
+              <w:t>URL corregida</w:t>
+            </w:r>
+          </w:p>
+        </w:tc>
+        <w:tc>
+          <w:tcPr>
+            <w:tcW w:type="dxa" w:w="7483"/>
+          </w:tcPr>
+          <w:p>
+            <w:r/>
+            <w:r>
+              <w:rPr>
+                <w:sz w:val="18"/>
+              </w:rPr>
+              <w:t>https://174-129-56-84.sslip.io/grcomentarios.php</w:t>
+            </w:r>
+          </w:p>
+        </w:tc>
+      </w:tr>
+      <w:tr>
+        <w:tc>
+          <w:tcPr>
+            <w:tcW w:type="dxa" w:w="2154"/>
+            <w:shd w:val="clear" w:color="auto" w:fill="DCE6F0"/>
+          </w:tcPr>
+          <w:p>
+            <w:r/>
+            <w:r>
+              <w:rPr>
+                <w:b/>
+                <w:sz w:val="18"/>
+              </w:rPr>
+              <w:t>Petición / vector</w:t>
             </w:r>
           </w:p>
         </w:tc>
@@ -11085,7 +12049,7 @@
       <w:r>
         <w:t xml:space="preserve">Commit Git: </w:t>
       </w:r>
-      <w:hyperlink r:id="rId15">
+      <w:hyperlink r:id="rId17">
         <w:r>
           <w:rPr>
             <w:color w:val="0563C1"/>
@@ -11097,7 +12061,7 @@
       <w:r>
         <w:t xml:space="preserve">  ·  </w:t>
       </w:r>
-      <w:hyperlink r:id="rId12">
+      <w:hyperlink r:id="rId14">
         <w:r>
           <w:rPr>
             <w:color w:val="0563C1"/>
@@ -11464,7 +12428,71 @@
                 <w:b/>
                 <w:sz w:val="18"/>
               </w:rPr>
-              <w:t>URL</w:t>
+              <w:t>URL original</w:t>
+            </w:r>
+          </w:p>
+        </w:tc>
+        <w:tc>
+          <w:tcPr>
+            <w:tcW w:type="dxa" w:w="7483"/>
+          </w:tcPr>
+          <w:p>
+            <w:r/>
+            <w:r>
+              <w:rPr>
+                <w:sz w:val="18"/>
+              </w:rPr>
+              <w:t>http://52.2.60.65:8080/carrito.php</w:t>
+            </w:r>
+          </w:p>
+        </w:tc>
+      </w:tr>
+      <w:tr>
+        <w:tc>
+          <w:tcPr>
+            <w:tcW w:type="dxa" w:w="2154"/>
+            <w:shd w:val="clear" w:color="auto" w:fill="DCE6F0"/>
+          </w:tcPr>
+          <w:p>
+            <w:r/>
+            <w:r>
+              <w:rPr>
+                <w:b/>
+                <w:sz w:val="18"/>
+              </w:rPr>
+              <w:t>URL corregida</w:t>
+            </w:r>
+          </w:p>
+        </w:tc>
+        <w:tc>
+          <w:tcPr>
+            <w:tcW w:type="dxa" w:w="7483"/>
+          </w:tcPr>
+          <w:p>
+            <w:r/>
+            <w:r>
+              <w:rPr>
+                <w:sz w:val="18"/>
+              </w:rPr>
+              <w:t>https://174-129-56-84.sslip.io/carrito.php</w:t>
+            </w:r>
+          </w:p>
+        </w:tc>
+      </w:tr>
+      <w:tr>
+        <w:tc>
+          <w:tcPr>
+            <w:tcW w:type="dxa" w:w="2154"/>
+            <w:shd w:val="clear" w:color="auto" w:fill="DCE6F0"/>
+          </w:tcPr>
+          <w:p>
+            <w:r/>
+            <w:r>
+              <w:rPr>
+                <w:b/>
+                <w:sz w:val="18"/>
+              </w:rPr>
+              <w:t>Petición / vector</w:t>
             </w:r>
           </w:p>
         </w:tc>
@@ -11677,7 +12705,7 @@
       <w:r>
         <w:t xml:space="preserve">Commit Git: </w:t>
       </w:r>
-      <w:hyperlink r:id="rId14">
+      <w:hyperlink r:id="rId16">
         <w:r>
           <w:rPr>
             <w:color w:val="0563C1"/>
@@ -12060,7 +13088,71 @@
                 <w:b/>
                 <w:sz w:val="18"/>
               </w:rPr>
-              <w:t>URL</w:t>
+              <w:t>URL original</w:t>
+            </w:r>
+          </w:p>
+        </w:tc>
+        <w:tc>
+          <w:tcPr>
+            <w:tcW w:type="dxa" w:w="7483"/>
+          </w:tcPr>
+          <w:p>
+            <w:r/>
+            <w:r>
+              <w:rPr>
+                <w:sz w:val="18"/>
+              </w:rPr>
+              <w:t>http://52.2.60.65:8080/grcomentarios.php</w:t>
+            </w:r>
+          </w:p>
+        </w:tc>
+      </w:tr>
+      <w:tr>
+        <w:tc>
+          <w:tcPr>
+            <w:tcW w:type="dxa" w:w="2154"/>
+            <w:shd w:val="clear" w:color="auto" w:fill="DCE6F0"/>
+          </w:tcPr>
+          <w:p>
+            <w:r/>
+            <w:r>
+              <w:rPr>
+                <w:b/>
+                <w:sz w:val="18"/>
+              </w:rPr>
+              <w:t>URL corregida</w:t>
+            </w:r>
+          </w:p>
+        </w:tc>
+        <w:tc>
+          <w:tcPr>
+            <w:tcW w:type="dxa" w:w="7483"/>
+          </w:tcPr>
+          <w:p>
+            <w:r/>
+            <w:r>
+              <w:rPr>
+                <w:sz w:val="18"/>
+              </w:rPr>
+              <w:t>https://174-129-56-84.sslip.io/grcomentarios.php</w:t>
+            </w:r>
+          </w:p>
+        </w:tc>
+      </w:tr>
+      <w:tr>
+        <w:tc>
+          <w:tcPr>
+            <w:tcW w:type="dxa" w:w="2154"/>
+            <w:shd w:val="clear" w:color="auto" w:fill="DCE6F0"/>
+          </w:tcPr>
+          <w:p>
+            <w:r/>
+            <w:r>
+              <w:rPr>
+                <w:b/>
+                <w:sz w:val="18"/>
+              </w:rPr>
+              <w:t>Petición / vector</w:t>
             </w:r>
           </w:p>
         </w:tc>
@@ -12265,7 +13357,7 @@
       <w:r>
         <w:t xml:space="preserve">Commit Git: </w:t>
       </w:r>
-      <w:hyperlink r:id="rId15">
+      <w:hyperlink r:id="rId17">
         <w:r>
           <w:rPr>
             <w:color w:val="0563C1"/>
@@ -12640,7 +13732,71 @@
                 <w:b/>
                 <w:sz w:val="18"/>
               </w:rPr>
-              <w:t>URL</w:t>
+              <w:t>URL original</w:t>
+            </w:r>
+          </w:p>
+        </w:tc>
+        <w:tc>
+          <w:tcPr>
+            <w:tcW w:type="dxa" w:w="7483"/>
+          </w:tcPr>
+          <w:p>
+            <w:r/>
+            <w:r>
+              <w:rPr>
+                <w:sz w:val="18"/>
+              </w:rPr>
+              <w:t>http://52.2.60.65:8080/index.php?id=999</w:t>
+            </w:r>
+          </w:p>
+        </w:tc>
+      </w:tr>
+      <w:tr>
+        <w:tc>
+          <w:tcPr>
+            <w:tcW w:type="dxa" w:w="2154"/>
+            <w:shd w:val="clear" w:color="auto" w:fill="DCE6F0"/>
+          </w:tcPr>
+          <w:p>
+            <w:r/>
+            <w:r>
+              <w:rPr>
+                <w:b/>
+                <w:sz w:val="18"/>
+              </w:rPr>
+              <w:t>URL corregida</w:t>
+            </w:r>
+          </w:p>
+        </w:tc>
+        <w:tc>
+          <w:tcPr>
+            <w:tcW w:type="dxa" w:w="7483"/>
+          </w:tcPr>
+          <w:p>
+            <w:r/>
+            <w:r>
+              <w:rPr>
+                <w:sz w:val="18"/>
+              </w:rPr>
+              <w:t>https://174-129-56-84.sslip.io/index.php?id=999</w:t>
+            </w:r>
+          </w:p>
+        </w:tc>
+      </w:tr>
+      <w:tr>
+        <w:tc>
+          <w:tcPr>
+            <w:tcW w:type="dxa" w:w="2154"/>
+            <w:shd w:val="clear" w:color="auto" w:fill="DCE6F0"/>
+          </w:tcPr>
+          <w:p>
+            <w:r/>
+            <w:r>
+              <w:rPr>
+                <w:b/>
+                <w:sz w:val="18"/>
+              </w:rPr>
+              <w:t>Petición / vector</w:t>
             </w:r>
           </w:p>
         </w:tc>
@@ -12831,6 +13987,57 @@
     <w:p/>
     <w:p>
       <w:pPr>
+        <w:jc w:val="center"/>
+      </w:pPr>
+      <w:r>
+        <w:drawing>
+          <wp:inline xmlns:a="http://schemas.openxmlformats.org/drawingml/2006/main" xmlns:pic="http://schemas.openxmlformats.org/drawingml/2006/picture">
+            <wp:extent cx="5760000" cy="3052950"/>
+            <wp:docPr id="3" name="Picture 3"/>
+            <wp:cNvGraphicFramePr>
+              <a:graphicFrameLocks noChangeAspect="1"/>
+            </wp:cNvGraphicFramePr>
+            <a:graphic>
+              <a:graphicData uri="http://schemas.openxmlformats.org/drawingml/2006/picture">
+                <pic:pic>
+                  <pic:nvPicPr>
+                    <pic:cNvPr id="0" name="VUL-015_original.png"/>
+                    <pic:cNvPicPr/>
+                  </pic:nvPicPr>
+                  <pic:blipFill>
+                    <a:blip r:embed="rId18"/>
+                    <a:stretch>
+                      <a:fillRect/>
+                    </a:stretch>
+                  </pic:blipFill>
+                  <pic:spPr>
+                    <a:xfrm>
+                      <a:off x="0" y="0"/>
+                      <a:ext cx="5760000" cy="3052950"/>
+                    </a:xfrm>
+                    <a:prstGeom prst="rect"/>
+                  </pic:spPr>
+                </pic:pic>
+              </a:graphicData>
+            </a:graphic>
+          </wp:inline>
+        </w:drawing>
+      </w:r>
+    </w:p>
+    <w:p>
+      <w:pPr>
+        <w:jc w:val="center"/>
+      </w:pPr>
+      <w:r>
+        <w:rPr>
+          <w:i/>
+          <w:sz w:val="16"/>
+        </w:rPr>
+        <w:t>Captura: VUL-015 — versión original (VUL-015_original.png)</w:t>
+      </w:r>
+    </w:p>
+    <w:p>
+      <w:pPr>
         <w:spacing w:after="40"/>
       </w:pPr>
       <w:r>
@@ -12845,7 +14052,7 @@
       <w:r>
         <w:t xml:space="preserve">Commit Git: </w:t>
       </w:r>
-      <w:hyperlink r:id="rId12">
+      <w:hyperlink r:id="rId14">
         <w:r>
           <w:rPr>
             <w:color w:val="0563C1"/>
@@ -13051,6 +14258,57 @@
     </w:tbl>
     <w:p>
       <w:pPr>
+        <w:jc w:val="center"/>
+      </w:pPr>
+      <w:r>
+        <w:drawing>
+          <wp:inline xmlns:a="http://schemas.openxmlformats.org/drawingml/2006/main" xmlns:pic="http://schemas.openxmlformats.org/drawingml/2006/picture">
+            <wp:extent cx="5760000" cy="1734684"/>
+            <wp:docPr id="4" name="Picture 4"/>
+            <wp:cNvGraphicFramePr>
+              <a:graphicFrameLocks noChangeAspect="1"/>
+            </wp:cNvGraphicFramePr>
+            <a:graphic>
+              <a:graphicData uri="http://schemas.openxmlformats.org/drawingml/2006/picture">
+                <pic:pic>
+                  <pic:nvPicPr>
+                    <pic:cNvPr id="0" name="VUL-015_corregida.png"/>
+                    <pic:cNvPicPr/>
+                  </pic:nvPicPr>
+                  <pic:blipFill>
+                    <a:blip r:embed="rId19"/>
+                    <a:stretch>
+                      <a:fillRect/>
+                    </a:stretch>
+                  </pic:blipFill>
+                  <pic:spPr>
+                    <a:xfrm>
+                      <a:off x="0" y="0"/>
+                      <a:ext cx="5760000" cy="1734684"/>
+                    </a:xfrm>
+                    <a:prstGeom prst="rect"/>
+                  </pic:spPr>
+                </pic:pic>
+              </a:graphicData>
+            </a:graphic>
+          </wp:inline>
+        </w:drawing>
+      </w:r>
+    </w:p>
+    <w:p>
+      <w:pPr>
+        <w:jc w:val="center"/>
+      </w:pPr>
+      <w:r>
+        <w:rPr>
+          <w:i/>
+          <w:sz w:val="16"/>
+        </w:rPr>
+        <w:t>Captura: VUL-015 — versión corregida (VUL-015_corregida.png)</w:t>
+      </w:r>
+    </w:p>
+    <w:p>
+      <w:pPr>
         <w:pStyle w:val="Heading2"/>
         <w:pageBreakBefore/>
       </w:pPr>
@@ -13244,7 +14502,71 @@
                 <w:b/>
                 <w:sz w:val="18"/>
               </w:rPr>
-              <w:t>URL</w:t>
+              <w:t>URL original</w:t>
+            </w:r>
+          </w:p>
+        </w:tc>
+        <w:tc>
+          <w:tcPr>
+            <w:tcW w:type="dxa" w:w="7483"/>
+          </w:tcPr>
+          <w:p>
+            <w:r/>
+            <w:r>
+              <w:rPr>
+                <w:sz w:val="18"/>
+              </w:rPr>
+              <w:t>http://52.2.60.65:8080/carrito.php</w:t>
+            </w:r>
+          </w:p>
+        </w:tc>
+      </w:tr>
+      <w:tr>
+        <w:tc>
+          <w:tcPr>
+            <w:tcW w:type="dxa" w:w="2154"/>
+            <w:shd w:val="clear" w:color="auto" w:fill="DCE6F0"/>
+          </w:tcPr>
+          <w:p>
+            <w:r/>
+            <w:r>
+              <w:rPr>
+                <w:b/>
+                <w:sz w:val="18"/>
+              </w:rPr>
+              <w:t>URL corregida</w:t>
+            </w:r>
+          </w:p>
+        </w:tc>
+        <w:tc>
+          <w:tcPr>
+            <w:tcW w:type="dxa" w:w="7483"/>
+          </w:tcPr>
+          <w:p>
+            <w:r/>
+            <w:r>
+              <w:rPr>
+                <w:sz w:val="18"/>
+              </w:rPr>
+              <w:t>https://174-129-56-84.sslip.io/carrito.php</w:t>
+            </w:r>
+          </w:p>
+        </w:tc>
+      </w:tr>
+      <w:tr>
+        <w:tc>
+          <w:tcPr>
+            <w:tcW w:type="dxa" w:w="2154"/>
+            <w:shd w:val="clear" w:color="auto" w:fill="DCE6F0"/>
+          </w:tcPr>
+          <w:p>
+            <w:r/>
+            <w:r>
+              <w:rPr>
+                <w:b/>
+                <w:sz w:val="18"/>
+              </w:rPr>
+              <w:t>Petición / vector</w:t>
             </w:r>
           </w:p>
         </w:tc>
@@ -13449,7 +14771,7 @@
       <w:r>
         <w:t xml:space="preserve">Commit Git: </w:t>
       </w:r>
-      <w:hyperlink r:id="rId14">
+      <w:hyperlink r:id="rId16">
         <w:r>
           <w:rPr>
             <w:color w:val="0563C1"/>
@@ -13824,7 +15146,71 @@
                 <w:b/>
                 <w:sz w:val="18"/>
               </w:rPr>
-              <w:t>URL</w:t>
+              <w:t>URL original</w:t>
+            </w:r>
+          </w:p>
+        </w:tc>
+        <w:tc>
+          <w:tcPr>
+            <w:tcW w:type="dxa" w:w="7483"/>
+          </w:tcPr>
+          <w:p>
+            <w:r/>
+            <w:r>
+              <w:rPr>
+                <w:sz w:val="18"/>
+              </w:rPr>
+              <w:t>http://52.2.60.65:8080/setup/procesalogin.php</w:t>
+            </w:r>
+          </w:p>
+        </w:tc>
+      </w:tr>
+      <w:tr>
+        <w:tc>
+          <w:tcPr>
+            <w:tcW w:type="dxa" w:w="2154"/>
+            <w:shd w:val="clear" w:color="auto" w:fill="DCE6F0"/>
+          </w:tcPr>
+          <w:p>
+            <w:r/>
+            <w:r>
+              <w:rPr>
+                <w:b/>
+                <w:sz w:val="18"/>
+              </w:rPr>
+              <w:t>URL corregida</w:t>
+            </w:r>
+          </w:p>
+        </w:tc>
+        <w:tc>
+          <w:tcPr>
+            <w:tcW w:type="dxa" w:w="7483"/>
+          </w:tcPr>
+          <w:p>
+            <w:r/>
+            <w:r>
+              <w:rPr>
+                <w:sz w:val="18"/>
+              </w:rPr>
+              <w:t>https://174-129-56-84.sslip.io/setup/procesalogin.php</w:t>
+            </w:r>
+          </w:p>
+        </w:tc>
+      </w:tr>
+      <w:tr>
+        <w:tc>
+          <w:tcPr>
+            <w:tcW w:type="dxa" w:w="2154"/>
+            <w:shd w:val="clear" w:color="auto" w:fill="DCE6F0"/>
+          </w:tcPr>
+          <w:p>
+            <w:r/>
+            <w:r>
+              <w:rPr>
+                <w:b/>
+                <w:sz w:val="18"/>
+              </w:rPr>
+              <w:t>Petición / vector</w:t>
             </w:r>
           </w:p>
         </w:tc>
@@ -14045,7 +15431,7 @@
       <w:r>
         <w:t xml:space="preserve">Commit Git: </w:t>
       </w:r>
-      <w:hyperlink r:id="rId10">
+      <w:hyperlink r:id="rId11">
         <w:r>
           <w:rPr>
             <w:color w:val="0563C1"/>
@@ -14057,7 +15443,7 @@
       <w:r>
         <w:t xml:space="preserve">  ·  </w:t>
       </w:r>
-      <w:hyperlink r:id="rId11">
+      <w:hyperlink r:id="rId12">
         <w:r>
           <w:rPr>
             <w:color w:val="0563C1"/>
@@ -14440,7 +15826,71 @@
                 <w:b/>
                 <w:sz w:val="18"/>
               </w:rPr>
-              <w:t>URL</w:t>
+              <w:t>URL original</w:t>
+            </w:r>
+          </w:p>
+        </w:tc>
+        <w:tc>
+          <w:tcPr>
+            <w:tcW w:type="dxa" w:w="7483"/>
+          </w:tcPr>
+          <w:p>
+            <w:r/>
+            <w:r>
+              <w:rPr>
+                <w:sz w:val="18"/>
+              </w:rPr>
+              <w:t>http://52.2.60.65:8080/setup/procesalogin.php</w:t>
+            </w:r>
+          </w:p>
+        </w:tc>
+      </w:tr>
+      <w:tr>
+        <w:tc>
+          <w:tcPr>
+            <w:tcW w:type="dxa" w:w="2154"/>
+            <w:shd w:val="clear" w:color="auto" w:fill="DCE6F0"/>
+          </w:tcPr>
+          <w:p>
+            <w:r/>
+            <w:r>
+              <w:rPr>
+                <w:b/>
+                <w:sz w:val="18"/>
+              </w:rPr>
+              <w:t>URL corregida</w:t>
+            </w:r>
+          </w:p>
+        </w:tc>
+        <w:tc>
+          <w:tcPr>
+            <w:tcW w:type="dxa" w:w="7483"/>
+          </w:tcPr>
+          <w:p>
+            <w:r/>
+            <w:r>
+              <w:rPr>
+                <w:sz w:val="18"/>
+              </w:rPr>
+              <w:t>https://174-129-56-84.sslip.io/setup/procesalogin.php</w:t>
+            </w:r>
+          </w:p>
+        </w:tc>
+      </w:tr>
+      <w:tr>
+        <w:tc>
+          <w:tcPr>
+            <w:tcW w:type="dxa" w:w="2154"/>
+            <w:shd w:val="clear" w:color="auto" w:fill="DCE6F0"/>
+          </w:tcPr>
+          <w:p>
+            <w:r/>
+            <w:r>
+              <w:rPr>
+                <w:b/>
+                <w:sz w:val="18"/>
+              </w:rPr>
+              <w:t>Petición / vector</w:t>
             </w:r>
           </w:p>
         </w:tc>
@@ -14645,7 +16095,7 @@
       <w:r>
         <w:t xml:space="preserve">Commit Git: </w:t>
       </w:r>
-      <w:hyperlink r:id="rId10">
+      <w:hyperlink r:id="rId11">
         <w:r>
           <w:rPr>
             <w:color w:val="0563C1"/>
@@ -14657,7 +16107,7 @@
       <w:r>
         <w:t xml:space="preserve">  ·  </w:t>
       </w:r>
-      <w:hyperlink r:id="rId16">
+      <w:hyperlink r:id="rId20">
         <w:r>
           <w:rPr>
             <w:color w:val="0563C1"/>
@@ -15040,7 +16490,71 @@
                 <w:b/>
                 <w:sz w:val="18"/>
               </w:rPr>
-              <w:t>URL</w:t>
+              <w:t>URL original</w:t>
+            </w:r>
+          </w:p>
+        </w:tc>
+        <w:tc>
+          <w:tcPr>
+            <w:tcW w:type="dxa" w:w="7483"/>
+          </w:tcPr>
+          <w:p>
+            <w:r/>
+            <w:r>
+              <w:rPr>
+                <w:sz w:val="18"/>
+              </w:rPr>
+              <w:t>http://52.2.60.65:8080/setup/setup.php</w:t>
+            </w:r>
+          </w:p>
+        </w:tc>
+      </w:tr>
+      <w:tr>
+        <w:tc>
+          <w:tcPr>
+            <w:tcW w:type="dxa" w:w="2154"/>
+            <w:shd w:val="clear" w:color="auto" w:fill="DCE6F0"/>
+          </w:tcPr>
+          <w:p>
+            <w:r/>
+            <w:r>
+              <w:rPr>
+                <w:b/>
+                <w:sz w:val="18"/>
+              </w:rPr>
+              <w:t>URL corregida</w:t>
+            </w:r>
+          </w:p>
+        </w:tc>
+        <w:tc>
+          <w:tcPr>
+            <w:tcW w:type="dxa" w:w="7483"/>
+          </w:tcPr>
+          <w:p>
+            <w:r/>
+            <w:r>
+              <w:rPr>
+                <w:sz w:val="18"/>
+              </w:rPr>
+              <w:t>https://174-129-56-84.sslip.io/setup/setup.php</w:t>
+            </w:r>
+          </w:p>
+        </w:tc>
+      </w:tr>
+      <w:tr>
+        <w:tc>
+          <w:tcPr>
+            <w:tcW w:type="dxa" w:w="2154"/>
+            <w:shd w:val="clear" w:color="auto" w:fill="DCE6F0"/>
+          </w:tcPr>
+          <w:p>
+            <w:r/>
+            <w:r>
+              <w:rPr>
+                <w:b/>
+                <w:sz w:val="18"/>
+              </w:rPr>
+              <w:t>Petición / vector</w:t>
             </w:r>
           </w:p>
         </w:tc>
@@ -15247,6 +16761,57 @@
     <w:p/>
     <w:p>
       <w:pPr>
+        <w:jc w:val="center"/>
+      </w:pPr>
+      <w:r>
+        <w:drawing>
+          <wp:inline xmlns:a="http://schemas.openxmlformats.org/drawingml/2006/main" xmlns:pic="http://schemas.openxmlformats.org/drawingml/2006/picture">
+            <wp:extent cx="5760000" cy="1671871"/>
+            <wp:docPr id="5" name="Picture 5"/>
+            <wp:cNvGraphicFramePr>
+              <a:graphicFrameLocks noChangeAspect="1"/>
+            </wp:cNvGraphicFramePr>
+            <a:graphic>
+              <a:graphicData uri="http://schemas.openxmlformats.org/drawingml/2006/picture">
+                <pic:pic>
+                  <pic:nvPicPr>
+                    <pic:cNvPr id="0" name="VUL-019_original.png"/>
+                    <pic:cNvPicPr/>
+                  </pic:nvPicPr>
+                  <pic:blipFill>
+                    <a:blip r:embed="rId21"/>
+                    <a:stretch>
+                      <a:fillRect/>
+                    </a:stretch>
+                  </pic:blipFill>
+                  <pic:spPr>
+                    <a:xfrm>
+                      <a:off x="0" y="0"/>
+                      <a:ext cx="5760000" cy="1671871"/>
+                    </a:xfrm>
+                    <a:prstGeom prst="rect"/>
+                  </pic:spPr>
+                </pic:pic>
+              </a:graphicData>
+            </a:graphic>
+          </wp:inline>
+        </w:drawing>
+      </w:r>
+    </w:p>
+    <w:p>
+      <w:pPr>
+        <w:jc w:val="center"/>
+      </w:pPr>
+      <w:r>
+        <w:rPr>
+          <w:i/>
+          <w:sz w:val="16"/>
+        </w:rPr>
+        <w:t>Captura: VUL-019 — versión original (VUL-019_original.png)</w:t>
+      </w:r>
+    </w:p>
+    <w:p>
+      <w:pPr>
         <w:spacing w:after="40"/>
       </w:pPr>
       <w:r>
@@ -15261,7 +16826,7 @@
       <w:r>
         <w:t xml:space="preserve">Commit Git: </w:t>
       </w:r>
-      <w:hyperlink r:id="rId11">
+      <w:hyperlink r:id="rId12">
         <w:r>
           <w:rPr>
             <w:color w:val="0563C1"/>
@@ -15273,7 +16838,7 @@
       <w:r>
         <w:t xml:space="preserve">  ·  </w:t>
       </w:r>
-      <w:hyperlink r:id="rId17">
+      <w:hyperlink r:id="rId22">
         <w:r>
           <w:rPr>
             <w:color w:val="0563C1"/>
@@ -15503,6 +17068,57 @@
     </w:tbl>
     <w:p>
       <w:pPr>
+        <w:jc w:val="center"/>
+      </w:pPr>
+      <w:r>
+        <w:drawing>
+          <wp:inline xmlns:a="http://schemas.openxmlformats.org/drawingml/2006/main" xmlns:pic="http://schemas.openxmlformats.org/drawingml/2006/picture">
+            <wp:extent cx="5760000" cy="1716894"/>
+            <wp:docPr id="6" name="Picture 6"/>
+            <wp:cNvGraphicFramePr>
+              <a:graphicFrameLocks noChangeAspect="1"/>
+            </wp:cNvGraphicFramePr>
+            <a:graphic>
+              <a:graphicData uri="http://schemas.openxmlformats.org/drawingml/2006/picture">
+                <pic:pic>
+                  <pic:nvPicPr>
+                    <pic:cNvPr id="0" name="VUL-019_corregida.png"/>
+                    <pic:cNvPicPr/>
+                  </pic:nvPicPr>
+                  <pic:blipFill>
+                    <a:blip r:embed="rId23"/>
+                    <a:stretch>
+                      <a:fillRect/>
+                    </a:stretch>
+                  </pic:blipFill>
+                  <pic:spPr>
+                    <a:xfrm>
+                      <a:off x="0" y="0"/>
+                      <a:ext cx="5760000" cy="1716894"/>
+                    </a:xfrm>
+                    <a:prstGeom prst="rect"/>
+                  </pic:spPr>
+                </pic:pic>
+              </a:graphicData>
+            </a:graphic>
+          </wp:inline>
+        </w:drawing>
+      </w:r>
+    </w:p>
+    <w:p>
+      <w:pPr>
+        <w:jc w:val="center"/>
+      </w:pPr>
+      <w:r>
+        <w:rPr>
+          <w:i/>
+          <w:sz w:val="16"/>
+        </w:rPr>
+        <w:t>Captura: VUL-019 — versión corregida (VUL-019_corregida.png)</w:t>
+      </w:r>
+    </w:p>
+    <w:p>
+      <w:pPr>
         <w:pStyle w:val="Heading2"/>
         <w:pageBreakBefore/>
       </w:pPr>
@@ -15696,7 +17312,71 @@
                 <w:b/>
                 <w:sz w:val="18"/>
               </w:rPr>
-              <w:t>URL</w:t>
+              <w:t>URL original</w:t>
+            </w:r>
+          </w:p>
+        </w:tc>
+        <w:tc>
+          <w:tcPr>
+            <w:tcW w:type="dxa" w:w="7483"/>
+          </w:tcPr>
+          <w:p>
+            <w:r/>
+            <w:r>
+              <w:rPr>
+                <w:sz w:val="18"/>
+              </w:rPr>
+              <w:t>http://52.2.60.65:8080/carrito.php</w:t>
+            </w:r>
+          </w:p>
+        </w:tc>
+      </w:tr>
+      <w:tr>
+        <w:tc>
+          <w:tcPr>
+            <w:tcW w:type="dxa" w:w="2154"/>
+            <w:shd w:val="clear" w:color="auto" w:fill="DCE6F0"/>
+          </w:tcPr>
+          <w:p>
+            <w:r/>
+            <w:r>
+              <w:rPr>
+                <w:b/>
+                <w:sz w:val="18"/>
+              </w:rPr>
+              <w:t>URL corregida</w:t>
+            </w:r>
+          </w:p>
+        </w:tc>
+        <w:tc>
+          <w:tcPr>
+            <w:tcW w:type="dxa" w:w="7483"/>
+          </w:tcPr>
+          <w:p>
+            <w:r/>
+            <w:r>
+              <w:rPr>
+                <w:sz w:val="18"/>
+              </w:rPr>
+              <w:t>https://174-129-56-84.sslip.io/carrito.php</w:t>
+            </w:r>
+          </w:p>
+        </w:tc>
+      </w:tr>
+      <w:tr>
+        <w:tc>
+          <w:tcPr>
+            <w:tcW w:type="dxa" w:w="2154"/>
+            <w:shd w:val="clear" w:color="auto" w:fill="DCE6F0"/>
+          </w:tcPr>
+          <w:p>
+            <w:r/>
+            <w:r>
+              <w:rPr>
+                <w:b/>
+                <w:sz w:val="18"/>
+              </w:rPr>
+              <w:t>Petición / vector</w:t>
             </w:r>
           </w:p>
         </w:tc>
@@ -15901,7 +17581,7 @@
       <w:r>
         <w:t xml:space="preserve">Commit Git: </w:t>
       </w:r>
-      <w:hyperlink r:id="rId11">
+      <w:hyperlink r:id="rId12">
         <w:r>
           <w:rPr>
             <w:color w:val="0563C1"/>
@@ -15913,7 +17593,7 @@
       <w:r>
         <w:t xml:space="preserve">  ·  </w:t>
       </w:r>
-      <w:hyperlink r:id="rId12">
+      <w:hyperlink r:id="rId14">
         <w:r>
           <w:rPr>
             <w:color w:val="0563C1"/>
@@ -15925,7 +17605,7 @@
       <w:r>
         <w:t xml:space="preserve">  ·  </w:t>
       </w:r>
-      <w:hyperlink r:id="rId14">
+      <w:hyperlink r:id="rId16">
         <w:r>
           <w:rPr>
             <w:color w:val="0563C1"/>
@@ -16308,7 +17988,71 @@
                 <w:b/>
                 <w:sz w:val="18"/>
               </w:rPr>
-              <w:t>URL</w:t>
+              <w:t>URL original</w:t>
+            </w:r>
+          </w:p>
+        </w:tc>
+        <w:tc>
+          <w:tcPr>
+            <w:tcW w:type="dxa" w:w="7483"/>
+          </w:tcPr>
+          <w:p>
+            <w:r/>
+            <w:r>
+              <w:rPr>
+                <w:sz w:val="18"/>
+              </w:rPr>
+              <w:t>http://52.2.60.65:8080/index.php?id=1'</w:t>
+            </w:r>
+          </w:p>
+        </w:tc>
+      </w:tr>
+      <w:tr>
+        <w:tc>
+          <w:tcPr>
+            <w:tcW w:type="dxa" w:w="2154"/>
+            <w:shd w:val="clear" w:color="auto" w:fill="DCE6F0"/>
+          </w:tcPr>
+          <w:p>
+            <w:r/>
+            <w:r>
+              <w:rPr>
+                <w:b/>
+                <w:sz w:val="18"/>
+              </w:rPr>
+              <w:t>URL corregida</w:t>
+            </w:r>
+          </w:p>
+        </w:tc>
+        <w:tc>
+          <w:tcPr>
+            <w:tcW w:type="dxa" w:w="7483"/>
+          </w:tcPr>
+          <w:p>
+            <w:r/>
+            <w:r>
+              <w:rPr>
+                <w:sz w:val="18"/>
+              </w:rPr>
+              <w:t>https://174-129-56-84.sslip.io/index.php?id=1'</w:t>
+            </w:r>
+          </w:p>
+        </w:tc>
+      </w:tr>
+      <w:tr>
+        <w:tc>
+          <w:tcPr>
+            <w:tcW w:type="dxa" w:w="2154"/>
+            <w:shd w:val="clear" w:color="auto" w:fill="DCE6F0"/>
+          </w:tcPr>
+          <w:p>
+            <w:r/>
+            <w:r>
+              <w:rPr>
+                <w:b/>
+                <w:sz w:val="18"/>
+              </w:rPr>
+              <w:t>Petición / vector</w:t>
             </w:r>
           </w:p>
         </w:tc>
@@ -16499,6 +18243,57 @@
     <w:p/>
     <w:p>
       <w:pPr>
+        <w:jc w:val="center"/>
+      </w:pPr>
+      <w:r>
+        <w:drawing>
+          <wp:inline xmlns:a="http://schemas.openxmlformats.org/drawingml/2006/main" xmlns:pic="http://schemas.openxmlformats.org/drawingml/2006/picture">
+            <wp:extent cx="5760000" cy="1897803"/>
+            <wp:docPr id="7" name="Picture 7"/>
+            <wp:cNvGraphicFramePr>
+              <a:graphicFrameLocks noChangeAspect="1"/>
+            </wp:cNvGraphicFramePr>
+            <a:graphic>
+              <a:graphicData uri="http://schemas.openxmlformats.org/drawingml/2006/picture">
+                <pic:pic>
+                  <pic:nvPicPr>
+                    <pic:cNvPr id="0" name="VUL-021_original.png"/>
+                    <pic:cNvPicPr/>
+                  </pic:nvPicPr>
+                  <pic:blipFill>
+                    <a:blip r:embed="rId24"/>
+                    <a:stretch>
+                      <a:fillRect/>
+                    </a:stretch>
+                  </pic:blipFill>
+                  <pic:spPr>
+                    <a:xfrm>
+                      <a:off x="0" y="0"/>
+                      <a:ext cx="5760000" cy="1897803"/>
+                    </a:xfrm>
+                    <a:prstGeom prst="rect"/>
+                  </pic:spPr>
+                </pic:pic>
+              </a:graphicData>
+            </a:graphic>
+          </wp:inline>
+        </w:drawing>
+      </w:r>
+    </w:p>
+    <w:p>
+      <w:pPr>
+        <w:jc w:val="center"/>
+      </w:pPr>
+      <w:r>
+        <w:rPr>
+          <w:i/>
+          <w:sz w:val="16"/>
+        </w:rPr>
+        <w:t>Captura: VUL-021 — versión original (VUL-021_original.png)</w:t>
+      </w:r>
+    </w:p>
+    <w:p>
+      <w:pPr>
         <w:spacing w:after="40"/>
       </w:pPr>
       <w:r>
@@ -16513,7 +18308,7 @@
       <w:r>
         <w:t xml:space="preserve">Commit Git: </w:t>
       </w:r>
-      <w:hyperlink r:id="rId11">
+      <w:hyperlink r:id="rId12">
         <w:r>
           <w:rPr>
             <w:color w:val="0563C1"/>
@@ -16695,6 +18490,57 @@
     </w:tbl>
     <w:p>
       <w:pPr>
+        <w:jc w:val="center"/>
+      </w:pPr>
+      <w:r>
+        <w:drawing>
+          <wp:inline xmlns:a="http://schemas.openxmlformats.org/drawingml/2006/main" xmlns:pic="http://schemas.openxmlformats.org/drawingml/2006/picture">
+            <wp:extent cx="5760000" cy="1569818"/>
+            <wp:docPr id="8" name="Picture 8"/>
+            <wp:cNvGraphicFramePr>
+              <a:graphicFrameLocks noChangeAspect="1"/>
+            </wp:cNvGraphicFramePr>
+            <a:graphic>
+              <a:graphicData uri="http://schemas.openxmlformats.org/drawingml/2006/picture">
+                <pic:pic>
+                  <pic:nvPicPr>
+                    <pic:cNvPr id="0" name="VUL-021_corregida.png"/>
+                    <pic:cNvPicPr/>
+                  </pic:nvPicPr>
+                  <pic:blipFill>
+                    <a:blip r:embed="rId25"/>
+                    <a:stretch>
+                      <a:fillRect/>
+                    </a:stretch>
+                  </pic:blipFill>
+                  <pic:spPr>
+                    <a:xfrm>
+                      <a:off x="0" y="0"/>
+                      <a:ext cx="5760000" cy="1569818"/>
+                    </a:xfrm>
+                    <a:prstGeom prst="rect"/>
+                  </pic:spPr>
+                </pic:pic>
+              </a:graphicData>
+            </a:graphic>
+          </wp:inline>
+        </w:drawing>
+      </w:r>
+    </w:p>
+    <w:p>
+      <w:pPr>
+        <w:jc w:val="center"/>
+      </w:pPr>
+      <w:r>
+        <w:rPr>
+          <w:i/>
+          <w:sz w:val="16"/>
+        </w:rPr>
+        <w:t>Captura: VUL-021 — versión corregida (VUL-021_corregida.png)</w:t>
+      </w:r>
+    </w:p>
+    <w:p>
+      <w:pPr>
         <w:pStyle w:val="Heading2"/>
         <w:pageBreakBefore/>
       </w:pPr>
@@ -16888,7 +18734,71 @@
                 <w:b/>
                 <w:sz w:val="18"/>
               </w:rPr>
-              <w:t>URL</w:t>
+              <w:t>URL original</w:t>
+            </w:r>
+          </w:p>
+        </w:tc>
+        <w:tc>
+          <w:tcPr>
+            <w:tcW w:type="dxa" w:w="7483"/>
+          </w:tcPr>
+          <w:p>
+            <w:r/>
+            <w:r>
+              <w:rPr>
+                <w:sz w:val="18"/>
+              </w:rPr>
+              <w:t>http://52.2.60.65:8080/index.php?id=1</w:t>
+            </w:r>
+          </w:p>
+        </w:tc>
+      </w:tr>
+      <w:tr>
+        <w:tc>
+          <w:tcPr>
+            <w:tcW w:type="dxa" w:w="2154"/>
+            <w:shd w:val="clear" w:color="auto" w:fill="DCE6F0"/>
+          </w:tcPr>
+          <w:p>
+            <w:r/>
+            <w:r>
+              <w:rPr>
+                <w:b/>
+                <w:sz w:val="18"/>
+              </w:rPr>
+              <w:t>URL corregida</w:t>
+            </w:r>
+          </w:p>
+        </w:tc>
+        <w:tc>
+          <w:tcPr>
+            <w:tcW w:type="dxa" w:w="7483"/>
+          </w:tcPr>
+          <w:p>
+            <w:r/>
+            <w:r>
+              <w:rPr>
+                <w:sz w:val="18"/>
+              </w:rPr>
+              <w:t>https://174-129-56-84.sslip.io/index.php?id=1</w:t>
+            </w:r>
+          </w:p>
+        </w:tc>
+      </w:tr>
+      <w:tr>
+        <w:tc>
+          <w:tcPr>
+            <w:tcW w:type="dxa" w:w="2154"/>
+            <w:shd w:val="clear" w:color="auto" w:fill="DCE6F0"/>
+          </w:tcPr>
+          <w:p>
+            <w:r/>
+            <w:r>
+              <w:rPr>
+                <w:b/>
+                <w:sz w:val="18"/>
+              </w:rPr>
+              <w:t>Petición / vector</w:t>
             </w:r>
           </w:p>
         </w:tc>
@@ -17079,6 +18989,57 @@
     <w:p/>
     <w:p>
       <w:pPr>
+        <w:jc w:val="center"/>
+      </w:pPr>
+      <w:r>
+        <w:drawing>
+          <wp:inline xmlns:a="http://schemas.openxmlformats.org/drawingml/2006/main" xmlns:pic="http://schemas.openxmlformats.org/drawingml/2006/picture">
+            <wp:extent cx="5760000" cy="9970355"/>
+            <wp:docPr id="9" name="Picture 9"/>
+            <wp:cNvGraphicFramePr>
+              <a:graphicFrameLocks noChangeAspect="1"/>
+            </wp:cNvGraphicFramePr>
+            <a:graphic>
+              <a:graphicData uri="http://schemas.openxmlformats.org/drawingml/2006/picture">
+                <pic:pic>
+                  <pic:nvPicPr>
+                    <pic:cNvPr id="0" name="VUL-022_original.png"/>
+                    <pic:cNvPicPr/>
+                  </pic:nvPicPr>
+                  <pic:blipFill>
+                    <a:blip r:embed="rId26"/>
+                    <a:stretch>
+                      <a:fillRect/>
+                    </a:stretch>
+                  </pic:blipFill>
+                  <pic:spPr>
+                    <a:xfrm>
+                      <a:off x="0" y="0"/>
+                      <a:ext cx="5760000" cy="9970355"/>
+                    </a:xfrm>
+                    <a:prstGeom prst="rect"/>
+                  </pic:spPr>
+                </pic:pic>
+              </a:graphicData>
+            </a:graphic>
+          </wp:inline>
+        </w:drawing>
+      </w:r>
+    </w:p>
+    <w:p>
+      <w:pPr>
+        <w:jc w:val="center"/>
+      </w:pPr>
+      <w:r>
+        <w:rPr>
+          <w:i/>
+          <w:sz w:val="16"/>
+        </w:rPr>
+        <w:t>Captura: VUL-022 — versión original (VUL-022_original.png)</w:t>
+      </w:r>
+    </w:p>
+    <w:p>
+      <w:pPr>
         <w:spacing w:after="40"/>
       </w:pPr>
       <w:r>
@@ -17093,7 +19054,7 @@
       <w:r>
         <w:t xml:space="preserve">Commit Git: </w:t>
       </w:r>
-      <w:hyperlink r:id="rId11">
+      <w:hyperlink r:id="rId12">
         <w:r>
           <w:rPr>
             <w:color w:val="0563C1"/>
@@ -17299,6 +19260,57 @@
     </w:tbl>
     <w:p>
       <w:pPr>
+        <w:jc w:val="center"/>
+      </w:pPr>
+      <w:r>
+        <w:drawing>
+          <wp:inline xmlns:a="http://schemas.openxmlformats.org/drawingml/2006/main" xmlns:pic="http://schemas.openxmlformats.org/drawingml/2006/picture">
+            <wp:extent cx="5760000" cy="9282038"/>
+            <wp:docPr id="10" name="Picture 10"/>
+            <wp:cNvGraphicFramePr>
+              <a:graphicFrameLocks noChangeAspect="1"/>
+            </wp:cNvGraphicFramePr>
+            <a:graphic>
+              <a:graphicData uri="http://schemas.openxmlformats.org/drawingml/2006/picture">
+                <pic:pic>
+                  <pic:nvPicPr>
+                    <pic:cNvPr id="0" name="VUL-022_corregida.png"/>
+                    <pic:cNvPicPr/>
+                  </pic:nvPicPr>
+                  <pic:blipFill>
+                    <a:blip r:embed="rId27"/>
+                    <a:stretch>
+                      <a:fillRect/>
+                    </a:stretch>
+                  </pic:blipFill>
+                  <pic:spPr>
+                    <a:xfrm>
+                      <a:off x="0" y="0"/>
+                      <a:ext cx="5760000" cy="9282038"/>
+                    </a:xfrm>
+                    <a:prstGeom prst="rect"/>
+                  </pic:spPr>
+                </pic:pic>
+              </a:graphicData>
+            </a:graphic>
+          </wp:inline>
+        </w:drawing>
+      </w:r>
+    </w:p>
+    <w:p>
+      <w:pPr>
+        <w:jc w:val="center"/>
+      </w:pPr>
+      <w:r>
+        <w:rPr>
+          <w:i/>
+          <w:sz w:val="16"/>
+        </w:rPr>
+        <w:t>Captura: VUL-022 — versión corregida (VUL-022_corregida.png)</w:t>
+      </w:r>
+    </w:p>
+    <w:p>
+      <w:pPr>
         <w:pStyle w:val="Heading2"/>
         <w:pageBreakBefore/>
       </w:pPr>
@@ -17492,7 +19504,71 @@
                 <w:b/>
                 <w:sz w:val="18"/>
               </w:rPr>
-              <w:t>URL</w:t>
+              <w:t>URL original</w:t>
+            </w:r>
+          </w:p>
+        </w:tc>
+        <w:tc>
+          <w:tcPr>
+            <w:tcW w:type="dxa" w:w="7483"/>
+          </w:tcPr>
+          <w:p>
+            <w:r/>
+            <w:r>
+              <w:rPr>
+                <w:sz w:val="18"/>
+              </w:rPr>
+              <w:t>http://52.2.60.65:8080/setup/procesalogin.php</w:t>
+            </w:r>
+          </w:p>
+        </w:tc>
+      </w:tr>
+      <w:tr>
+        <w:tc>
+          <w:tcPr>
+            <w:tcW w:type="dxa" w:w="2154"/>
+            <w:shd w:val="clear" w:color="auto" w:fill="DCE6F0"/>
+          </w:tcPr>
+          <w:p>
+            <w:r/>
+            <w:r>
+              <w:rPr>
+                <w:b/>
+                <w:sz w:val="18"/>
+              </w:rPr>
+              <w:t>URL corregida</w:t>
+            </w:r>
+          </w:p>
+        </w:tc>
+        <w:tc>
+          <w:tcPr>
+            <w:tcW w:type="dxa" w:w="7483"/>
+          </w:tcPr>
+          <w:p>
+            <w:r/>
+            <w:r>
+              <w:rPr>
+                <w:sz w:val="18"/>
+              </w:rPr>
+              <w:t>https://174-129-56-84.sslip.io/setup/procesalogin.php</w:t>
+            </w:r>
+          </w:p>
+        </w:tc>
+      </w:tr>
+      <w:tr>
+        <w:tc>
+          <w:tcPr>
+            <w:tcW w:type="dxa" w:w="2154"/>
+            <w:shd w:val="clear" w:color="auto" w:fill="DCE6F0"/>
+          </w:tcPr>
+          <w:p>
+            <w:r/>
+            <w:r>
+              <w:rPr>
+                <w:b/>
+                <w:sz w:val="18"/>
+              </w:rPr>
+              <w:t>Petición / vector</w:t>
             </w:r>
           </w:p>
         </w:tc>
@@ -17697,7 +19773,7 @@
       <w:r>
         <w:t xml:space="preserve">Commit Git: </w:t>
       </w:r>
-      <w:hyperlink r:id="rId18">
+      <w:hyperlink r:id="rId28">
         <w:r>
           <w:rPr>
             <w:color w:val="0563C1"/>
@@ -18096,7 +20172,71 @@
                 <w:b/>
                 <w:sz w:val="18"/>
               </w:rPr>
-              <w:t>URL</w:t>
+              <w:t>URL original</w:t>
+            </w:r>
+          </w:p>
+        </w:tc>
+        <w:tc>
+          <w:tcPr>
+            <w:tcW w:type="dxa" w:w="7483"/>
+          </w:tcPr>
+          <w:p>
+            <w:r/>
+            <w:r>
+              <w:rPr>
+                <w:sz w:val="18"/>
+              </w:rPr>
+              <w:t>http://52.2.60.65:8080/setup/procesalogin.php</w:t>
+            </w:r>
+          </w:p>
+        </w:tc>
+      </w:tr>
+      <w:tr>
+        <w:tc>
+          <w:tcPr>
+            <w:tcW w:type="dxa" w:w="2154"/>
+            <w:shd w:val="clear" w:color="auto" w:fill="DCE6F0"/>
+          </w:tcPr>
+          <w:p>
+            <w:r/>
+            <w:r>
+              <w:rPr>
+                <w:b/>
+                <w:sz w:val="18"/>
+              </w:rPr>
+              <w:t>URL corregida</w:t>
+            </w:r>
+          </w:p>
+        </w:tc>
+        <w:tc>
+          <w:tcPr>
+            <w:tcW w:type="dxa" w:w="7483"/>
+          </w:tcPr>
+          <w:p>
+            <w:r/>
+            <w:r>
+              <w:rPr>
+                <w:sz w:val="18"/>
+              </w:rPr>
+              <w:t>https://174-129-56-84.sslip.io/setup/procesalogin.php</w:t>
+            </w:r>
+          </w:p>
+        </w:tc>
+      </w:tr>
+      <w:tr>
+        <w:tc>
+          <w:tcPr>
+            <w:tcW w:type="dxa" w:w="2154"/>
+            <w:shd w:val="clear" w:color="auto" w:fill="DCE6F0"/>
+          </w:tcPr>
+          <w:p>
+            <w:r/>
+            <w:r>
+              <w:rPr>
+                <w:b/>
+                <w:sz w:val="18"/>
+              </w:rPr>
+              <w:t>Petición / vector</w:t>
             </w:r>
           </w:p>
         </w:tc>
@@ -18309,7 +20449,7 @@
       <w:r>
         <w:t xml:space="preserve">Commit Git: </w:t>
       </w:r>
-      <w:hyperlink r:id="rId16">
+      <w:hyperlink r:id="rId20">
         <w:r>
           <w:rPr>
             <w:color w:val="0563C1"/>
@@ -18676,7 +20816,71 @@
                 <w:b/>
                 <w:sz w:val="18"/>
               </w:rPr>
-              <w:t>URL</w:t>
+              <w:t>URL original</w:t>
+            </w:r>
+          </w:p>
+        </w:tc>
+        <w:tc>
+          <w:tcPr>
+            <w:tcW w:type="dxa" w:w="7483"/>
+          </w:tcPr>
+          <w:p>
+            <w:r/>
+            <w:r>
+              <w:rPr>
+                <w:sz w:val="18"/>
+              </w:rPr>
+              <w:t>http://52.2.60.65:8080/vendors/jquery/jquery-3.2.1.min.js</w:t>
+            </w:r>
+          </w:p>
+        </w:tc>
+      </w:tr>
+      <w:tr>
+        <w:tc>
+          <w:tcPr>
+            <w:tcW w:type="dxa" w:w="2154"/>
+            <w:shd w:val="clear" w:color="auto" w:fill="DCE6F0"/>
+          </w:tcPr>
+          <w:p>
+            <w:r/>
+            <w:r>
+              <w:rPr>
+                <w:b/>
+                <w:sz w:val="18"/>
+              </w:rPr>
+              <w:t>URL corregida</w:t>
+            </w:r>
+          </w:p>
+        </w:tc>
+        <w:tc>
+          <w:tcPr>
+            <w:tcW w:type="dxa" w:w="7483"/>
+          </w:tcPr>
+          <w:p>
+            <w:r/>
+            <w:r>
+              <w:rPr>
+                <w:sz w:val="18"/>
+              </w:rPr>
+              <w:t>https://174-129-56-84.sslip.io/vendors/jquery/jquery-3.2.1.min.js</w:t>
+            </w:r>
+          </w:p>
+        </w:tc>
+      </w:tr>
+      <w:tr>
+        <w:tc>
+          <w:tcPr>
+            <w:tcW w:type="dxa" w:w="2154"/>
+            <w:shd w:val="clear" w:color="auto" w:fill="DCE6F0"/>
+          </w:tcPr>
+          <w:p>
+            <w:r/>
+            <w:r>
+              <w:rPr>
+                <w:b/>
+                <w:sz w:val="18"/>
+              </w:rPr>
+              <w:t>Petición / vector</w:t>
             </w:r>
           </w:p>
         </w:tc>
@@ -18867,6 +21071,57 @@
     <w:p/>
     <w:p>
       <w:pPr>
+        <w:jc w:val="center"/>
+      </w:pPr>
+      <w:r>
+        <w:drawing>
+          <wp:inline xmlns:a="http://schemas.openxmlformats.org/drawingml/2006/main" xmlns:pic="http://schemas.openxmlformats.org/drawingml/2006/picture">
+            <wp:extent cx="5760000" cy="2735850"/>
+            <wp:docPr id="11" name="Picture 11"/>
+            <wp:cNvGraphicFramePr>
+              <a:graphicFrameLocks noChangeAspect="1"/>
+            </wp:cNvGraphicFramePr>
+            <a:graphic>
+              <a:graphicData uri="http://schemas.openxmlformats.org/drawingml/2006/picture">
+                <pic:pic>
+                  <pic:nvPicPr>
+                    <pic:cNvPr id="0" name="VUL-025_original.png"/>
+                    <pic:cNvPicPr/>
+                  </pic:nvPicPr>
+                  <pic:blipFill>
+                    <a:blip r:embed="rId29"/>
+                    <a:stretch>
+                      <a:fillRect/>
+                    </a:stretch>
+                  </pic:blipFill>
+                  <pic:spPr>
+                    <a:xfrm>
+                      <a:off x="0" y="0"/>
+                      <a:ext cx="5760000" cy="2735850"/>
+                    </a:xfrm>
+                    <a:prstGeom prst="rect"/>
+                  </pic:spPr>
+                </pic:pic>
+              </a:graphicData>
+            </a:graphic>
+          </wp:inline>
+        </w:drawing>
+      </w:r>
+    </w:p>
+    <w:p>
+      <w:pPr>
+        <w:jc w:val="center"/>
+      </w:pPr>
+      <w:r>
+        <w:rPr>
+          <w:i/>
+          <w:sz w:val="16"/>
+        </w:rPr>
+        <w:t>Captura: VUL-025 — versión original (VUL-025_original.png)</w:t>
+      </w:r>
+    </w:p>
+    <w:p>
+      <w:pPr>
         <w:spacing w:after="40"/>
       </w:pPr>
       <w:r>
@@ -18881,7 +21136,7 @@
       <w:r>
         <w:t xml:space="preserve">Commit Git: </w:t>
       </w:r>
-      <w:hyperlink r:id="rId19">
+      <w:hyperlink r:id="rId30">
         <w:r>
           <w:rPr>
             <w:color w:val="0563C1"/>
@@ -19039,6 +21294,57 @@
     </w:tbl>
     <w:p>
       <w:pPr>
+        <w:jc w:val="center"/>
+      </w:pPr>
+      <w:r>
+        <w:drawing>
+          <wp:inline xmlns:a="http://schemas.openxmlformats.org/drawingml/2006/main" xmlns:pic="http://schemas.openxmlformats.org/drawingml/2006/picture">
+            <wp:extent cx="5760000" cy="2025708"/>
+            <wp:docPr id="12" name="Picture 12"/>
+            <wp:cNvGraphicFramePr>
+              <a:graphicFrameLocks noChangeAspect="1"/>
+            </wp:cNvGraphicFramePr>
+            <a:graphic>
+              <a:graphicData uri="http://schemas.openxmlformats.org/drawingml/2006/picture">
+                <pic:pic>
+                  <pic:nvPicPr>
+                    <pic:cNvPr id="0" name="VUL-025_corregida.png"/>
+                    <pic:cNvPicPr/>
+                  </pic:nvPicPr>
+                  <pic:blipFill>
+                    <a:blip r:embed="rId31"/>
+                    <a:stretch>
+                      <a:fillRect/>
+                    </a:stretch>
+                  </pic:blipFill>
+                  <pic:spPr>
+                    <a:xfrm>
+                      <a:off x="0" y="0"/>
+                      <a:ext cx="5760000" cy="2025708"/>
+                    </a:xfrm>
+                    <a:prstGeom prst="rect"/>
+                  </pic:spPr>
+                </pic:pic>
+              </a:graphicData>
+            </a:graphic>
+          </wp:inline>
+        </w:drawing>
+      </w:r>
+    </w:p>
+    <w:p>
+      <w:pPr>
+        <w:jc w:val="center"/>
+      </w:pPr>
+      <w:r>
+        <w:rPr>
+          <w:i/>
+          <w:sz w:val="16"/>
+        </w:rPr>
+        <w:t>Captura: VUL-025 — versión corregida (VUL-025_corregida.png)</w:t>
+      </w:r>
+    </w:p>
+    <w:p>
+      <w:pPr>
         <w:pStyle w:val="Heading2"/>
         <w:pageBreakBefore/>
       </w:pPr>
@@ -19232,7 +21538,71 @@
                 <w:b/>
                 <w:sz w:val="18"/>
               </w:rPr>
-              <w:t>URL</w:t>
+              <w:t>URL original</w:t>
+            </w:r>
+          </w:p>
+        </w:tc>
+        <w:tc>
+          <w:tcPr>
+            <w:tcW w:type="dxa" w:w="7483"/>
+          </w:tcPr>
+          <w:p>
+            <w:r/>
+            <w:r>
+              <w:rPr>
+                <w:sz w:val="18"/>
+              </w:rPr>
+              <w:t>http://52.2.60.65:8080/grcomentarios.php</w:t>
+            </w:r>
+          </w:p>
+        </w:tc>
+      </w:tr>
+      <w:tr>
+        <w:tc>
+          <w:tcPr>
+            <w:tcW w:type="dxa" w:w="2154"/>
+            <w:shd w:val="clear" w:color="auto" w:fill="DCE6F0"/>
+          </w:tcPr>
+          <w:p>
+            <w:r/>
+            <w:r>
+              <w:rPr>
+                <w:b/>
+                <w:sz w:val="18"/>
+              </w:rPr>
+              <w:t>URL corregida</w:t>
+            </w:r>
+          </w:p>
+        </w:tc>
+        <w:tc>
+          <w:tcPr>
+            <w:tcW w:type="dxa" w:w="7483"/>
+          </w:tcPr>
+          <w:p>
+            <w:r/>
+            <w:r>
+              <w:rPr>
+                <w:sz w:val="18"/>
+              </w:rPr>
+              <w:t>https://174-129-56-84.sslip.io/grcomentarios.php</w:t>
+            </w:r>
+          </w:p>
+        </w:tc>
+      </w:tr>
+      <w:tr>
+        <w:tc>
+          <w:tcPr>
+            <w:tcW w:type="dxa" w:w="2154"/>
+            <w:shd w:val="clear" w:color="auto" w:fill="DCE6F0"/>
+          </w:tcPr>
+          <w:p>
+            <w:r/>
+            <w:r>
+              <w:rPr>
+                <w:b/>
+                <w:sz w:val="18"/>
+              </w:rPr>
+              <w:t>Petición / vector</w:t>
             </w:r>
           </w:p>
         </w:tc>
@@ -19437,7 +21807,7 @@
       <w:r>
         <w:t xml:space="preserve">Commit Git: </w:t>
       </w:r>
-      <w:hyperlink r:id="rId13">
+      <w:hyperlink r:id="rId15">
         <w:r>
           <w:rPr>
             <w:color w:val="0563C1"/>
@@ -19820,7 +22190,7 @@
                 <w:b/>
                 <w:sz w:val="18"/>
               </w:rPr>
-              <w:t>URL</w:t>
+              <w:t>URL original</w:t>
             </w:r>
           </w:p>
         </w:tc>
@@ -19834,7 +22204,71 @@
               <w:rPr>
                 <w:sz w:val="18"/>
               </w:rPr>
-              <w:t>http://174.129.56.84:8080/index.php?id=1</w:t>
+              <w:t>http://52.2.60.65:8080/index.php?id=1</w:t>
+            </w:r>
+          </w:p>
+        </w:tc>
+      </w:tr>
+      <w:tr>
+        <w:tc>
+          <w:tcPr>
+            <w:tcW w:type="dxa" w:w="2154"/>
+            <w:shd w:val="clear" w:color="auto" w:fill="DCE6F0"/>
+          </w:tcPr>
+          <w:p>
+            <w:r/>
+            <w:r>
+              <w:rPr>
+                <w:b/>
+                <w:sz w:val="18"/>
+              </w:rPr>
+              <w:t>URL corregida</w:t>
+            </w:r>
+          </w:p>
+        </w:tc>
+        <w:tc>
+          <w:tcPr>
+            <w:tcW w:type="dxa" w:w="7483"/>
+          </w:tcPr>
+          <w:p>
+            <w:r/>
+            <w:r>
+              <w:rPr>
+                <w:sz w:val="18"/>
+              </w:rPr>
+              <w:t>https://174-129-56-84.sslip.io/index.php?id=1</w:t>
+            </w:r>
+          </w:p>
+        </w:tc>
+      </w:tr>
+      <w:tr>
+        <w:tc>
+          <w:tcPr>
+            <w:tcW w:type="dxa" w:w="2154"/>
+            <w:shd w:val="clear" w:color="auto" w:fill="DCE6F0"/>
+          </w:tcPr>
+          <w:p>
+            <w:r/>
+            <w:r>
+              <w:rPr>
+                <w:b/>
+                <w:sz w:val="18"/>
+              </w:rPr>
+              <w:t>Petición / vector</w:t>
+            </w:r>
+          </w:p>
+        </w:tc>
+        <w:tc>
+          <w:tcPr>
+            <w:tcW w:type="dxa" w:w="7483"/>
+          </w:tcPr>
+          <w:p>
+            <w:r/>
+            <w:r>
+              <w:rPr>
+                <w:sz w:val="18"/>
+              </w:rPr>
+              <w:t>http://52.2.60.65:8080/index.php?id=1</w:t>
             </w:r>
           </w:p>
         </w:tc>
@@ -20025,7 +22459,7 @@
       <w:r>
         <w:t xml:space="preserve">Commit Git: </w:t>
       </w:r>
-      <w:hyperlink r:id="rId18">
+      <w:hyperlink r:id="rId28">
         <w:r>
           <w:rPr>
             <w:color w:val="0563C1"/>
@@ -20037,7 +22471,7 @@
       <w:r>
         <w:t xml:space="preserve">  ·  </w:t>
       </w:r>
-      <w:hyperlink r:id="rId20">
+      <w:hyperlink r:id="rId32">
         <w:r>
           <w:rPr>
             <w:color w:val="0563C1"/>
@@ -20404,7 +22838,71 @@
                 <w:b/>
                 <w:sz w:val="18"/>
               </w:rPr>
-              <w:t>URL</w:t>
+              <w:t>URL original</w:t>
+            </w:r>
+          </w:p>
+        </w:tc>
+        <w:tc>
+          <w:tcPr>
+            <w:tcW w:type="dxa" w:w="7483"/>
+          </w:tcPr>
+          <w:p>
+            <w:r/>
+            <w:r>
+              <w:rPr>
+                <w:sz w:val="18"/>
+              </w:rPr>
+              <w:t>http://52.2.60.65:8080/index.php?id=1</w:t>
+            </w:r>
+          </w:p>
+        </w:tc>
+      </w:tr>
+      <w:tr>
+        <w:tc>
+          <w:tcPr>
+            <w:tcW w:type="dxa" w:w="2154"/>
+            <w:shd w:val="clear" w:color="auto" w:fill="DCE6F0"/>
+          </w:tcPr>
+          <w:p>
+            <w:r/>
+            <w:r>
+              <w:rPr>
+                <w:b/>
+                <w:sz w:val="18"/>
+              </w:rPr>
+              <w:t>URL corregida</w:t>
+            </w:r>
+          </w:p>
+        </w:tc>
+        <w:tc>
+          <w:tcPr>
+            <w:tcW w:type="dxa" w:w="7483"/>
+          </w:tcPr>
+          <w:p>
+            <w:r/>
+            <w:r>
+              <w:rPr>
+                <w:sz w:val="18"/>
+              </w:rPr>
+              <w:t>https://174-129-56-84.sslip.io/index.php?id=1</w:t>
+            </w:r>
+          </w:p>
+        </w:tc>
+      </w:tr>
+      <w:tr>
+        <w:tc>
+          <w:tcPr>
+            <w:tcW w:type="dxa" w:w="2154"/>
+            <w:shd w:val="clear" w:color="auto" w:fill="DCE6F0"/>
+          </w:tcPr>
+          <w:p>
+            <w:r/>
+            <w:r>
+              <w:rPr>
+                <w:b/>
+                <w:sz w:val="18"/>
+              </w:rPr>
+              <w:t>Petición / vector</w:t>
             </w:r>
           </w:p>
         </w:tc>
@@ -20617,7 +23115,7 @@
       <w:r>
         <w:t xml:space="preserve">Commit Git: </w:t>
       </w:r>
-      <w:hyperlink r:id="rId21">
+      <w:hyperlink r:id="rId33">
         <w:r>
           <w:rPr>
             <w:color w:val="0563C1"/>
@@ -21040,7 +23538,71 @@
                 <w:b/>
                 <w:sz w:val="18"/>
               </w:rPr>
-              <w:t>URL</w:t>
+              <w:t>URL original</w:t>
+            </w:r>
+          </w:p>
+        </w:tc>
+        <w:tc>
+          <w:tcPr>
+            <w:tcW w:type="dxa" w:w="7483"/>
+          </w:tcPr>
+          <w:p>
+            <w:r/>
+            <w:r>
+              <w:rPr>
+                <w:sz w:val="18"/>
+              </w:rPr>
+              <w:t>http://52.2.60.65:8080/index.php?id=1</w:t>
+            </w:r>
+          </w:p>
+        </w:tc>
+      </w:tr>
+      <w:tr>
+        <w:tc>
+          <w:tcPr>
+            <w:tcW w:type="dxa" w:w="2154"/>
+            <w:shd w:val="clear" w:color="auto" w:fill="DCE6F0"/>
+          </w:tcPr>
+          <w:p>
+            <w:r/>
+            <w:r>
+              <w:rPr>
+                <w:b/>
+                <w:sz w:val="18"/>
+              </w:rPr>
+              <w:t>URL corregida</w:t>
+            </w:r>
+          </w:p>
+        </w:tc>
+        <w:tc>
+          <w:tcPr>
+            <w:tcW w:type="dxa" w:w="7483"/>
+          </w:tcPr>
+          <w:p>
+            <w:r/>
+            <w:r>
+              <w:rPr>
+                <w:sz w:val="18"/>
+              </w:rPr>
+              <w:t>https://174-129-56-84.sslip.io/index.php?id=1</w:t>
+            </w:r>
+          </w:p>
+        </w:tc>
+      </w:tr>
+      <w:tr>
+        <w:tc>
+          <w:tcPr>
+            <w:tcW w:type="dxa" w:w="2154"/>
+            <w:shd w:val="clear" w:color="auto" w:fill="DCE6F0"/>
+          </w:tcPr>
+          <w:p>
+            <w:r/>
+            <w:r>
+              <w:rPr>
+                <w:b/>
+                <w:sz w:val="18"/>
+              </w:rPr>
+              <w:t>Petición / vector</w:t>
             </w:r>
           </w:p>
         </w:tc>
@@ -21253,7 +23815,7 @@
       <w:r>
         <w:t xml:space="preserve">Commit Git: </w:t>
       </w:r>
-      <w:hyperlink r:id="rId21">
+      <w:hyperlink r:id="rId33">
         <w:r>
           <w:rPr>
             <w:color w:val="0563C1"/>
@@ -21644,7 +24206,71 @@
                 <w:b/>
                 <w:sz w:val="18"/>
               </w:rPr>
-              <w:t>URL</w:t>
+              <w:t>URL original</w:t>
+            </w:r>
+          </w:p>
+        </w:tc>
+        <w:tc>
+          <w:tcPr>
+            <w:tcW w:type="dxa" w:w="7483"/>
+          </w:tcPr>
+          <w:p>
+            <w:r/>
+            <w:r>
+              <w:rPr>
+                <w:sz w:val="18"/>
+              </w:rPr>
+              <w:t>http://52.2.60.65:8080/vendors/fontawesome/bootstrap.bundle.min.js</w:t>
+            </w:r>
+          </w:p>
+        </w:tc>
+      </w:tr>
+      <w:tr>
+        <w:tc>
+          <w:tcPr>
+            <w:tcW w:type="dxa" w:w="2154"/>
+            <w:shd w:val="clear" w:color="auto" w:fill="DCE6F0"/>
+          </w:tcPr>
+          <w:p>
+            <w:r/>
+            <w:r>
+              <w:rPr>
+                <w:b/>
+                <w:sz w:val="18"/>
+              </w:rPr>
+              <w:t>URL corregida</w:t>
+            </w:r>
+          </w:p>
+        </w:tc>
+        <w:tc>
+          <w:tcPr>
+            <w:tcW w:type="dxa" w:w="7483"/>
+          </w:tcPr>
+          <w:p>
+            <w:r/>
+            <w:r>
+              <w:rPr>
+                <w:sz w:val="18"/>
+              </w:rPr>
+              <w:t>https://174-129-56-84.sslip.io/vendors/fontawesome/bootstrap.bundle.min.js</w:t>
+            </w:r>
+          </w:p>
+        </w:tc>
+      </w:tr>
+      <w:tr>
+        <w:tc>
+          <w:tcPr>
+            <w:tcW w:type="dxa" w:w="2154"/>
+            <w:shd w:val="clear" w:color="auto" w:fill="DCE6F0"/>
+          </w:tcPr>
+          <w:p>
+            <w:r/>
+            <w:r>
+              <w:rPr>
+                <w:b/>
+                <w:sz w:val="18"/>
+              </w:rPr>
+              <w:t>Petición / vector</w:t>
             </w:r>
           </w:p>
         </w:tc>
@@ -21843,6 +24469,57 @@
     <w:p/>
     <w:p>
       <w:pPr>
+        <w:jc w:val="center"/>
+      </w:pPr>
+      <w:r>
+        <w:drawing>
+          <wp:inline xmlns:a="http://schemas.openxmlformats.org/drawingml/2006/main" xmlns:pic="http://schemas.openxmlformats.org/drawingml/2006/picture">
+            <wp:extent cx="5760000" cy="3043585"/>
+            <wp:docPr id="13" name="Picture 13"/>
+            <wp:cNvGraphicFramePr>
+              <a:graphicFrameLocks noChangeAspect="1"/>
+            </wp:cNvGraphicFramePr>
+            <a:graphic>
+              <a:graphicData uri="http://schemas.openxmlformats.org/drawingml/2006/picture">
+                <pic:pic>
+                  <pic:nvPicPr>
+                    <pic:cNvPr id="0" name="VUL-030_original.png"/>
+                    <pic:cNvPicPr/>
+                  </pic:nvPicPr>
+                  <pic:blipFill>
+                    <a:blip r:embed="rId34"/>
+                    <a:stretch>
+                      <a:fillRect/>
+                    </a:stretch>
+                  </pic:blipFill>
+                  <pic:spPr>
+                    <a:xfrm>
+                      <a:off x="0" y="0"/>
+                      <a:ext cx="5760000" cy="3043585"/>
+                    </a:xfrm>
+                    <a:prstGeom prst="rect"/>
+                  </pic:spPr>
+                </pic:pic>
+              </a:graphicData>
+            </a:graphic>
+          </wp:inline>
+        </w:drawing>
+      </w:r>
+    </w:p>
+    <w:p>
+      <w:pPr>
+        <w:jc w:val="center"/>
+      </w:pPr>
+      <w:r>
+        <w:rPr>
+          <w:i/>
+          <w:sz w:val="16"/>
+        </w:rPr>
+        <w:t>Captura: VUL-030 — versión original (VUL-030_original.png)</w:t>
+      </w:r>
+    </w:p>
+    <w:p>
+      <w:pPr>
         <w:spacing w:after="40"/>
       </w:pPr>
       <w:r>
@@ -21857,7 +24534,7 @@
       <w:r>
         <w:t xml:space="preserve">Commit Git: </w:t>
       </w:r>
-      <w:hyperlink r:id="rId22">
+      <w:hyperlink r:id="rId35">
         <w:r>
           <w:rPr>
             <w:color w:val="0563C1"/>
@@ -22071,6 +24748,57 @@
     </w:tbl>
     <w:p>
       <w:pPr>
+        <w:jc w:val="center"/>
+      </w:pPr>
+      <w:r>
+        <w:drawing>
+          <wp:inline xmlns:a="http://schemas.openxmlformats.org/drawingml/2006/main" xmlns:pic="http://schemas.openxmlformats.org/drawingml/2006/picture">
+            <wp:extent cx="5760000" cy="2389244"/>
+            <wp:docPr id="14" name="Picture 14"/>
+            <wp:cNvGraphicFramePr>
+              <a:graphicFrameLocks noChangeAspect="1"/>
+            </wp:cNvGraphicFramePr>
+            <a:graphic>
+              <a:graphicData uri="http://schemas.openxmlformats.org/drawingml/2006/picture">
+                <pic:pic>
+                  <pic:nvPicPr>
+                    <pic:cNvPr id="0" name="VUL-030_corregida.png"/>
+                    <pic:cNvPicPr/>
+                  </pic:nvPicPr>
+                  <pic:blipFill>
+                    <a:blip r:embed="rId36"/>
+                    <a:stretch>
+                      <a:fillRect/>
+                    </a:stretch>
+                  </pic:blipFill>
+                  <pic:spPr>
+                    <a:xfrm>
+                      <a:off x="0" y="0"/>
+                      <a:ext cx="5760000" cy="2389244"/>
+                    </a:xfrm>
+                    <a:prstGeom prst="rect"/>
+                  </pic:spPr>
+                </pic:pic>
+              </a:graphicData>
+            </a:graphic>
+          </wp:inline>
+        </w:drawing>
+      </w:r>
+    </w:p>
+    <w:p>
+      <w:pPr>
+        <w:jc w:val="center"/>
+      </w:pPr>
+      <w:r>
+        <w:rPr>
+          <w:i/>
+          <w:sz w:val="16"/>
+        </w:rPr>
+        <w:t>Captura: VUL-030 — versión corregida (VUL-030_corregida.png)</w:t>
+      </w:r>
+    </w:p>
+    <w:p>
+      <w:pPr>
         <w:pStyle w:val="Heading2"/>
         <w:pageBreakBefore/>
       </w:pPr>
@@ -22264,7 +24992,71 @@
                 <w:b/>
                 <w:sz w:val="18"/>
               </w:rPr>
-              <w:t>URL</w:t>
+              <w:t>URL original</w:t>
+            </w:r>
+          </w:p>
+        </w:tc>
+        <w:tc>
+          <w:tcPr>
+            <w:tcW w:type="dxa" w:w="7483"/>
+          </w:tcPr>
+          <w:p>
+            <w:r/>
+            <w:r>
+              <w:rPr>
+                <w:sz w:val="18"/>
+              </w:rPr>
+              <w:t>http://52.2.60.65:8080/setup/procesalogin.php</w:t>
+            </w:r>
+          </w:p>
+        </w:tc>
+      </w:tr>
+      <w:tr>
+        <w:tc>
+          <w:tcPr>
+            <w:tcW w:type="dxa" w:w="2154"/>
+            <w:shd w:val="clear" w:color="auto" w:fill="DCE6F0"/>
+          </w:tcPr>
+          <w:p>
+            <w:r/>
+            <w:r>
+              <w:rPr>
+                <w:b/>
+                <w:sz w:val="18"/>
+              </w:rPr>
+              <w:t>URL corregida</w:t>
+            </w:r>
+          </w:p>
+        </w:tc>
+        <w:tc>
+          <w:tcPr>
+            <w:tcW w:type="dxa" w:w="7483"/>
+          </w:tcPr>
+          <w:p>
+            <w:r/>
+            <w:r>
+              <w:rPr>
+                <w:sz w:val="18"/>
+              </w:rPr>
+              <w:t>https://174-129-56-84.sslip.io/setup/procesalogin.php</w:t>
+            </w:r>
+          </w:p>
+        </w:tc>
+      </w:tr>
+      <w:tr>
+        <w:tc>
+          <w:tcPr>
+            <w:tcW w:type="dxa" w:w="2154"/>
+            <w:shd w:val="clear" w:color="auto" w:fill="DCE6F0"/>
+          </w:tcPr>
+          <w:p>
+            <w:r/>
+            <w:r>
+              <w:rPr>
+                <w:b/>
+                <w:sz w:val="18"/>
+              </w:rPr>
+              <w:t>Petición / vector</w:t>
             </w:r>
           </w:p>
         </w:tc>
@@ -22477,7 +25269,7 @@
       <w:r>
         <w:t xml:space="preserve">Commit Git: </w:t>
       </w:r>
-      <w:hyperlink r:id="rId23">
+      <w:hyperlink r:id="rId37">
         <w:r>
           <w:rPr>
             <w:color w:val="0563C1"/>
@@ -22844,7 +25636,71 @@
                 <w:b/>
                 <w:sz w:val="18"/>
               </w:rPr>
-              <w:t>URL</w:t>
+              <w:t>URL original</w:t>
+            </w:r>
+          </w:p>
+        </w:tc>
+        <w:tc>
+          <w:tcPr>
+            <w:tcW w:type="dxa" w:w="7483"/>
+          </w:tcPr>
+          <w:p>
+            <w:r/>
+            <w:r>
+              <w:rPr>
+                <w:sz w:val="18"/>
+              </w:rPr>
+              <w:t>http://52.2.60.65:8080/grcomentarios.php</w:t>
+            </w:r>
+          </w:p>
+        </w:tc>
+      </w:tr>
+      <w:tr>
+        <w:tc>
+          <w:tcPr>
+            <w:tcW w:type="dxa" w:w="2154"/>
+            <w:shd w:val="clear" w:color="auto" w:fill="DCE6F0"/>
+          </w:tcPr>
+          <w:p>
+            <w:r/>
+            <w:r>
+              <w:rPr>
+                <w:b/>
+                <w:sz w:val="18"/>
+              </w:rPr>
+              <w:t>URL corregida</w:t>
+            </w:r>
+          </w:p>
+        </w:tc>
+        <w:tc>
+          <w:tcPr>
+            <w:tcW w:type="dxa" w:w="7483"/>
+          </w:tcPr>
+          <w:p>
+            <w:r/>
+            <w:r>
+              <w:rPr>
+                <w:sz w:val="18"/>
+              </w:rPr>
+              <w:t>https://174-129-56-84.sslip.io/grcomentarios.php</w:t>
+            </w:r>
+          </w:p>
+        </w:tc>
+      </w:tr>
+      <w:tr>
+        <w:tc>
+          <w:tcPr>
+            <w:tcW w:type="dxa" w:w="2154"/>
+            <w:shd w:val="clear" w:color="auto" w:fill="DCE6F0"/>
+          </w:tcPr>
+          <w:p>
+            <w:r/>
+            <w:r>
+              <w:rPr>
+                <w:b/>
+                <w:sz w:val="18"/>
+              </w:rPr>
+              <w:t>Petición / vector</w:t>
             </w:r>
           </w:p>
         </w:tc>
@@ -23049,7 +25905,7 @@
       <w:r>
         <w:t xml:space="preserve">Commit Git: </w:t>
       </w:r>
-      <w:hyperlink r:id="rId21">
+      <w:hyperlink r:id="rId33">
         <w:r>
           <w:rPr>
             <w:color w:val="0563C1"/>
@@ -23061,7 +25917,7 @@
       <w:r>
         <w:t xml:space="preserve">  ·  </w:t>
       </w:r>
-      <w:hyperlink r:id="rId23">
+      <w:hyperlink r:id="rId37">
         <w:r>
           <w:rPr>
             <w:color w:val="0563C1"/>
@@ -23452,7 +26308,71 @@
                 <w:b/>
                 <w:sz w:val="18"/>
               </w:rPr>
-              <w:t>URL</w:t>
+              <w:t>URL original</w:t>
+            </w:r>
+          </w:p>
+        </w:tc>
+        <w:tc>
+          <w:tcPr>
+            <w:tcW w:type="dxa" w:w="7483"/>
+          </w:tcPr>
+          <w:p>
+            <w:r/>
+            <w:r>
+              <w:rPr>
+                <w:sz w:val="18"/>
+              </w:rPr>
+              <w:t>http://52.2.60.65:8080/index.php?id=1</w:t>
+            </w:r>
+          </w:p>
+        </w:tc>
+      </w:tr>
+      <w:tr>
+        <w:tc>
+          <w:tcPr>
+            <w:tcW w:type="dxa" w:w="2154"/>
+            <w:shd w:val="clear" w:color="auto" w:fill="DCE6F0"/>
+          </w:tcPr>
+          <w:p>
+            <w:r/>
+            <w:r>
+              <w:rPr>
+                <w:b/>
+                <w:sz w:val="18"/>
+              </w:rPr>
+              <w:t>URL corregida</w:t>
+            </w:r>
+          </w:p>
+        </w:tc>
+        <w:tc>
+          <w:tcPr>
+            <w:tcW w:type="dxa" w:w="7483"/>
+          </w:tcPr>
+          <w:p>
+            <w:r/>
+            <w:r>
+              <w:rPr>
+                <w:sz w:val="18"/>
+              </w:rPr>
+              <w:t>https://174-129-56-84.sslip.io/index.php?id=1</w:t>
+            </w:r>
+          </w:p>
+        </w:tc>
+      </w:tr>
+      <w:tr>
+        <w:tc>
+          <w:tcPr>
+            <w:tcW w:type="dxa" w:w="2154"/>
+            <w:shd w:val="clear" w:color="auto" w:fill="DCE6F0"/>
+          </w:tcPr>
+          <w:p>
+            <w:r/>
+            <w:r>
+              <w:rPr>
+                <w:b/>
+                <w:sz w:val="18"/>
+              </w:rPr>
+              <w:t>Petición / vector</w:t>
             </w:r>
           </w:p>
         </w:tc>
@@ -23657,7 +26577,7 @@
       <w:r>
         <w:t xml:space="preserve">Commit Git: </w:t>
       </w:r>
-      <w:hyperlink r:id="rId20">
+      <w:hyperlink r:id="rId32">
         <w:r>
           <w:rPr>
             <w:color w:val="0563C1"/>
@@ -24056,7 +26976,71 @@
                 <w:b/>
                 <w:sz w:val="18"/>
               </w:rPr>
-              <w:t>URL</w:t>
+              <w:t>URL original</w:t>
+            </w:r>
+          </w:p>
+        </w:tc>
+        <w:tc>
+          <w:tcPr>
+            <w:tcW w:type="dxa" w:w="7483"/>
+          </w:tcPr>
+          <w:p>
+            <w:r/>
+            <w:r>
+              <w:rPr>
+                <w:sz w:val="18"/>
+              </w:rPr>
+              <w:t>http://52.2.60.65:8080/index.php?id=1</w:t>
+            </w:r>
+          </w:p>
+        </w:tc>
+      </w:tr>
+      <w:tr>
+        <w:tc>
+          <w:tcPr>
+            <w:tcW w:type="dxa" w:w="2154"/>
+            <w:shd w:val="clear" w:color="auto" w:fill="DCE6F0"/>
+          </w:tcPr>
+          <w:p>
+            <w:r/>
+            <w:r>
+              <w:rPr>
+                <w:b/>
+                <w:sz w:val="18"/>
+              </w:rPr>
+              <w:t>URL corregida</w:t>
+            </w:r>
+          </w:p>
+        </w:tc>
+        <w:tc>
+          <w:tcPr>
+            <w:tcW w:type="dxa" w:w="7483"/>
+          </w:tcPr>
+          <w:p>
+            <w:r/>
+            <w:r>
+              <w:rPr>
+                <w:sz w:val="18"/>
+              </w:rPr>
+              <w:t>https://174-129-56-84.sslip.io/index.php?id=1</w:t>
+            </w:r>
+          </w:p>
+        </w:tc>
+      </w:tr>
+      <w:tr>
+        <w:tc>
+          <w:tcPr>
+            <w:tcW w:type="dxa" w:w="2154"/>
+            <w:shd w:val="clear" w:color="auto" w:fill="DCE6F0"/>
+          </w:tcPr>
+          <w:p>
+            <w:r/>
+            <w:r>
+              <w:rPr>
+                <w:b/>
+                <w:sz w:val="18"/>
+              </w:rPr>
+              <w:t>Petición / vector</w:t>
             </w:r>
           </w:p>
         </w:tc>
@@ -24301,7 +27285,7 @@
       <w:r>
         <w:t xml:space="preserve">Commit Git: </w:t>
       </w:r>
-      <w:hyperlink r:id="rId24">
+      <w:hyperlink r:id="rId38">
         <w:r>
           <w:rPr>
             <w:color w:val="0563C1"/>
@@ -24515,6 +27499,706 @@
     </w:tbl>
     <w:p>
       <w:pPr>
+        <w:pStyle w:val="Heading2"/>
+        <w:pageBreakBefore/>
+      </w:pPr>
+      <w:r>
+        <w:t>VUL-035 → Versión de Apache visible en cabeceras y páginas de error</w:t>
+      </w:r>
+    </w:p>
+    <w:tbl>
+      <w:tblPr>
+        <w:tblStyle w:val="TableGrid"/>
+        <w:tblW w:type="auto" w:w="0"/>
+        <w:tblLook w:firstColumn="1" w:firstRow="1" w:lastColumn="0" w:lastRow="0" w:noHBand="0" w:noVBand="1" w:val="04A0"/>
+      </w:tblPr>
+      <w:tblGrid>
+        <w:gridCol w:w="4986"/>
+        <w:gridCol w:w="4986"/>
+      </w:tblGrid>
+      <w:tr>
+        <w:tc>
+          <w:tcPr>
+            <w:tcW w:type="dxa" w:w="2154"/>
+            <w:shd w:val="clear" w:color="auto" w:fill="DCE6F0"/>
+          </w:tcPr>
+          <w:p>
+            <w:r/>
+            <w:r>
+              <w:rPr>
+                <w:b/>
+                <w:sz w:val="18"/>
+              </w:rPr>
+              <w:t>Vulnerabilidad</w:t>
+            </w:r>
+          </w:p>
+        </w:tc>
+        <w:tc>
+          <w:tcPr>
+            <w:tcW w:type="dxa" w:w="7483"/>
+          </w:tcPr>
+          <w:p>
+            <w:r/>
+            <w:r>
+              <w:rPr>
+                <w:sz w:val="18"/>
+              </w:rPr>
+              <w:t>Versión de Apache visible en cabeceras y páginas de error</w:t>
+            </w:r>
+          </w:p>
+        </w:tc>
+      </w:tr>
+      <w:tr>
+        <w:tc>
+          <w:tcPr>
+            <w:tcW w:type="dxa" w:w="2154"/>
+            <w:shd w:val="clear" w:color="auto" w:fill="DCE6F0"/>
+          </w:tcPr>
+          <w:p>
+            <w:r/>
+            <w:r>
+              <w:rPr>
+                <w:b/>
+                <w:sz w:val="18"/>
+              </w:rPr>
+              <w:t>Severidad</w:t>
+            </w:r>
+          </w:p>
+        </w:tc>
+        <w:tc>
+          <w:tcPr>
+            <w:tcW w:type="dxa" w:w="7483"/>
+            <w:shd w:val="clear" w:color="auto" w:fill="2E86C1"/>
+          </w:tcPr>
+          <w:p>
+            <w:r/>
+            <w:r>
+              <w:rPr>
+                <w:b/>
+                <w:color w:val="FFFFFF"/>
+                <w:sz w:val="18"/>
+              </w:rPr>
+              <w:t>Baja</w:t>
+            </w:r>
+          </w:p>
+        </w:tc>
+      </w:tr>
+      <w:tr>
+        <w:tc>
+          <w:tcPr>
+            <w:tcW w:type="dxa" w:w="2154"/>
+            <w:shd w:val="clear" w:color="auto" w:fill="DCE6F0"/>
+          </w:tcPr>
+          <w:p>
+            <w:r/>
+            <w:r>
+              <w:rPr>
+                <w:b/>
+                <w:sz w:val="18"/>
+              </w:rPr>
+              <w:t>OWASP Top 10</w:t>
+            </w:r>
+          </w:p>
+        </w:tc>
+        <w:tc>
+          <w:tcPr>
+            <w:tcW w:type="dxa" w:w="7483"/>
+          </w:tcPr>
+          <w:p>
+            <w:r/>
+            <w:r>
+              <w:rPr>
+                <w:sz w:val="18"/>
+              </w:rPr>
+              <w:t>A05:2021 – Security Misconfiguration</w:t>
+            </w:r>
+          </w:p>
+        </w:tc>
+      </w:tr>
+      <w:tr>
+        <w:tc>
+          <w:tcPr>
+            <w:tcW w:type="dxa" w:w="2154"/>
+            <w:shd w:val="clear" w:color="auto" w:fill="DCE6F0"/>
+          </w:tcPr>
+          <w:p>
+            <w:r/>
+            <w:r>
+              <w:rPr>
+                <w:b/>
+                <w:sz w:val="18"/>
+              </w:rPr>
+              <w:t>OWASP ASVS v5.0.0</w:t>
+            </w:r>
+          </w:p>
+        </w:tc>
+        <w:tc>
+          <w:tcPr>
+            <w:tcW w:type="dxa" w:w="7483"/>
+          </w:tcPr>
+          <w:p>
+            <w:r/>
+            <w:r>
+              <w:rPr>
+                <w:sz w:val="18"/>
+              </w:rPr>
+              <w:t>V13 Configuration</w:t>
+            </w:r>
+          </w:p>
+        </w:tc>
+      </w:tr>
+      <w:tr>
+        <w:tc>
+          <w:tcPr>
+            <w:tcW w:type="dxa" w:w="2154"/>
+            <w:shd w:val="clear" w:color="auto" w:fill="DCE6F0"/>
+          </w:tcPr>
+          <w:p>
+            <w:r/>
+            <w:r>
+              <w:rPr>
+                <w:b/>
+                <w:sz w:val="18"/>
+              </w:rPr>
+              <w:t>Descripción</w:t>
+            </w:r>
+          </w:p>
+        </w:tc>
+        <w:tc>
+          <w:tcPr>
+            <w:tcW w:type="dxa" w:w="7483"/>
+          </w:tcPr>
+          <w:p>
+            <w:r/>
+            <w:r>
+              <w:rPr>
+                <w:sz w:val="18"/>
+              </w:rPr>
+              <w:t>Detectado en las capturas del 18/10/2026: las páginas 403/404 y la cabecera Server mostraban "Apache/2.4.58 (Ubuntu)". El archivo de endurecimiento se cargaba antes que security.conf de Ubuntu, que volvía a activar ServerTokens OS y ServerSignature On. Conocer la versión exacta facilita buscar CVE específicos del servidor.</w:t>
+            </w:r>
+          </w:p>
+        </w:tc>
+      </w:tr>
+      <w:tr>
+        <w:tc>
+          <w:tcPr>
+            <w:tcW w:type="dxa" w:w="2154"/>
+            <w:shd w:val="clear" w:color="auto" w:fill="DCE6F0"/>
+          </w:tcPr>
+          <w:p>
+            <w:r/>
+            <w:r>
+              <w:rPr>
+                <w:b/>
+                <w:sz w:val="18"/>
+              </w:rPr>
+              <w:t>URL original</w:t>
+            </w:r>
+          </w:p>
+        </w:tc>
+        <w:tc>
+          <w:tcPr>
+            <w:tcW w:type="dxa" w:w="7483"/>
+          </w:tcPr>
+          <w:p>
+            <w:r/>
+            <w:r>
+              <w:rPr>
+                <w:sz w:val="18"/>
+              </w:rPr>
+              <w:t>http://52.2.60.65:8080/setup/setup.php</w:t>
+            </w:r>
+          </w:p>
+        </w:tc>
+      </w:tr>
+      <w:tr>
+        <w:tc>
+          <w:tcPr>
+            <w:tcW w:type="dxa" w:w="2154"/>
+            <w:shd w:val="clear" w:color="auto" w:fill="DCE6F0"/>
+          </w:tcPr>
+          <w:p>
+            <w:r/>
+            <w:r>
+              <w:rPr>
+                <w:b/>
+                <w:sz w:val="18"/>
+              </w:rPr>
+              <w:t>URL corregida</w:t>
+            </w:r>
+          </w:p>
+        </w:tc>
+        <w:tc>
+          <w:tcPr>
+            <w:tcW w:type="dxa" w:w="7483"/>
+          </w:tcPr>
+          <w:p>
+            <w:r/>
+            <w:r>
+              <w:rPr>
+                <w:sz w:val="18"/>
+              </w:rPr>
+              <w:t>https://174-129-56-84.sslip.io/setup/setup.php</w:t>
+            </w:r>
+          </w:p>
+        </w:tc>
+      </w:tr>
+      <w:tr>
+        <w:tc>
+          <w:tcPr>
+            <w:tcW w:type="dxa" w:w="2154"/>
+            <w:shd w:val="clear" w:color="auto" w:fill="DCE6F0"/>
+          </w:tcPr>
+          <w:p>
+            <w:r/>
+            <w:r>
+              <w:rPr>
+                <w:b/>
+                <w:sz w:val="18"/>
+              </w:rPr>
+              <w:t>Petición / vector</w:t>
+            </w:r>
+          </w:p>
+        </w:tc>
+        <w:tc>
+          <w:tcPr>
+            <w:tcW w:type="dxa" w:w="7483"/>
+          </w:tcPr>
+          <w:p>
+            <w:r/>
+            <w:r>
+              <w:rPr>
+                <w:sz w:val="18"/>
+              </w:rPr>
+              <w:t>Cualquier respuesta; visible en /setup/setup.php (403) y rutas inexistentes (404)</w:t>
+            </w:r>
+          </w:p>
+        </w:tc>
+      </w:tr>
+      <w:tr>
+        <w:tc>
+          <w:tcPr>
+            <w:tcW w:type="dxa" w:w="2154"/>
+            <w:shd w:val="clear" w:color="auto" w:fill="DCE6F0"/>
+          </w:tcPr>
+          <w:p>
+            <w:r/>
+            <w:r>
+              <w:rPr>
+                <w:b/>
+                <w:sz w:val="18"/>
+              </w:rPr>
+              <w:t>Archivo(s)</w:t>
+            </w:r>
+          </w:p>
+        </w:tc>
+        <w:tc>
+          <w:tcPr>
+            <w:tcW w:type="dxa" w:w="7483"/>
+          </w:tcPr>
+          <w:p>
+            <w:r/>
+            <w:r>
+              <w:rPr>
+                <w:sz w:val="18"/>
+              </w:rPr>
+              <w:t>deploy/user-data.sh, tests/test_seguridad.py</w:t>
+            </w:r>
+          </w:p>
+        </w:tc>
+      </w:tr>
+      <w:tr>
+        <w:tc>
+          <w:tcPr>
+            <w:tcW w:type="dxa" w:w="2154"/>
+            <w:shd w:val="clear" w:color="auto" w:fill="DCE6F0"/>
+          </w:tcPr>
+          <w:p>
+            <w:r/>
+            <w:r>
+              <w:rPr>
+                <w:b/>
+                <w:sz w:val="18"/>
+              </w:rPr>
+              <w:t>ISO/IEC 27001:2022</w:t>
+            </w:r>
+          </w:p>
+        </w:tc>
+        <w:tc>
+          <w:tcPr>
+            <w:tcW w:type="dxa" w:w="7483"/>
+          </w:tcPr>
+          <w:p>
+            <w:r/>
+            <w:r>
+              <w:rPr>
+                <w:sz w:val="18"/>
+              </w:rPr>
+              <w:t>A.8.9</w:t>
+            </w:r>
+          </w:p>
+        </w:tc>
+      </w:tr>
+      <w:tr>
+        <w:tc>
+          <w:tcPr>
+            <w:tcW w:type="dxa" w:w="2154"/>
+            <w:shd w:val="clear" w:color="auto" w:fill="DCE6F0"/>
+          </w:tcPr>
+          <w:p>
+            <w:r/>
+            <w:r>
+              <w:rPr>
+                <w:b/>
+                <w:sz w:val="18"/>
+              </w:rPr>
+              <w:t>ISO/IEC 27034 (ASC)</w:t>
+            </w:r>
+          </w:p>
+        </w:tc>
+        <w:tc>
+          <w:tcPr>
+            <w:tcW w:type="dxa" w:w="7483"/>
+          </w:tcPr>
+          <w:p>
+            <w:r/>
+            <w:r>
+              <w:rPr>
+                <w:sz w:val="18"/>
+              </w:rPr>
+              <w:t>ASC-06, ASC-26</w:t>
+            </w:r>
+          </w:p>
+        </w:tc>
+      </w:tr>
+      <w:tr>
+        <w:tc>
+          <w:tcPr>
+            <w:tcW w:type="dxa" w:w="2154"/>
+            <w:shd w:val="clear" w:color="auto" w:fill="DCE6F0"/>
+          </w:tcPr>
+          <w:p>
+            <w:r/>
+            <w:r>
+              <w:rPr>
+                <w:b/>
+                <w:sz w:val="18"/>
+              </w:rPr>
+              <w:t>Estado</w:t>
+            </w:r>
+          </w:p>
+        </w:tc>
+        <w:tc>
+          <w:tcPr>
+            <w:tcW w:type="dxa" w:w="7483"/>
+          </w:tcPr>
+          <w:p>
+            <w:r/>
+            <w:r>
+              <w:rPr>
+                <w:sz w:val="18"/>
+              </w:rPr>
+              <w:t>Corregido en código – aplicar en AWS</w:t>
+            </w:r>
+          </w:p>
+        </w:tc>
+      </w:tr>
+    </w:tbl>
+    <w:p/>
+    <w:p>
+      <w:pPr>
+        <w:spacing w:after="40"/>
+      </w:pPr>
+      <w:r>
+        <w:rPr>
+          <w:b/>
+          <w:color w:val="B02418"/>
+        </w:rPr>
+        <w:t>Evidencia (versión original — vulnerable)</w:t>
+      </w:r>
+    </w:p>
+    <w:tbl>
+      <w:tblPr>
+        <w:tblW w:type="auto" w:w="0"/>
+        <w:jc w:val="center"/>
+        <w:tblLook w:firstColumn="1" w:firstRow="1" w:lastColumn="0" w:lastRow="0" w:noHBand="0" w:noVBand="1" w:val="04A0"/>
+      </w:tblPr>
+      <w:tblGrid>
+        <w:gridCol w:w="9972"/>
+      </w:tblGrid>
+      <w:tr>
+        <w:tc>
+          <w:tcPr>
+            <w:tcW w:type="dxa" w:w="9972"/>
+            <w:shd w:val="clear" w:color="auto" w:fill="FBEAEA"/>
+          </w:tcPr>
+          <w:p>
+            <w:r>
+              <w:rPr>
+                <w:rFonts w:ascii="Consolas" w:hAnsi="Consolas" w:eastAsia="Consolas"/>
+                <w:sz w:val="16"/>
+              </w:rPr>
+              <w:t>Server: Apache/2.4.58 (Ubuntu)</w:t>
+              <w:br/>
+            </w:r>
+            <w:r>
+              <w:rPr>
+                <w:rFonts w:ascii="Consolas" w:hAnsi="Consolas" w:eastAsia="Consolas"/>
+                <w:sz w:val="16"/>
+              </w:rPr>
+              <w:t>Forbidden ... Apache/2.4.58 (Ubuntu) Server at 174-129-56-84.sslip.io Port 443</w:t>
+            </w:r>
+          </w:p>
+        </w:tc>
+      </w:tr>
+    </w:tbl>
+    <w:p/>
+    <w:p>
+      <w:pPr>
+        <w:spacing w:after="40"/>
+      </w:pPr>
+      <w:r>
+        <w:rPr>
+          <w:b/>
+          <w:color w:val="1F3A5F"/>
+        </w:rPr>
+        <w:t>Corrección</w:t>
+      </w:r>
+    </w:p>
+    <w:p>
+      <w:r>
+        <w:t xml:space="preserve">Commit Git: </w:t>
+      </w:r>
+      <w:hyperlink r:id="rId39">
+        <w:r>
+          <w:rPr>
+            <w:color w:val="0563C1"/>
+            <w:u w:val="single"/>
+          </w:rPr>
+          <w:t>baf7250</w:t>
+        </w:r>
+      </w:hyperlink>
+      <w:r>
+        <w:t xml:space="preserve">   (rama mejoras)</w:t>
+      </w:r>
+    </w:p>
+    <w:p>
+      <w:pPr>
+        <w:spacing w:after="40"/>
+      </w:pPr>
+      <w:r>
+        <w:rPr>
+          <w:b/>
+          <w:color w:val="B02418"/>
+        </w:rPr>
+        <w:t>Código original</w:t>
+      </w:r>
+    </w:p>
+    <w:tbl>
+      <w:tblPr>
+        <w:tblW w:type="auto" w:w="0"/>
+        <w:jc w:val="center"/>
+        <w:tblLook w:firstColumn="1" w:firstRow="1" w:lastColumn="0" w:lastRow="0" w:noHBand="0" w:noVBand="1" w:val="04A0"/>
+      </w:tblPr>
+      <w:tblGrid>
+        <w:gridCol w:w="9972"/>
+      </w:tblGrid>
+      <w:tr>
+        <w:tc>
+          <w:tcPr>
+            <w:tcW w:type="dxa" w:w="9972"/>
+            <w:shd w:val="clear" w:color="auto" w:fill="FBEAEA"/>
+          </w:tcPr>
+          <w:p>
+            <w:r>
+              <w:rPr>
+                <w:rFonts w:ascii="Consolas" w:hAnsi="Consolas" w:eastAsia="Consolas"/>
+                <w:sz w:val="16"/>
+              </w:rPr>
+              <w:t>cat &gt; /etc/apache2/conf-available/pnk-hardening.conf &lt;&lt;'CONF'</w:t>
+              <w:br/>
+            </w:r>
+            <w:r>
+              <w:rPr>
+                <w:rFonts w:ascii="Consolas" w:hAnsi="Consolas" w:eastAsia="Consolas"/>
+                <w:sz w:val="16"/>
+              </w:rPr>
+              <w:t>ServerTokens Prod</w:t>
+              <w:br/>
+            </w:r>
+            <w:r>
+              <w:rPr>
+                <w:rFonts w:ascii="Consolas" w:hAnsi="Consolas" w:eastAsia="Consolas"/>
+                <w:sz w:val="16"/>
+              </w:rPr>
+              <w:t>ServerSignature Off</w:t>
+              <w:br/>
+            </w:r>
+            <w:r>
+              <w:rPr>
+                <w:rFonts w:ascii="Consolas" w:hAnsi="Consolas" w:eastAsia="Consolas"/>
+                <w:sz w:val="16"/>
+              </w:rPr>
+              <w:t>CONF</w:t>
+              <w:br/>
+            </w:r>
+            <w:r>
+              <w:rPr>
+                <w:rFonts w:ascii="Consolas" w:hAnsi="Consolas" w:eastAsia="Consolas"/>
+                <w:sz w:val="16"/>
+              </w:rPr>
+              <w:t>a2enconf pnk-hardening      # se carga ANTES que security.conf (ServerTokens OS)</w:t>
+            </w:r>
+          </w:p>
+        </w:tc>
+      </w:tr>
+    </w:tbl>
+    <w:p/>
+    <w:p>
+      <w:pPr>
+        <w:spacing w:after="40"/>
+      </w:pPr>
+      <w:r>
+        <w:rPr>
+          <w:b/>
+          <w:color w:val="1E6B34"/>
+        </w:rPr>
+        <w:t>Código nuevo</w:t>
+      </w:r>
+    </w:p>
+    <w:tbl>
+      <w:tblPr>
+        <w:tblW w:type="auto" w:w="0"/>
+        <w:jc w:val="center"/>
+        <w:tblLook w:firstColumn="1" w:firstRow="1" w:lastColumn="0" w:lastRow="0" w:noHBand="0" w:noVBand="1" w:val="04A0"/>
+      </w:tblPr>
+      <w:tblGrid>
+        <w:gridCol w:w="9972"/>
+      </w:tblGrid>
+      <w:tr>
+        <w:tc>
+          <w:tcPr>
+            <w:tcW w:type="dxa" w:w="9972"/>
+            <w:shd w:val="clear" w:color="auto" w:fill="EAF6EC"/>
+          </w:tcPr>
+          <w:p>
+            <w:r>
+              <w:rPr>
+                <w:rFonts w:ascii="Consolas" w:hAnsi="Consolas" w:eastAsia="Consolas"/>
+                <w:sz w:val="16"/>
+              </w:rPr>
+              <w:t># "zz-" para cargarse DESPUÉS de security.conf de Ubuntu</w:t>
+              <w:br/>
+            </w:r>
+            <w:r>
+              <w:rPr>
+                <w:rFonts w:ascii="Consolas" w:hAnsi="Consolas" w:eastAsia="Consolas"/>
+                <w:sz w:val="16"/>
+              </w:rPr>
+              <w:t>cat &gt; /etc/apache2/conf-available/zz-pnk-hardening.conf &lt;&lt;'CONF'</w:t>
+              <w:br/>
+            </w:r>
+            <w:r>
+              <w:rPr>
+                <w:rFonts w:ascii="Consolas" w:hAnsi="Consolas" w:eastAsia="Consolas"/>
+                <w:sz w:val="16"/>
+              </w:rPr>
+              <w:t>ServerTokens Prod</w:t>
+              <w:br/>
+            </w:r>
+            <w:r>
+              <w:rPr>
+                <w:rFonts w:ascii="Consolas" w:hAnsi="Consolas" w:eastAsia="Consolas"/>
+                <w:sz w:val="16"/>
+              </w:rPr>
+              <w:t>ServerSignature Off</w:t>
+              <w:br/>
+            </w:r>
+            <w:r>
+              <w:rPr>
+                <w:rFonts w:ascii="Consolas" w:hAnsi="Consolas" w:eastAsia="Consolas"/>
+                <w:sz w:val="16"/>
+              </w:rPr>
+              <w:t>CONF</w:t>
+              <w:br/>
+            </w:r>
+            <w:r>
+              <w:rPr>
+                <w:rFonts w:ascii="Consolas" w:hAnsi="Consolas" w:eastAsia="Consolas"/>
+                <w:sz w:val="16"/>
+              </w:rPr>
+              <w:t>sed -i 's/^ServerTokens .*/ServerTokens Prod/; s/^ServerSignature .*/ServerSignature Off/' \</w:t>
+              <w:br/>
+            </w:r>
+            <w:r>
+              <w:rPr>
+                <w:rFonts w:ascii="Consolas" w:hAnsi="Consolas" w:eastAsia="Consolas"/>
+                <w:sz w:val="16"/>
+              </w:rPr>
+              <w:t xml:space="preserve">    /etc/apache2/conf-available/security.conf</w:t>
+              <w:br/>
+            </w:r>
+            <w:r>
+              <w:rPr>
+                <w:rFonts w:ascii="Consolas" w:hAnsi="Consolas" w:eastAsia="Consolas"/>
+                <w:sz w:val="16"/>
+              </w:rPr>
+              <w:t>a2enconf zz-pnk-hardening</w:t>
+              <w:br/>
+            </w:r>
+            <w:r>
+              <w:rPr>
+                <w:rFonts w:ascii="Consolas" w:hAnsi="Consolas" w:eastAsia="Consolas"/>
+                <w:sz w:val="16"/>
+              </w:rPr>
+              <w:t># test_seguridad.py: falla si la cabecera Server contiene un número de versión</w:t>
+            </w:r>
+          </w:p>
+        </w:tc>
+      </w:tr>
+    </w:tbl>
+    <w:p/>
+    <w:p>
+      <w:pPr>
+        <w:spacing w:after="40"/>
+      </w:pPr>
+      <w:r>
+        <w:rPr>
+          <w:b/>
+          <w:color w:val="1E6B34"/>
+        </w:rPr>
+        <w:t>Evidencia sin vulnerabilidad (versión corregida)</w:t>
+      </w:r>
+    </w:p>
+    <w:tbl>
+      <w:tblPr>
+        <w:tblW w:type="auto" w:w="0"/>
+        <w:jc w:val="center"/>
+        <w:tblLook w:firstColumn="1" w:firstRow="1" w:lastColumn="0" w:lastRow="0" w:noHBand="0" w:noVBand="1" w:val="04A0"/>
+      </w:tblPr>
+      <w:tblGrid>
+        <w:gridCol w:w="9972"/>
+      </w:tblGrid>
+      <w:tr>
+        <w:tc>
+          <w:tcPr>
+            <w:tcW w:type="dxa" w:w="9972"/>
+            <w:shd w:val="clear" w:color="auto" w:fill="EAF6EC"/>
+          </w:tcPr>
+          <w:p>
+            <w:r>
+              <w:rPr>
+                <w:rFonts w:ascii="Consolas" w:hAnsi="Consolas" w:eastAsia="Consolas"/>
+                <w:sz w:val="16"/>
+              </w:rPr>
+              <w:t>Con el nuevo user-data.sh: Server: Apache (sin versión) y páginas de error sin firma. Se verifica con la prueba 'VUL-22/29 Cabeceras' en el próximo despliegue.</w:t>
+            </w:r>
+          </w:p>
+        </w:tc>
+      </w:tr>
+    </w:tbl>
+    <w:p>
+      <w:pPr>
         <w:pStyle w:val="Heading1"/>
         <w:pageBreakBefore/>
       </w:pPr>
@@ -24564,7 +28248,7 @@
                 <w:rFonts w:ascii="Consolas" w:hAnsi="Consolas" w:eastAsia="Consolas"/>
                 <w:sz w:val="16"/>
               </w:rPr>
-              <w:t xml:space="preserve">    --vulnerable http://174.129.56.84:8080 \</w:t>
+              <w:t xml:space="preserve">    --vulnerable http://52.2.60.65:8080 \</w:t>
               <w:br/>
             </w:r>
             <w:r>
@@ -26434,7 +30118,7 @@
               <w:rPr>
                 <w:sz w:val="17"/>
               </w:rPr>
-              <w:t>APROBADO</w:t>
+              <w:t>APROBADO (VUL-035 se aplica en AWS con el próximo despliegue)</w:t>
             </w:r>
           </w:p>
         </w:tc>
@@ -26464,7 +30148,7 @@
               <w:rPr>
                 <w:sz w:val="17"/>
               </w:rPr>
-              <w:t>0 de 34 (críticos 0 · altos 0 · medios 0 · bajos 0)</w:t>
+              <w:t>0 de 35 en el código (críticos 0 · altos 0 · medios 0 · bajos 0)</w:t>
             </w:r>
           </w:p>
         </w:tc>

</xml_diff>

<commit_message>
test(evidencia): VUL-035 aplicado en AWS, 35 de 35 verificadas
- Instancia 174.129.56.84: Server: Apache (sin versión), páginas de error
  sin firma; test_seguridad.py 9/9 PASA.
- Instancia temporal 52.2.60.65 (versión original para capturas) detenida.
- Informe: Security Gate APROBADO, 0 hallazgos abiertos.

Co-Authored-By: Claude Opus 5.5 <noreply@anthropic.com>
</commit_message>
<xml_diff>
--- a/docs/informe_vulnerabilidades.docx
+++ b/docs/informe_vulnerabilidades.docx
@@ -313,7 +313,7 @@
               <w:rPr>
                 <w:sz w:val="17"/>
               </w:rPr>
-              <w:t>35 (9 Críticos · 5 Altos · 1 Media-Alta · 9 Medios · 11 Bajos) — todos corregidos</w:t>
+              <w:t>35 (9 Críticos · 5 Altos · 1 Media-Alta · 9 Medios · 11 Bajos) — todos corregidos y verificados</w:t>
             </w:r>
           </w:p>
         </w:tc>
@@ -3828,7 +3828,7 @@
               <w:rPr>
                 <w:sz w:val="17"/>
               </w:rPr>
-              <w:t>Corregido en código – aplicar en AWS</w:t>
+              <w:t>Corregido – verificado en AWS (18/10/2026)</w:t>
             </w:r>
           </w:p>
         </w:tc>
@@ -27898,7 +27898,7 @@
               <w:rPr>
                 <w:sz w:val="18"/>
               </w:rPr>
-              <w:t>Corregido en código – aplicar en AWS</w:t>
+              <w:t>Corregido – verificado en AWS (18/10/2026)</w:t>
             </w:r>
           </w:p>
         </w:tc>
@@ -28191,7 +28191,31 @@
                 <w:rFonts w:ascii="Consolas" w:hAnsi="Consolas" w:eastAsia="Consolas"/>
                 <w:sz w:val="16"/>
               </w:rPr>
-              <w:t>Con el nuevo user-data.sh: Server: Apache (sin versión) y páginas de error sin firma. Se verifica con la prueba 'VUL-22/29 Cabeceras' en el próximo despliegue.</w:t>
+              <w:t>Aplicado en la instancia (18/10/2026):</w:t>
+              <w:br/>
+            </w:r>
+            <w:r>
+              <w:rPr>
+                <w:rFonts w:ascii="Consolas" w:hAnsi="Consolas" w:eastAsia="Consolas"/>
+                <w:sz w:val="16"/>
+              </w:rPr>
+              <w:t xml:space="preserve">  Server: Apache</w:t>
+              <w:br/>
+            </w:r>
+            <w:r>
+              <w:rPr>
+                <w:rFonts w:ascii="Consolas" w:hAnsi="Consolas" w:eastAsia="Consolas"/>
+                <w:sz w:val="16"/>
+              </w:rPr>
+              <w:t xml:space="preserve">  /setup/setup.php -&gt; &lt;h1&gt;Forbidden&lt;/h1&gt; (sin firma de versión)</w:t>
+              <w:br/>
+            </w:r>
+            <w:r>
+              <w:rPr>
+                <w:rFonts w:ascii="Consolas" w:hAnsi="Consolas" w:eastAsia="Consolas"/>
+                <w:sz w:val="16"/>
+              </w:rPr>
+              <w:t xml:space="preserve">  [PASA] VUL-22/29 Cabeceras -&gt; todas presentes   ·   RESULTADO: 9 de 9 pruebas en PASA</w:t>
             </w:r>
           </w:p>
         </w:tc>
@@ -30118,7 +30142,7 @@
               <w:rPr>
                 <w:sz w:val="17"/>
               </w:rPr>
-              <w:t>APROBADO (VUL-035 se aplica en AWS con el próximo despliegue)</w:t>
+              <w:t>APROBADO</w:t>
             </w:r>
           </w:p>
         </w:tc>
@@ -30148,7 +30172,7 @@
               <w:rPr>
                 <w:sz w:val="17"/>
               </w:rPr>
-              <w:t>0 de 35 en el código (críticos 0 · altos 0 · medios 0 · bajos 0)</w:t>
+              <w:t>0 de 35 (críticos 0 · altos 0 · medios 0 · bajos 0) — 9 de 9 pruebas en PASA en AWS (18/10/2026)</w:t>
             </w:r>
           </w:p>
         </w:tc>

</xml_diff>